<commit_message>
fix(export): fix landlordNameText is not defined error on Infrastructure page
</commit_message>
<xml_diff>
--- a/tvt3_v2/public/templates/HOP_DONG_MOI_MAT_BANG.docx
+++ b/tvt3_v2/public/templates/HOP_DONG_MOI_MAT_BANG.docx
@@ -179,7 +179,7 @@
                     </wp:anchor>
                   </w:drawing>
                 </mc:Choice>
-                <mc:Fallback xmlns:oel="http://schemas.microsoft.com/office/2019/extlst" xmlns:w16cex="http://schemas.microsoft.com/office/word/2018/wordml/cex" xmlns:w16="http://schemas.microsoft.com/office/word/2018/wordml" xmlns:w16du="http://schemas.microsoft.com/office/word/2023/wordml/word16du" xmlns:w16sdtdh="http://schemas.microsoft.com/office/word/2020/wordml/sdtdatahash" xmlns:w16sdtfl="http://schemas.microsoft.com/office/word/2024/wordml/sdtformatlock">
+                <mc:Fallback xmlns:w16sdtfl="http://schemas.microsoft.com/office/word/2024/wordml/sdtformatlock" xmlns:w16sdtdh="http://schemas.microsoft.com/office/word/2020/wordml/sdtdatahash" xmlns:w16du="http://schemas.microsoft.com/office/word/2023/wordml/word16du" xmlns:w16="http://schemas.microsoft.com/office/word/2018/wordml" xmlns:w16cex="http://schemas.microsoft.com/office/word/2018/wordml/cex" xmlns:oel="http://schemas.microsoft.com/office/2019/extlst">
                   <w:pict>
                     <v:line w14:anchorId="3A8FE28D" id="Straight Connector 2000649774" o:spid="_x0000_s1026" style="position:absolute;flip:x;z-index:251661312;visibility:visible;mso-wrap-style:square;mso-wrap-distance-left:9pt;mso-wrap-distance-top:0;mso-wrap-distance-right:9pt;mso-wrap-distance-bottom:0;mso-position-horizontal:absolute;mso-position-horizontal-relative:text;mso-position-vertical:absolute;mso-position-vertical-relative:text" from="51.4pt,3.8pt" to="174.3pt,3.8pt" o:gfxdata="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" strokecolor="black [3213]" strokeweight=".5pt">
                       <v:stroke joinstyle="miter"/>
@@ -271,7 +271,7 @@
                     </wp:anchor>
                   </w:drawing>
                 </mc:Choice>
-                <mc:Fallback xmlns:oel="http://schemas.microsoft.com/office/2019/extlst" xmlns:w16cex="http://schemas.microsoft.com/office/word/2018/wordml/cex" xmlns:w16="http://schemas.microsoft.com/office/word/2018/wordml" xmlns:w16du="http://schemas.microsoft.com/office/word/2023/wordml/word16du" xmlns:w16sdtdh="http://schemas.microsoft.com/office/word/2020/wordml/sdtdatahash" xmlns:w16sdtfl="http://schemas.microsoft.com/office/word/2024/wordml/sdtformatlock">
+                <mc:Fallback xmlns:w16sdtfl="http://schemas.microsoft.com/office/word/2024/wordml/sdtformatlock" xmlns:w16sdtdh="http://schemas.microsoft.com/office/word/2020/wordml/sdtdatahash" xmlns:w16du="http://schemas.microsoft.com/office/word/2023/wordml/word16du" xmlns:w16="http://schemas.microsoft.com/office/word/2018/wordml" xmlns:w16cex="http://schemas.microsoft.com/office/word/2018/wordml/cex" xmlns:oel="http://schemas.microsoft.com/office/2019/extlst">
                   <w:pict>
                     <v:line w14:anchorId="7B0B0E0A" id="Straight Connector 1463436238" o:spid="_x0000_s1026" style="position:absolute;flip:y;z-index:251660288;visibility:visible;mso-wrap-style:square;mso-width-percent:0;mso-height-percent:0;mso-wrap-distance-left:9pt;mso-wrap-distance-top:0;mso-wrap-distance-right:9pt;mso-wrap-distance-bottom:0;mso-position-horizontal:absolute;mso-position-horizontal-relative:text;mso-position-vertical:absolute;mso-position-vertical-relative:text;mso-width-percent:0;mso-height-percent:0;mso-width-relative:margin;mso-height-relative:margin" from="66.8pt,5.25pt" to="223.7pt,5.25pt" o:gfxdata="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" strokecolor="black [3213]" strokeweight=".5pt">
                       <v:stroke joinstyle="miter"/>
@@ -740,24 +740,18 @@
         <w:ind w:firstLine="720"/>
         <w:jc w:val="both"/>
         <w:rPr>
-          <w:rStyle w:val="Emphasis"/>
-          <w:rFonts w:ascii="Times New Roman" w:hAnsi="Times New Roman"/>
-          <w:i w:val="0"/>
-          <w:sz w:val="28"/>
-          <w:szCs w:val="28"/>
-          <w:lang w:val="vi-VN"/>
-        </w:rPr>
-      </w:pPr>
-      <w:r>
-        <w:rPr>
-          <w:rStyle w:val="Emphasis"/>
-          <w:rFonts w:ascii="Times New Roman" w:hAnsi="Times New Roman"/>
-          <w:i w:val="0"/>
-          <w:sz w:val="28"/>
-          <w:szCs w:val="28"/>
-          <w:lang w:val="vi-VN"/>
-        </w:rPr>
-        <w:t>Căn cứ các điểm PTM 2026 đã được phê duyệt…</w:t>
+          <w:rFonts w:ascii="Times New Roman" w:hAnsi="Times New Roman"/>
+          <w:color w:val="000000"/>
+          <w:szCs w:val="26"/>
+        </w:rPr>
+      </w:pPr>
+      <w:r>
+        <w:rPr>
+          <w:rFonts w:ascii="Times New Roman" w:hAnsi="Times New Roman"/>
+          <w:color w:val="000000"/>
+          <w:szCs w:val="26"/>
+        </w:rPr>
+        <w:t>Căn cứ văn bản số: 89/D01-B4-B5 ngày 08/01/2026 của Tổng công ty Viễn thông MobiFone về việc phê duyệt vị trí triển khai phát triển CSHT mới năm 2026;</w:t>
       </w:r>
     </w:p>
     <w:p>
@@ -999,34 +993,27 @@
         </w:rPr>
         <w:t>{{ADDRESS_OLD}}</w:t>
       </w:r>
-    </w:p>
-    <w:p>
-      <w:pPr>
-        <w:pStyle w:val="ListParagraph"/>
-        <w:widowControl w:val="0"/>
-        <w:numPr>
-          <w:ilvl w:val="1"/>
-          <w:numId w:val="15"/>
-        </w:numPr>
-        <w:autoSpaceDE w:val="0"/>
-        <w:autoSpaceDN w:val="0"/>
-        <w:spacing w:before="120"/>
-        <w:jc w:val="both"/>
-        <w:rPr>
-          <w:rFonts w:ascii="Times New Roman" w:hAnsi="Times New Roman"/>
-          <w:sz w:val="28"/>
+      <w:proofErr w:type="gramStart"/>
+      <w:r>
+        <w:rPr>
+          <w:rFonts w:ascii="Times New Roman" w:hAnsi="Times New Roman"/>
           <w:szCs w:val="28"/>
           <w:lang w:val="da-DK"/>
         </w:rPr>
-      </w:pPr>
-      <w:r>
-        <w:rPr>
-          <w:rFonts w:ascii="Times New Roman" w:hAnsi="Times New Roman"/>
+        <w:t/>
+      </w:r>
+      <w:r>
+        <w:rPr>
+          <w:rStyle w:val="Emphasis"/>
+          <w:rFonts w:ascii="Times New Roman" w:hAnsi="Times New Roman"/>
+          <w:i w:val="0"/>
+          <w:iCs w:val="0"/>
           <w:szCs w:val="28"/>
           <w:lang w:val="da-DK"/>
         </w:rPr>
-        <w:t xml:space="preserve">Địa chỉ thửa đất: </w:t>
-      </w:r>
+        <w:t/>
+      </w:r>
+      <w:proofErr w:type="gramEnd"/>
       <w:r>
         <w:rPr>
           <w:rStyle w:val="Emphasis"/>
@@ -1061,16 +1048,485 @@
         <w:t>Dịch vụ hỗ trợ bảo vệ, VHKT</w:t>
       </w:r>
     </w:p>
-    <w:p>
-      <w:pPr>
-        <w:spacing w:before="120" w:after="120" w:line="276" w:lineRule="auto"/>
-        <w:jc w:val="both"/>
-        <w:rPr>
-          <w:rFonts w:ascii="Times New Roman" w:hAnsi="Times New Roman"/>
-          <w:szCs w:val="26"/>
-        </w:rPr>
-      </w:pPr>
-    </w:p>
+    <w:tbl>
+      <w:tblPr>
+        <w:tblW w:w="5219" w:type="pct"/>
+        <w:jc w:val="center"/>
+        <w:tblBorders>
+          <w:top w:val="single" w:sz="4" w:space="0" w:color="auto"/>
+          <w:left w:val="single" w:sz="4" w:space="0" w:color="auto"/>
+          <w:bottom w:val="single" w:sz="4" w:space="0" w:color="auto"/>
+          <w:right w:val="single" w:sz="4" w:space="0" w:color="auto"/>
+          <w:insideH w:val="single" w:sz="4" w:space="0" w:color="auto"/>
+          <w:insideV w:val="single" w:sz="4" w:space="0" w:color="auto"/>
+        </w:tblBorders>
+        <w:tblLayout w:type="fixed"/>
+        <w:tblLook w:val="01E0" w:firstRow="1" w:lastRow="1" w:firstColumn="1" w:lastColumn="1" w:noHBand="0" w:noVBand="0"/>
+      </w:tblPr>
+      <w:tblGrid>
+        <w:gridCol w:w="2285"/>
+        <w:gridCol w:w="2624"/>
+        <w:gridCol w:w="2251"/>
+        <w:gridCol w:w="2251"/>
+      </w:tblGrid>
+      <w:tr>
+        <w:trPr>
+          <w:trHeight w:val="976"/>
+          <w:jc w:val="center"/>
+        </w:trPr>
+        <w:tc>
+          <w:tcPr>
+            <w:tcW w:w="1214" w:type="pct"/>
+            <w:vAlign w:val="center"/>
+          </w:tcPr>
+          <w:p>
+            <w:pPr>
+              <w:spacing w:before="60" w:after="60"/>
+              <w:jc w:val="center"/>
+              <w:rPr>
+                <w:rFonts w:ascii="Times New Roman" w:hAnsi="Times New Roman"/>
+                <w:szCs w:val="26"/>
+              </w:rPr>
+            </w:pPr>
+          </w:p>
+        </w:tc>
+        <w:tc>
+          <w:tcPr>
+            <w:tcW w:w="1394" w:type="pct"/>
+            <w:vAlign w:val="center"/>
+          </w:tcPr>
+          <w:p>
+            <w:pPr>
+              <w:spacing w:before="60" w:after="60"/>
+              <w:jc w:val="center"/>
+              <w:rPr>
+                <w:rFonts w:ascii="Times New Roman" w:hAnsi="Times New Roman"/>
+                <w:b/>
+                <w:bCs/>
+                <w:szCs w:val="26"/>
+              </w:rPr>
+            </w:pPr>
+            <w:r>
+              <w:rPr>
+                <w:rFonts w:ascii="Times New Roman" w:hAnsi="Times New Roman"/>
+                <w:b/>
+                <w:bCs/>
+                <w:szCs w:val="26"/>
+              </w:rPr>
+              <w:t>Tọa độ</w:t>
+            </w:r>
+          </w:p>
+          <w:p>
+            <w:pPr>
+              <w:spacing w:before="60" w:after="60"/>
+              <w:jc w:val="center"/>
+              <w:rPr>
+                <w:rFonts w:ascii="Times New Roman" w:hAnsi="Times New Roman"/>
+                <w:b/>
+                <w:bCs/>
+                <w:szCs w:val="26"/>
+              </w:rPr>
+            </w:pPr>
+            <w:r>
+              <w:rPr>
+                <w:rFonts w:ascii="Times New Roman" w:hAnsi="Times New Roman"/>
+                <w:b/>
+                <w:bCs/>
+                <w:szCs w:val="26"/>
+              </w:rPr>
+              <w:t>(Kinh độ - Vĩ độ)</w:t>
+            </w:r>
+          </w:p>
+        </w:tc>
+        <w:tc>
+          <w:tcPr>
+            <w:tcW w:w="1196" w:type="pct"/>
+            <w:vAlign w:val="center"/>
+          </w:tcPr>
+          <w:p>
+            <w:pPr>
+              <w:spacing w:before="60" w:after="60"/>
+              <w:jc w:val="center"/>
+              <w:rPr>
+                <w:rFonts w:ascii="Times New Roman" w:hAnsi="Times New Roman"/>
+                <w:b/>
+                <w:bCs/>
+                <w:szCs w:val="26"/>
+              </w:rPr>
+            </w:pPr>
+            <w:r>
+              <w:rPr>
+                <w:rFonts w:ascii="Times New Roman" w:hAnsi="Times New Roman"/>
+                <w:b/>
+                <w:bCs/>
+                <w:szCs w:val="26"/>
+              </w:rPr>
+              <w:t>Độ cao anten</w:t>
+            </w:r>
+          </w:p>
+          <w:p>
+            <w:pPr>
+              <w:spacing w:before="60" w:after="60"/>
+              <w:jc w:val="center"/>
+              <w:rPr>
+                <w:rFonts w:ascii="Times New Roman" w:hAnsi="Times New Roman"/>
+                <w:b/>
+                <w:bCs/>
+                <w:szCs w:val="26"/>
+              </w:rPr>
+            </w:pPr>
+            <w:r>
+              <w:rPr>
+                <w:rFonts w:ascii="Times New Roman" w:hAnsi="Times New Roman"/>
+                <w:b/>
+                <w:bCs/>
+                <w:szCs w:val="26"/>
+              </w:rPr>
+              <w:t>(m)</w:t>
+            </w:r>
+          </w:p>
+        </w:tc>
+        <w:tc>
+          <w:tcPr>
+            <w:tcW w:w="1196" w:type="pct"/>
+          </w:tcPr>
+          <w:p>
+            <w:pPr>
+              <w:spacing w:before="60" w:after="60"/>
+              <w:jc w:val="center"/>
+              <w:rPr>
+                <w:rFonts w:ascii="Times New Roman" w:hAnsi="Times New Roman"/>
+                <w:b/>
+                <w:bCs/>
+                <w:szCs w:val="26"/>
+              </w:rPr>
+            </w:pPr>
+            <w:r>
+              <w:rPr>
+                <w:rFonts w:ascii="Times New Roman" w:hAnsi="Times New Roman"/>
+                <w:b/>
+                <w:bCs/>
+                <w:szCs w:val="26"/>
+              </w:rPr>
+              <w:t>Sai số</w:t>
+            </w:r>
+          </w:p>
+          <w:p>
+            <w:pPr>
+              <w:spacing w:before="60" w:after="60"/>
+              <w:jc w:val="center"/>
+              <w:rPr>
+                <w:rFonts w:ascii="Times New Roman" w:hAnsi="Times New Roman"/>
+                <w:b/>
+                <w:bCs/>
+                <w:szCs w:val="26"/>
+              </w:rPr>
+            </w:pPr>
+            <w:r>
+              <w:rPr>
+                <w:rFonts w:ascii="Times New Roman" w:hAnsi="Times New Roman"/>
+                <w:b/>
+                <w:bCs/>
+                <w:szCs w:val="26"/>
+              </w:rPr>
+              <w:t>(m)</w:t>
+            </w:r>
+          </w:p>
+        </w:tc>
+      </w:tr>
+      <w:tr>
+        <w:trPr>
+          <w:trHeight w:val="1089"/>
+          <w:jc w:val="center"/>
+        </w:trPr>
+        <w:tc>
+          <w:tcPr>
+            <w:tcW w:w="1214" w:type="pct"/>
+            <w:vAlign w:val="center"/>
+          </w:tcPr>
+          <w:p>
+            <w:pPr>
+              <w:spacing w:before="60" w:after="60"/>
+              <w:jc w:val="center"/>
+              <w:rPr>
+                <w:rFonts w:ascii="Times New Roman" w:hAnsi="Times New Roman"/>
+                <w:szCs w:val="26"/>
+              </w:rPr>
+            </w:pPr>
+            <w:r>
+              <w:rPr>
+                <w:rFonts w:ascii="Times New Roman" w:hAnsi="Times New Roman"/>
+                <w:szCs w:val="26"/>
+              </w:rPr>
+              <w:t>Quy hoạch</w:t>
+            </w:r>
+          </w:p>
+        </w:tc>
+        <w:tc>
+          <w:tcPr>
+            <w:tcW w:w="1394" w:type="pct"/>
+            <w:vAlign w:val="center"/>
+          </w:tcPr>
+          <w:p>
+            <w:pPr>
+              <w:rPr>
+                <w:rFonts w:ascii="Times New Roman" w:hAnsi="Times New Roman"/>
+                <w:szCs w:val="26"/>
+              </w:rPr>
+            </w:pPr>
+            <w:r>
+              <w:rPr>
+                <w:rFonts w:ascii="Times New Roman" w:hAnsi="Times New Roman"/>
+                <w:szCs w:val="26"/>
+              </w:rPr>
+              <w:t>10</w:t>
+            </w:r>
+            <w:r>
+              <w:rPr>
+                <w:rFonts w:ascii="Times New Roman" w:hAnsi="Times New Roman"/>
+                <w:szCs w:val="26"/>
+              </w:rPr>
+              <w:t>7</w:t>
+            </w:r>
+            <w:r>
+              <w:rPr>
+                <w:rFonts w:ascii="Times New Roman" w:hAnsi="Times New Roman"/>
+                <w:szCs w:val="26"/>
+              </w:rPr>
+              <w:t>,</w:t>
+            </w:r>
+            <w:r>
+              <w:rPr>
+                <w:rFonts w:ascii="Times New Roman" w:hAnsi="Times New Roman"/>
+                <w:szCs w:val="26"/>
+              </w:rPr>
+              <w:t xml:space="preserve">24249 </w:t>
+            </w:r>
+            <w:r>
+              <w:rPr>
+                <w:rFonts w:ascii="Times New Roman" w:hAnsi="Times New Roman"/>
+                <w:szCs w:val="26"/>
+              </w:rPr>
+              <w:t>-</w:t>
+            </w:r>
+            <w:r>
+              <w:rPr>
+                <w:rFonts w:ascii="Times New Roman" w:hAnsi="Times New Roman"/>
+                <w:szCs w:val="26"/>
+              </w:rPr>
+              <w:t xml:space="preserve"> 11,80493</w:t>
+            </w:r>
+          </w:p>
+        </w:tc>
+        <w:tc>
+          <w:tcPr>
+            <w:tcW w:w="1196" w:type="pct"/>
+            <w:vAlign w:val="center"/>
+          </w:tcPr>
+          <w:p>
+            <w:pPr>
+              <w:spacing w:before="60" w:after="60"/>
+              <w:jc w:val="center"/>
+              <w:rPr>
+                <w:rFonts w:ascii="Times New Roman" w:hAnsi="Times New Roman"/>
+                <w:noProof/>
+                <w:szCs w:val="26"/>
+              </w:rPr>
+            </w:pPr>
+            <w:r>
+              <w:rPr>
+                <w:rFonts w:ascii="Times New Roman" w:hAnsi="Times New Roman"/>
+                <w:noProof/>
+                <w:szCs w:val="26"/>
+              </w:rPr>
+              <w:t>42</w:t>
+            </w:r>
+            <w:r>
+              <w:rPr>
+                <w:rFonts w:ascii="Times New Roman" w:hAnsi="Times New Roman"/>
+                <w:noProof/>
+                <w:szCs w:val="26"/>
+              </w:rPr>
+              <w:t>m</w:t>
+            </w:r>
+          </w:p>
+        </w:tc>
+        <w:tc>
+          <w:tcPr>
+            <w:tcW w:w="1196" w:type="pct"/>
+            <w:vMerge w:val="restart"/>
+            <w:vAlign w:val="center"/>
+          </w:tcPr>
+          <w:p>
+            <w:pPr>
+              <w:spacing w:before="60" w:after="60"/>
+              <w:jc w:val="center"/>
+              <w:rPr>
+                <w:rFonts w:ascii="Times New Roman" w:hAnsi="Times New Roman"/>
+                <w:noProof/>
+                <w:szCs w:val="26"/>
+              </w:rPr>
+            </w:pPr>
+            <w:r>
+              <w:rPr>
+                <w:rFonts w:ascii="Times New Roman" w:hAnsi="Times New Roman"/>
+                <w:noProof/>
+                <w:szCs w:val="26"/>
+              </w:rPr>
+              <w:t>268</w:t>
+            </w:r>
+            <w:r>
+              <w:rPr>
+                <w:rFonts w:ascii="Times New Roman" w:hAnsi="Times New Roman"/>
+                <w:noProof/>
+                <w:szCs w:val="26"/>
+              </w:rPr>
+              <w:t>m</w:t>
+            </w:r>
+          </w:p>
+        </w:tc>
+      </w:tr>
+      <w:tr>
+        <w:trPr>
+          <w:trHeight w:val="800"/>
+          <w:jc w:val="center"/>
+        </w:trPr>
+        <w:tc>
+          <w:tcPr>
+            <w:tcW w:w="1214" w:type="pct"/>
+            <w:vAlign w:val="center"/>
+          </w:tcPr>
+          <w:p>
+            <w:pPr>
+              <w:spacing w:before="60" w:after="60"/>
+              <w:jc w:val="center"/>
+              <w:rPr>
+                <w:rFonts w:ascii="Times New Roman" w:hAnsi="Times New Roman"/>
+                <w:szCs w:val="26"/>
+              </w:rPr>
+            </w:pPr>
+            <w:r>
+              <w:rPr>
+                <w:rFonts w:ascii="Times New Roman" w:hAnsi="Times New Roman"/>
+                <w:szCs w:val="26"/>
+              </w:rPr>
+              <w:t>Thực tế khảo sát</w:t>
+            </w:r>
+          </w:p>
+        </w:tc>
+        <w:tc>
+          <w:tcPr>
+            <w:tcW w:w="1394" w:type="pct"/>
+            <w:vAlign w:val="center"/>
+          </w:tcPr>
+          <w:p>
+            <w:pPr>
+              <w:spacing w:before="60" w:after="60"/>
+              <w:rPr>
+                <w:rFonts w:ascii="Times New Roman" w:hAnsi="Times New Roman"/>
+                <w:noProof/>
+                <w:szCs w:val="26"/>
+              </w:rPr>
+            </w:pPr>
+            <w:r>
+              <w:rPr>
+                <w:rFonts w:ascii="Times New Roman" w:hAnsi="Times New Roman"/>
+                <w:color w:val="000000" w:themeColor="text1"/>
+              </w:rPr>
+              <w:t>10</w:t>
+            </w:r>
+            <w:r>
+              <w:rPr>
+                <w:rFonts w:ascii="Times New Roman" w:hAnsi="Times New Roman"/>
+                <w:color w:val="000000" w:themeColor="text1"/>
+              </w:rPr>
+              <w:t xml:space="preserve">7,2446 </w:t>
+            </w:r>
+            <w:r>
+              <w:rPr>
+                <w:rFonts w:ascii="Times New Roman" w:hAnsi="Times New Roman"/>
+                <w:noProof/>
+                <w:szCs w:val="26"/>
+              </w:rPr>
+              <w:t>-</w:t>
+            </w:r>
+            <w:r>
+              <w:rPr>
+                <w:rFonts w:ascii="Times New Roman" w:hAnsi="Times New Roman"/>
+                <w:noProof/>
+                <w:szCs w:val="26"/>
+              </w:rPr>
+              <w:t xml:space="preserve"> </w:t>
+            </w:r>
+            <w:r>
+              <w:rPr>
+                <w:rFonts w:ascii="Times New Roman" w:hAnsi="Times New Roman"/>
+                <w:color w:val="000000" w:themeColor="text1"/>
+              </w:rPr>
+              <w:t>11,</w:t>
+            </w:r>
+            <w:r>
+              <w:rPr>
+                <w:rFonts w:ascii="Times New Roman" w:hAnsi="Times New Roman"/>
+                <w:color w:val="000000" w:themeColor="text1"/>
+              </w:rPr>
+              <w:t>8061</w:t>
+            </w:r>
+          </w:p>
+        </w:tc>
+        <w:tc>
+          <w:tcPr>
+            <w:tcW w:w="1196" w:type="pct"/>
+            <w:vAlign w:val="center"/>
+          </w:tcPr>
+          <w:p>
+            <w:pPr>
+              <w:spacing w:before="60" w:after="60"/>
+              <w:jc w:val="center"/>
+              <w:rPr>
+                <w:rFonts w:ascii="Times New Roman" w:hAnsi="Times New Roman"/>
+                <w:noProof/>
+                <w:szCs w:val="26"/>
+              </w:rPr>
+            </w:pPr>
+            <w:r>
+              <w:rPr>
+                <w:rFonts w:ascii="Times New Roman" w:hAnsi="Times New Roman"/>
+                <w:noProof/>
+                <w:szCs w:val="26"/>
+              </w:rPr>
+              <w:t>36</w:t>
+            </w:r>
+            <w:r>
+              <w:rPr>
+                <w:rFonts w:ascii="Times New Roman" w:hAnsi="Times New Roman"/>
+                <w:noProof/>
+                <w:szCs w:val="26"/>
+              </w:rPr>
+              <w:t>m</w:t>
+            </w:r>
+          </w:p>
+        </w:tc>
+        <w:tc>
+          <w:tcPr>
+            <w:tcW w:w="1196" w:type="pct"/>
+            <w:vMerge/>
+            <w:vAlign w:val="center"/>
+          </w:tcPr>
+          <w:p>
+            <w:pPr>
+              <w:spacing w:before="60" w:after="60"/>
+              <w:jc w:val="center"/>
+              <w:rPr>
+                <w:rFonts w:ascii="Times New Roman" w:hAnsi="Times New Roman"/>
+                <w:noProof/>
+                <w:szCs w:val="26"/>
+              </w:rPr>
+            </w:pPr>
+          </w:p>
+        </w:tc>
+      </w:tr>
+    </w:tbl>
     <w:p>
       <w:pPr>
         <w:pStyle w:val="ListParagraph"/>
@@ -1094,6 +1550,7 @@
           <w:szCs w:val="26"/>
           <w:lang w:val="vi-VN"/>
         </w:rPr>
+        <w:lastRenderedPageBreak/>
         <w:t xml:space="preserve">     </w:t>
       </w:r>
       <w:r>
@@ -1165,7 +1622,7 @@
           <w:szCs w:val="26"/>
           <w:lang w:val="vi-VN"/>
         </w:rPr>
-        <w:t xml:space="preserve"> {{NEW_PRICE}} đồng/tháng (bằng chữ: {{NEW_PRICE_TEXT}</w:t>
+        <w:t xml:space="preserve"> {{NEW_PRICE}} đồng/tháng (bằng chữ: {{NEW_PRICE_TEXT}}</w:t>
       </w:r>
       <w:proofErr w:type="gramStart"/>
       <w:r>
@@ -1174,7 +1631,7 @@
           <w:szCs w:val="26"/>
           <w:lang w:val="vi-VN"/>
         </w:rPr>
-        <w:t>})</w:t>
+        <w:t>)</w:t>
       </w:r>
       <w:r>
         <w:rPr>
@@ -1194,16 +1651,16 @@
     </w:p>
     <w:tbl>
       <w:tblPr>
-        <w:tblW w:w="8005" w:type="dxa"/>
+        <w:tblW w:w="8275" w:type="dxa"/>
         <w:jc w:val="center"/>
         <w:tblLayout w:type="fixed"/>
         <w:tblLook w:val="04A0" w:firstRow="1" w:lastRow="0" w:firstColumn="1" w:lastColumn="0" w:noHBand="0" w:noVBand="1"/>
       </w:tblPr>
       <w:tblGrid>
-        <w:gridCol w:w="1160"/>
-        <w:gridCol w:w="2435"/>
-        <w:gridCol w:w="2520"/>
-        <w:gridCol w:w="1890"/>
+        <w:gridCol w:w="1975"/>
+        <w:gridCol w:w="2160"/>
+        <w:gridCol w:w="1980"/>
+        <w:gridCol w:w="2160"/>
       </w:tblGrid>
       <w:tr>
         <w:trPr>
@@ -1212,7 +1669,7 @@
         </w:trPr>
         <w:tc>
           <w:tcPr>
-            <w:tcW w:w="1160" w:type="dxa"/>
+            <w:tcW w:w="1975" w:type="dxa"/>
             <w:tcBorders>
               <w:top w:val="single" w:sz="4" w:space="0" w:color="auto"/>
               <w:left w:val="single" w:sz="4" w:space="0" w:color="auto"/>
@@ -1243,14 +1700,13 @@
                 <w:szCs w:val="28"/>
                 <w:lang w:eastAsia="vi-VN"/>
               </w:rPr>
-              <w:lastRenderedPageBreak/>
               <w:t xml:space="preserve">Hạng mục </w:t>
             </w:r>
           </w:p>
         </w:tc>
         <w:tc>
           <w:tcPr>
-            <w:tcW w:w="2435" w:type="dxa"/>
+            <w:tcW w:w="2160" w:type="dxa"/>
             <w:tcBorders>
               <w:top w:val="single" w:sz="4" w:space="0" w:color="auto"/>
               <w:left w:val="single" w:sz="4" w:space="0" w:color="auto"/>
@@ -1287,7 +1743,7 @@
         </w:tc>
         <w:tc>
           <w:tcPr>
-            <w:tcW w:w="2520" w:type="dxa"/>
+            <w:tcW w:w="1980" w:type="dxa"/>
             <w:tcBorders>
               <w:top w:val="single" w:sz="4" w:space="0" w:color="auto"/>
               <w:left w:val="single" w:sz="4" w:space="0" w:color="auto"/>
@@ -1324,7 +1780,7 @@
         </w:tc>
         <w:tc>
           <w:tcPr>
-            <w:tcW w:w="1890" w:type="dxa"/>
+            <w:tcW w:w="2160" w:type="dxa"/>
             <w:tcBorders>
               <w:top w:val="single" w:sz="4" w:space="0" w:color="auto"/>
               <w:left w:val="single" w:sz="4" w:space="0" w:color="auto"/>
@@ -1367,7 +1823,7 @@
         </w:trPr>
         <w:tc>
           <w:tcPr>
-            <w:tcW w:w="1160" w:type="dxa"/>
+            <w:tcW w:w="1975" w:type="dxa"/>
             <w:tcBorders>
               <w:top w:val="single" w:sz="4" w:space="0" w:color="auto"/>
               <w:left w:val="single" w:sz="8" w:space="0" w:color="auto"/>
@@ -1400,7 +1856,7 @@
         </w:tc>
         <w:tc>
           <w:tcPr>
-            <w:tcW w:w="2435" w:type="dxa"/>
+            <w:tcW w:w="2160" w:type="dxa"/>
             <w:tcBorders>
               <w:top w:val="single" w:sz="4" w:space="0" w:color="auto"/>
               <w:left w:val="nil"/>
@@ -1431,7 +1887,7 @@
         </w:tc>
         <w:tc>
           <w:tcPr>
-            <w:tcW w:w="2520" w:type="dxa"/>
+            <w:tcW w:w="1980" w:type="dxa"/>
             <w:tcBorders>
               <w:top w:val="single" w:sz="4" w:space="0" w:color="auto"/>
               <w:left w:val="nil"/>
@@ -1462,7 +1918,7 @@
         </w:tc>
         <w:tc>
           <w:tcPr>
-            <w:tcW w:w="1890" w:type="dxa"/>
+            <w:tcW w:w="2160" w:type="dxa"/>
             <w:tcBorders>
               <w:top w:val="single" w:sz="4" w:space="0" w:color="auto"/>
               <w:left w:val="nil"/>
@@ -1494,12 +1950,12 @@
       </w:tr>
       <w:tr>
         <w:trPr>
-          <w:trHeight w:val="1335"/>
+          <w:trHeight w:val="871"/>
           <w:jc w:val="center"/>
         </w:trPr>
         <w:tc>
           <w:tcPr>
-            <w:tcW w:w="1160" w:type="dxa"/>
+            <w:tcW w:w="1975" w:type="dxa"/>
             <w:tcBorders>
               <w:top w:val="nil"/>
               <w:left w:val="single" w:sz="8" w:space="0" w:color="auto"/>
@@ -1529,7 +1985,7 @@
         </w:tc>
         <w:tc>
           <w:tcPr>
-            <w:tcW w:w="2435" w:type="dxa"/>
+            <w:tcW w:w="2160" w:type="dxa"/>
             <w:tcBorders>
               <w:top w:val="nil"/>
               <w:left w:val="nil"/>
@@ -1561,7 +2017,7 @@
         </w:tc>
         <w:tc>
           <w:tcPr>
-            <w:tcW w:w="2520" w:type="dxa"/>
+            <w:tcW w:w="1980" w:type="dxa"/>
             <w:tcBorders>
               <w:top w:val="nil"/>
               <w:left w:val="nil"/>
@@ -1593,7 +2049,7 @@
         </w:tc>
         <w:tc>
           <w:tcPr>
-            <w:tcW w:w="1890" w:type="dxa"/>
+            <w:tcW w:w="2160" w:type="dxa"/>
             <w:tcBorders>
               <w:top w:val="nil"/>
               <w:left w:val="nil"/>
@@ -1621,8 +2077,6 @@
               </w:rPr>
               <w:t>0.00%</w:t>
             </w:r>
-            <w:bookmarkStart w:id="0" w:name="_GoBack"/>
-            <w:bookmarkEnd w:id="0"/>
           </w:p>
         </w:tc>
       </w:tr>
@@ -1633,7 +2087,7 @@
         </w:trPr>
         <w:tc>
           <w:tcPr>
-            <w:tcW w:w="1160" w:type="dxa"/>
+            <w:tcW w:w="1975" w:type="dxa"/>
             <w:tcBorders>
               <w:top w:val="nil"/>
               <w:left w:val="single" w:sz="8" w:space="0" w:color="auto"/>
@@ -1670,7 +2124,7 @@
         </w:tc>
         <w:tc>
           <w:tcPr>
-            <w:tcW w:w="2435" w:type="dxa"/>
+            <w:tcW w:w="2160" w:type="dxa"/>
             <w:tcBorders>
               <w:top w:val="single" w:sz="4" w:space="0" w:color="auto"/>
               <w:left w:val="single" w:sz="4" w:space="0" w:color="auto"/>
@@ -1701,7 +2155,7 @@
         </w:tc>
         <w:tc>
           <w:tcPr>
-            <w:tcW w:w="2520" w:type="dxa"/>
+            <w:tcW w:w="1980" w:type="dxa"/>
             <w:tcBorders>
               <w:top w:val="single" w:sz="4" w:space="0" w:color="auto"/>
               <w:left w:val="single" w:sz="4" w:space="0" w:color="auto"/>
@@ -1732,7 +2186,7 @@
         </w:tc>
         <w:tc>
           <w:tcPr>
-            <w:tcW w:w="1890" w:type="dxa"/>
+            <w:tcW w:w="2160" w:type="dxa"/>
             <w:tcBorders>
               <w:top w:val="single" w:sz="4" w:space="0" w:color="auto"/>
               <w:left w:val="single" w:sz="4" w:space="0" w:color="auto"/>
@@ -1765,15 +2219,615 @@
     </w:tbl>
     <w:p>
       <w:pPr>
-        <w:spacing w:before="120" w:line="360" w:lineRule="exact"/>
-        <w:ind w:firstLine="720"/>
-        <w:jc w:val="both"/>
-        <w:rPr>
-          <w:rFonts w:ascii="Times New Roman" w:hAnsi="Times New Roman"/>
-          <w:sz w:val="28"/>
-          <w:szCs w:val="28"/>
-        </w:rPr>
-      </w:pPr>
+        <w:numPr>
+          <w:ilvl w:val="0"/>
+          <w:numId w:val="28"/>
+        </w:numPr>
+        <w:tabs>
+          <w:tab w:val="num" w:pos="709"/>
+        </w:tabs>
+        <w:autoSpaceDE w:val="0"/>
+        <w:autoSpaceDN w:val="0"/>
+        <w:spacing w:before="120" w:after="60"/>
+        <w:ind w:left="0" w:firstLine="567"/>
+        <w:jc w:val="both"/>
+        <w:rPr>
+          <w:rFonts w:ascii="Times New Roman" w:hAnsi="Times New Roman"/>
+          <w:szCs w:val="26"/>
+        </w:rPr>
+      </w:pPr>
+      <w:r>
+        <w:rPr>
+          <w:rFonts w:ascii="Times New Roman" w:hAnsi="Times New Roman"/>
+          <w:szCs w:val="26"/>
+        </w:rPr>
+        <w:t xml:space="preserve">Kỳ hạn thanh toán: </w:t>
+      </w:r>
+      <w:r>
+        <w:rPr>
+          <w:rFonts w:ascii="Times New Roman" w:hAnsi="Times New Roman"/>
+          <w:szCs w:val="26"/>
+        </w:rPr>
+        <w:tab/>
+      </w:r>
+    </w:p>
+    <w:p>
+      <w:pPr>
+        <w:pStyle w:val="BodyText"/>
+        <w:spacing w:line="268" w:lineRule="auto"/>
+        <w:ind w:left="567" w:right="317" w:firstLine="426"/>
+        <w:rPr>
+          <w:rFonts w:ascii="Times New Roman" w:hAnsi="Times New Roman"/>
+          <w:szCs w:val="26"/>
+        </w:rPr>
+      </w:pPr>
+      <w:r>
+        <w:rPr>
+          <w:rFonts w:ascii="Times New Roman" w:hAnsi="Times New Roman"/>
+          <w:szCs w:val="26"/>
+        </w:rPr>
+        <w:t>+</w:t>
+      </w:r>
+      <w:r>
+        <w:rPr>
+          <w:rFonts w:ascii="Times New Roman" w:hAnsi="Times New Roman"/>
+          <w:spacing w:val="-13"/>
+          <w:szCs w:val="26"/>
+        </w:rPr>
+        <w:t xml:space="preserve"> </w:t>
+      </w:r>
+      <w:r>
+        <w:rPr>
+          <w:rFonts w:ascii="Times New Roman" w:hAnsi="Times New Roman"/>
+          <w:szCs w:val="26"/>
+        </w:rPr>
+        <w:t>Lần</w:t>
+      </w:r>
+      <w:r>
+        <w:rPr>
+          <w:rFonts w:ascii="Times New Roman" w:hAnsi="Times New Roman"/>
+          <w:spacing w:val="-12"/>
+          <w:szCs w:val="26"/>
+        </w:rPr>
+        <w:t xml:space="preserve"> </w:t>
+      </w:r>
+      <w:r>
+        <w:rPr>
+          <w:rFonts w:ascii="Times New Roman" w:hAnsi="Times New Roman"/>
+          <w:szCs w:val="26"/>
+        </w:rPr>
+        <w:t>thanh</w:t>
+      </w:r>
+      <w:r>
+        <w:rPr>
+          <w:rFonts w:ascii="Times New Roman" w:hAnsi="Times New Roman"/>
+          <w:spacing w:val="-12"/>
+          <w:szCs w:val="26"/>
+        </w:rPr>
+        <w:t xml:space="preserve"> </w:t>
+      </w:r>
+      <w:r>
+        <w:rPr>
+          <w:rFonts w:ascii="Times New Roman" w:hAnsi="Times New Roman"/>
+          <w:szCs w:val="26"/>
+        </w:rPr>
+        <w:t>toán</w:t>
+      </w:r>
+      <w:r>
+        <w:rPr>
+          <w:rFonts w:ascii="Times New Roman" w:hAnsi="Times New Roman"/>
+          <w:spacing w:val="-14"/>
+          <w:szCs w:val="26"/>
+        </w:rPr>
+        <w:t xml:space="preserve"> </w:t>
+      </w:r>
+      <w:r>
+        <w:rPr>
+          <w:rFonts w:ascii="Times New Roman" w:hAnsi="Times New Roman"/>
+          <w:szCs w:val="26"/>
+        </w:rPr>
+        <w:t>đầu</w:t>
+      </w:r>
+      <w:r>
+        <w:rPr>
+          <w:rFonts w:ascii="Times New Roman" w:hAnsi="Times New Roman"/>
+          <w:spacing w:val="-14"/>
+          <w:szCs w:val="26"/>
+        </w:rPr>
+        <w:t xml:space="preserve"> </w:t>
+      </w:r>
+      <w:r>
+        <w:rPr>
+          <w:rFonts w:ascii="Times New Roman" w:hAnsi="Times New Roman"/>
+          <w:szCs w:val="26"/>
+        </w:rPr>
+        <w:t>tiên:</w:t>
+      </w:r>
+      <w:r>
+        <w:rPr>
+          <w:rFonts w:ascii="Times New Roman" w:hAnsi="Times New Roman"/>
+          <w:spacing w:val="-12"/>
+          <w:szCs w:val="26"/>
+        </w:rPr>
+        <w:t xml:space="preserve"> </w:t>
+      </w:r>
+      <w:r>
+        <w:rPr>
+          <w:rFonts w:ascii="Times New Roman" w:hAnsi="Times New Roman"/>
+          <w:szCs w:val="26"/>
+        </w:rPr>
+        <w:t>Tính</w:t>
+      </w:r>
+      <w:r>
+        <w:rPr>
+          <w:rFonts w:ascii="Times New Roman" w:hAnsi="Times New Roman"/>
+          <w:spacing w:val="-14"/>
+          <w:szCs w:val="26"/>
+        </w:rPr>
+        <w:t xml:space="preserve"> </w:t>
+      </w:r>
+      <w:r>
+        <w:rPr>
+          <w:rFonts w:ascii="Times New Roman" w:hAnsi="Times New Roman"/>
+          <w:szCs w:val="26"/>
+        </w:rPr>
+        <w:t>từ</w:t>
+      </w:r>
+      <w:r>
+        <w:rPr>
+          <w:rFonts w:ascii="Times New Roman" w:hAnsi="Times New Roman"/>
+          <w:spacing w:val="-14"/>
+          <w:szCs w:val="26"/>
+        </w:rPr>
+        <w:t xml:space="preserve"> </w:t>
+      </w:r>
+      <w:r>
+        <w:rPr>
+          <w:rFonts w:ascii="Times New Roman" w:hAnsi="Times New Roman"/>
+          <w:szCs w:val="26"/>
+        </w:rPr>
+        <w:t>thời</w:t>
+      </w:r>
+      <w:r>
+        <w:rPr>
+          <w:rFonts w:ascii="Times New Roman" w:hAnsi="Times New Roman"/>
+          <w:spacing w:val="-14"/>
+          <w:szCs w:val="26"/>
+        </w:rPr>
+        <w:t xml:space="preserve"> </w:t>
+      </w:r>
+      <w:r>
+        <w:rPr>
+          <w:rFonts w:ascii="Times New Roman" w:hAnsi="Times New Roman"/>
+          <w:szCs w:val="26"/>
+        </w:rPr>
+        <w:t>điểm</w:t>
+      </w:r>
+      <w:r>
+        <w:rPr>
+          <w:rFonts w:ascii="Times New Roman" w:hAnsi="Times New Roman"/>
+          <w:spacing w:val="-13"/>
+          <w:szCs w:val="26"/>
+        </w:rPr>
+        <w:t xml:space="preserve"> </w:t>
+      </w:r>
+      <w:r>
+        <w:rPr>
+          <w:rFonts w:ascii="Times New Roman" w:hAnsi="Times New Roman"/>
+          <w:szCs w:val="26"/>
+        </w:rPr>
+        <w:t>bắt</w:t>
+      </w:r>
+      <w:r>
+        <w:rPr>
+          <w:rFonts w:ascii="Times New Roman" w:hAnsi="Times New Roman"/>
+          <w:spacing w:val="-12"/>
+          <w:szCs w:val="26"/>
+        </w:rPr>
+        <w:t xml:space="preserve"> </w:t>
+      </w:r>
+      <w:r>
+        <w:rPr>
+          <w:rFonts w:ascii="Times New Roman" w:hAnsi="Times New Roman"/>
+          <w:szCs w:val="26"/>
+        </w:rPr>
+        <w:t>đầu</w:t>
+      </w:r>
+      <w:r>
+        <w:rPr>
+          <w:rFonts w:ascii="Times New Roman" w:hAnsi="Times New Roman"/>
+          <w:spacing w:val="-14"/>
+          <w:szCs w:val="26"/>
+        </w:rPr>
+        <w:t xml:space="preserve"> </w:t>
+      </w:r>
+      <w:r>
+        <w:rPr>
+          <w:rFonts w:ascii="Times New Roman" w:hAnsi="Times New Roman"/>
+          <w:szCs w:val="26"/>
+        </w:rPr>
+        <w:t>tính</w:t>
+      </w:r>
+      <w:r>
+        <w:rPr>
+          <w:rFonts w:ascii="Times New Roman" w:hAnsi="Times New Roman"/>
+          <w:spacing w:val="-12"/>
+          <w:szCs w:val="26"/>
+        </w:rPr>
+        <w:t xml:space="preserve"> </w:t>
+      </w:r>
+      <w:r>
+        <w:rPr>
+          <w:rFonts w:ascii="Times New Roman" w:hAnsi="Times New Roman"/>
+          <w:szCs w:val="26"/>
+        </w:rPr>
+        <w:t>tiền</w:t>
+      </w:r>
+      <w:r>
+        <w:rPr>
+          <w:rFonts w:ascii="Times New Roman" w:hAnsi="Times New Roman"/>
+          <w:spacing w:val="-14"/>
+          <w:szCs w:val="26"/>
+        </w:rPr>
+        <w:t xml:space="preserve"> </w:t>
+      </w:r>
+      <w:r>
+        <w:rPr>
+          <w:rFonts w:ascii="Times New Roman" w:hAnsi="Times New Roman"/>
+          <w:szCs w:val="26"/>
+        </w:rPr>
+        <w:t>thuê</w:t>
+      </w:r>
+      <w:r>
+        <w:rPr>
+          <w:rFonts w:ascii="Times New Roman" w:hAnsi="Times New Roman"/>
+          <w:spacing w:val="-15"/>
+          <w:szCs w:val="26"/>
+        </w:rPr>
+        <w:t xml:space="preserve"> </w:t>
+      </w:r>
+      <w:r>
+        <w:rPr>
+          <w:rFonts w:ascii="Times New Roman" w:hAnsi="Times New Roman"/>
+          <w:szCs w:val="26"/>
+        </w:rPr>
+        <w:t>đến</w:t>
+      </w:r>
+      <w:r>
+        <w:rPr>
+          <w:rFonts w:ascii="Times New Roman" w:hAnsi="Times New Roman"/>
+          <w:spacing w:val="-14"/>
+          <w:szCs w:val="26"/>
+        </w:rPr>
+        <w:t xml:space="preserve"> </w:t>
+      </w:r>
+      <w:proofErr w:type="gramStart"/>
+      <w:r>
+        <w:rPr>
+          <w:rFonts w:ascii="Times New Roman" w:hAnsi="Times New Roman"/>
+          <w:szCs w:val="26"/>
+        </w:rPr>
+        <w:t xml:space="preserve">ngày </w:t>
+      </w:r>
+      <w:r>
+        <w:rPr>
+          <w:rFonts w:ascii="Times New Roman" w:hAnsi="Times New Roman"/>
+          <w:spacing w:val="-67"/>
+          <w:szCs w:val="26"/>
+        </w:rPr>
+        <w:t xml:space="preserve"> </w:t>
+      </w:r>
+      <w:r>
+        <w:rPr>
+          <w:rFonts w:ascii="Times New Roman" w:hAnsi="Times New Roman"/>
+          <w:szCs w:val="26"/>
+        </w:rPr>
+        <w:t>31</w:t>
+      </w:r>
+      <w:proofErr w:type="gramEnd"/>
+      <w:r>
+        <w:rPr>
+          <w:rFonts w:ascii="Times New Roman" w:hAnsi="Times New Roman"/>
+          <w:szCs w:val="26"/>
+        </w:rPr>
+        <w:t>/12 của</w:t>
+      </w:r>
+      <w:r>
+        <w:rPr>
+          <w:rFonts w:ascii="Times New Roman" w:hAnsi="Times New Roman"/>
+          <w:spacing w:val="-3"/>
+          <w:szCs w:val="26"/>
+        </w:rPr>
+        <w:t xml:space="preserve"> </w:t>
+      </w:r>
+      <w:r>
+        <w:rPr>
+          <w:rFonts w:ascii="Times New Roman" w:hAnsi="Times New Roman"/>
+          <w:szCs w:val="26"/>
+        </w:rPr>
+        <w:t>năm</w:t>
+      </w:r>
+      <w:r>
+        <w:rPr>
+          <w:rFonts w:ascii="Times New Roman" w:hAnsi="Times New Roman"/>
+          <w:spacing w:val="-3"/>
+          <w:szCs w:val="26"/>
+        </w:rPr>
+        <w:t xml:space="preserve"> </w:t>
+      </w:r>
+      <w:r>
+        <w:rPr>
+          <w:rFonts w:ascii="Times New Roman" w:hAnsi="Times New Roman"/>
+          <w:szCs w:val="26"/>
+        </w:rPr>
+        <w:t>đó.</w:t>
+      </w:r>
+    </w:p>
+    <w:p>
+      <w:pPr>
+        <w:pStyle w:val="BodyText"/>
+        <w:spacing w:before="119"/>
+        <w:ind w:left="567" w:firstLine="426"/>
+        <w:rPr>
+          <w:rFonts w:ascii="Times New Roman" w:hAnsi="Times New Roman"/>
+          <w:szCs w:val="26"/>
+        </w:rPr>
+      </w:pPr>
+      <w:r>
+        <w:rPr>
+          <w:rFonts w:ascii="Times New Roman" w:hAnsi="Times New Roman"/>
+          <w:szCs w:val="26"/>
+        </w:rPr>
+        <w:t>+</w:t>
+      </w:r>
+      <w:r>
+        <w:rPr>
+          <w:rFonts w:ascii="Times New Roman" w:hAnsi="Times New Roman"/>
+          <w:spacing w:val="-3"/>
+          <w:szCs w:val="26"/>
+        </w:rPr>
+        <w:t xml:space="preserve"> </w:t>
+      </w:r>
+      <w:r>
+        <w:rPr>
+          <w:rFonts w:ascii="Times New Roman" w:hAnsi="Times New Roman"/>
+          <w:szCs w:val="26"/>
+        </w:rPr>
+        <w:t>Lần thanh</w:t>
+      </w:r>
+      <w:r>
+        <w:rPr>
+          <w:rFonts w:ascii="Times New Roman" w:hAnsi="Times New Roman"/>
+          <w:spacing w:val="-5"/>
+          <w:szCs w:val="26"/>
+        </w:rPr>
+        <w:t xml:space="preserve"> </w:t>
+      </w:r>
+      <w:r>
+        <w:rPr>
+          <w:rFonts w:ascii="Times New Roman" w:hAnsi="Times New Roman"/>
+          <w:szCs w:val="26"/>
+        </w:rPr>
+        <w:t>toán</w:t>
+      </w:r>
+      <w:r>
+        <w:rPr>
+          <w:rFonts w:ascii="Times New Roman" w:hAnsi="Times New Roman"/>
+          <w:spacing w:val="-3"/>
+          <w:szCs w:val="26"/>
+        </w:rPr>
+        <w:t xml:space="preserve"> </w:t>
+      </w:r>
+      <w:r>
+        <w:rPr>
+          <w:rFonts w:ascii="Times New Roman" w:hAnsi="Times New Roman"/>
+          <w:szCs w:val="26"/>
+        </w:rPr>
+        <w:t>tiếp</w:t>
+      </w:r>
+      <w:r>
+        <w:rPr>
+          <w:rFonts w:ascii="Times New Roman" w:hAnsi="Times New Roman"/>
+          <w:spacing w:val="-2"/>
+          <w:szCs w:val="26"/>
+        </w:rPr>
+        <w:t xml:space="preserve"> </w:t>
+      </w:r>
+      <w:r>
+        <w:rPr>
+          <w:rFonts w:ascii="Times New Roman" w:hAnsi="Times New Roman"/>
+          <w:szCs w:val="26"/>
+        </w:rPr>
+        <w:t>theo:</w:t>
+      </w:r>
+      <w:r>
+        <w:rPr>
+          <w:rFonts w:ascii="Times New Roman" w:hAnsi="Times New Roman"/>
+          <w:spacing w:val="2"/>
+          <w:szCs w:val="26"/>
+        </w:rPr>
+        <w:t xml:space="preserve"> </w:t>
+      </w:r>
+      <w:r>
+        <w:rPr>
+          <w:rFonts w:ascii="Times New Roman" w:hAnsi="Times New Roman"/>
+          <w:szCs w:val="26"/>
+        </w:rPr>
+        <w:t>Thanh</w:t>
+      </w:r>
+      <w:r>
+        <w:rPr>
+          <w:rFonts w:ascii="Times New Roman" w:hAnsi="Times New Roman"/>
+          <w:spacing w:val="-4"/>
+          <w:szCs w:val="26"/>
+        </w:rPr>
+        <w:t xml:space="preserve"> </w:t>
+      </w:r>
+      <w:r>
+        <w:rPr>
+          <w:rFonts w:ascii="Times New Roman" w:hAnsi="Times New Roman"/>
+          <w:szCs w:val="26"/>
+        </w:rPr>
+        <w:t>toán</w:t>
+      </w:r>
+      <w:r>
+        <w:rPr>
+          <w:rFonts w:ascii="Times New Roman" w:hAnsi="Times New Roman"/>
+          <w:spacing w:val="-2"/>
+          <w:szCs w:val="26"/>
+        </w:rPr>
+        <w:t xml:space="preserve"> </w:t>
+      </w:r>
+      <w:r>
+        <w:rPr>
+          <w:rFonts w:ascii="Times New Roman" w:hAnsi="Times New Roman"/>
+          <w:szCs w:val="26"/>
+        </w:rPr>
+        <w:t>6</w:t>
+      </w:r>
+      <w:r>
+        <w:rPr>
+          <w:rFonts w:ascii="Times New Roman" w:hAnsi="Times New Roman"/>
+          <w:spacing w:val="-1"/>
+          <w:szCs w:val="26"/>
+        </w:rPr>
+        <w:t xml:space="preserve"> </w:t>
+      </w:r>
+      <w:r>
+        <w:rPr>
+          <w:rFonts w:ascii="Times New Roman" w:hAnsi="Times New Roman"/>
+          <w:szCs w:val="26"/>
+        </w:rPr>
+        <w:t>tháng/lần</w:t>
+      </w:r>
+      <w:r>
+        <w:rPr>
+          <w:rFonts w:ascii="Times New Roman" w:hAnsi="Times New Roman"/>
+          <w:spacing w:val="-3"/>
+          <w:szCs w:val="26"/>
+        </w:rPr>
+        <w:t xml:space="preserve"> </w:t>
+      </w:r>
+      <w:r>
+        <w:rPr>
+          <w:rFonts w:ascii="Times New Roman" w:hAnsi="Times New Roman"/>
+          <w:szCs w:val="26"/>
+        </w:rPr>
+        <w:t>vào</w:t>
+      </w:r>
+      <w:r>
+        <w:rPr>
+          <w:rFonts w:ascii="Times New Roman" w:hAnsi="Times New Roman"/>
+          <w:spacing w:val="-1"/>
+          <w:szCs w:val="26"/>
+        </w:rPr>
+        <w:t xml:space="preserve"> </w:t>
+      </w:r>
+      <w:r>
+        <w:rPr>
+          <w:rFonts w:ascii="Times New Roman" w:hAnsi="Times New Roman"/>
+          <w:szCs w:val="26"/>
+        </w:rPr>
+        <w:t>đầu kỳ.</w:t>
+      </w:r>
+    </w:p>
+    <w:p>
+      <w:pPr>
+        <w:numPr>
+          <w:ilvl w:val="0"/>
+          <w:numId w:val="28"/>
+        </w:numPr>
+        <w:tabs>
+          <w:tab w:val="num" w:pos="709"/>
+        </w:tabs>
+        <w:autoSpaceDE w:val="0"/>
+        <w:autoSpaceDN w:val="0"/>
+        <w:spacing w:before="120" w:after="60"/>
+        <w:ind w:left="0" w:firstLine="567"/>
+        <w:jc w:val="both"/>
+        <w:rPr>
+          <w:rFonts w:ascii="Times New Roman" w:hAnsi="Times New Roman"/>
+          <w:szCs w:val="26"/>
+        </w:rPr>
+      </w:pPr>
+      <w:r>
+        <w:rPr>
+          <w:rFonts w:ascii="Times New Roman" w:hAnsi="Times New Roman"/>
+          <w:szCs w:val="26"/>
+        </w:rPr>
+        <w:t>Phương thức thanh toán: Chuyển khoản.</w:t>
+      </w:r>
+    </w:p>
+    <w:p>
+      <w:pPr>
+        <w:pStyle w:val="BodyTextIndent3"/>
+        <w:numPr>
+          <w:ilvl w:val="0"/>
+          <w:numId w:val="29"/>
+        </w:numPr>
+        <w:tabs>
+          <w:tab w:val="clear" w:pos="180"/>
+        </w:tabs>
+        <w:suppressAutoHyphens/>
+        <w:autoSpaceDE/>
+        <w:autoSpaceDN/>
+        <w:ind w:left="0" w:firstLine="567"/>
+        <w:rPr>
+          <w:rFonts w:ascii="Times New Roman" w:hAnsi="Times New Roman"/>
+          <w:bCs/>
+          <w:iCs/>
+          <w:color w:val="000000" w:themeColor="text1"/>
+          <w:spacing w:val="-2"/>
+          <w:sz w:val="26"/>
+          <w:szCs w:val="26"/>
+          <w:lang w:val="vi-VN"/>
+        </w:rPr>
+      </w:pPr>
+      <w:r>
+        <w:rPr>
+          <w:rFonts w:ascii="Times New Roman" w:hAnsi="Times New Roman"/>
+          <w:szCs w:val="26"/>
+        </w:rPr>
+        <w:t xml:space="preserve">Thời điểm thanh toán: </w:t>
+      </w:r>
+      <w:r>
+        <w:rPr>
+          <w:rFonts w:ascii="Times New Roman" w:hAnsi="Times New Roman"/>
+          <w:bCs/>
+          <w:iCs/>
+          <w:color w:val="000000" w:themeColor="text1"/>
+          <w:spacing w:val="-2"/>
+          <w:sz w:val="26"/>
+          <w:szCs w:val="26"/>
+        </w:rPr>
+        <w:t xml:space="preserve">Kể từ thời điểm MobiFone hoàn thành lắp đặt, phát sóng trạm </w:t>
+      </w:r>
+      <w:proofErr w:type="gramStart"/>
+      <w:r>
+        <w:rPr>
+          <w:rFonts w:ascii="Times New Roman" w:hAnsi="Times New Roman"/>
+          <w:bCs/>
+          <w:iCs/>
+          <w:color w:val="000000" w:themeColor="text1"/>
+          <w:spacing w:val="-2"/>
+          <w:sz w:val="26"/>
+          <w:szCs w:val="26"/>
+        </w:rPr>
+        <w:t>( thể</w:t>
+      </w:r>
+      <w:proofErr w:type="gramEnd"/>
+      <w:r>
+        <w:rPr>
+          <w:rFonts w:ascii="Times New Roman" w:hAnsi="Times New Roman"/>
+          <w:bCs/>
+          <w:iCs/>
+          <w:color w:val="000000" w:themeColor="text1"/>
+          <w:spacing w:val="-2"/>
+          <w:sz w:val="26"/>
+          <w:szCs w:val="26"/>
+        </w:rPr>
+        <w:t xml:space="preserve"> hiện bằng biên bản phát sóng) nhưng không quá 60 ngày kể từ ngày hoàn thành lắp dựng xong cột anten.</w:t>
+      </w:r>
     </w:p>
     <w:p>
       <w:pPr>
@@ -1793,17 +2847,15 @@
           <w:szCs w:val="28"/>
           <w:lang w:val="vi-VN"/>
         </w:rPr>
-        <w:t xml:space="preserve">Kính trình Giám đốc xét duyệt ký phụ lục </w:t>
-      </w:r>
-      <w:r>
-        <w:rPr>
-          <w:rStyle w:val="Emphasis"/>
-          <w:rFonts w:ascii="Times New Roman" w:hAnsi="Times New Roman"/>
-          <w:i w:val="0"/>
+        <w:t>Kính trình Giám đốc xét duyệt hợp đồng</w:t>
+      </w:r>
+      <w:r>
+        <w:rPr>
+          <w:rFonts w:ascii="Times New Roman" w:hAnsi="Times New Roman"/>
           <w:szCs w:val="28"/>
           <w:lang w:val="vi-VN"/>
         </w:rPr>
-        <w:t>thay đổi giá thuê</w:t>
+        <w:t xml:space="preserve"> thuê vị trí đặt trạm</w:t>
       </w:r>
       <w:r>
         <w:rPr>
@@ -1811,7 +2863,7 @@
           <w:szCs w:val="28"/>
           <w:lang w:val="vi-VN"/>
         </w:rPr>
-        <w:t xml:space="preserve"> hợp đồng để Phòng</w:t>
+        <w:t xml:space="preserve"> để Phòng</w:t>
       </w:r>
       <w:r>
         <w:rPr>
@@ -1827,29 +2879,6 @@
           <w:lang w:val="vi-VN"/>
         </w:rPr>
         <w:t>Viễn thông có cơ sở thực hiện./.</w:t>
-      </w:r>
-    </w:p>
-    <w:p>
-      <w:pPr>
-        <w:tabs>
-          <w:tab w:val="left" w:pos="426"/>
-          <w:tab w:val="left" w:pos="810"/>
-          <w:tab w:val="left" w:pos="3240"/>
-        </w:tabs>
-        <w:spacing w:before="120" w:line="360" w:lineRule="exact"/>
-        <w:ind w:left="540" w:firstLine="720"/>
-        <w:jc w:val="both"/>
-        <w:rPr>
-          <w:rFonts w:ascii="Times New Roman" w:hAnsi="Times New Roman"/>
-          <w:szCs w:val="28"/>
-        </w:rPr>
-      </w:pPr>
-      <w:r>
-        <w:rPr>
-          <w:rFonts w:ascii="Times New Roman" w:hAnsi="Times New Roman"/>
-          <w:szCs w:val="28"/>
-        </w:rPr>
-        <w:t> </w:t>
       </w:r>
     </w:p>
     <w:p>
@@ -2291,7 +3320,6 @@
                 <w:szCs w:val="28"/>
                 <w:lang w:val="vi-VN"/>
               </w:rPr>
-              <w:lastRenderedPageBreak/>
               <w:t>TCT VIỄN THÔNG MOBIFONE</w:t>
             </w:r>
           </w:p>
@@ -2431,7 +3459,7 @@
                     </wp:anchor>
                   </w:drawing>
                 </mc:Choice>
-                <mc:Fallback xmlns:oel="http://schemas.microsoft.com/office/2019/extlst" xmlns:w16cex="http://schemas.microsoft.com/office/word/2018/wordml/cex" xmlns:w16="http://schemas.microsoft.com/office/word/2018/wordml" xmlns:w16du="http://schemas.microsoft.com/office/word/2023/wordml/word16du" xmlns:w16sdtdh="http://schemas.microsoft.com/office/word/2020/wordml/sdtdatahash" xmlns:w16sdtfl="http://schemas.microsoft.com/office/word/2024/wordml/sdtformatlock">
+                <mc:Fallback xmlns:w16sdtfl="http://schemas.microsoft.com/office/word/2024/wordml/sdtformatlock" xmlns:w16sdtdh="http://schemas.microsoft.com/office/word/2020/wordml/sdtdatahash" xmlns:w16du="http://schemas.microsoft.com/office/word/2023/wordml/word16du" xmlns:w16="http://schemas.microsoft.com/office/word/2018/wordml" xmlns:w16cex="http://schemas.microsoft.com/office/word/2018/wordml/cex" xmlns:oel="http://schemas.microsoft.com/office/2019/extlst">
                   <w:pict>
                     <v:shape w14:anchorId="18EC2693" id="Straight Arrow Connector 4" o:spid="_x0000_s1026" type="#_x0000_t32" style="position:absolute;margin-left:61.15pt;margin-top:19.7pt;width:132pt;height:0;z-index:251664384;visibility:visible;mso-wrap-style:square;mso-width-percent:0;mso-height-percent:0;mso-wrap-distance-left:9pt;mso-wrap-distance-top:-6e-5mm;mso-wrap-distance-right:9pt;mso-wrap-distance-bottom:-6e-5mm;mso-position-horizontal:absolute;mso-position-horizontal-relative:text;mso-position-vertical:absolute;mso-position-vertical-relative:text;mso-width-percent:0;mso-height-percent:0;mso-width-relative:page;mso-height-relative:page" o:gfxdata="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"/>
                   </w:pict>
@@ -2536,7 +3564,7 @@
                     </wp:anchor>
                   </w:drawing>
                 </mc:Choice>
-                <mc:Fallback xmlns:oel="http://schemas.microsoft.com/office/2019/extlst" xmlns:w16cex="http://schemas.microsoft.com/office/word/2018/wordml/cex" xmlns:w16="http://schemas.microsoft.com/office/word/2018/wordml" xmlns:w16du="http://schemas.microsoft.com/office/word/2023/wordml/word16du" xmlns:w16sdtdh="http://schemas.microsoft.com/office/word/2020/wordml/sdtdatahash" xmlns:w16sdtfl="http://schemas.microsoft.com/office/word/2024/wordml/sdtformatlock">
+                <mc:Fallback xmlns:w16sdtfl="http://schemas.microsoft.com/office/word/2024/wordml/sdtformatlock" xmlns:w16sdtdh="http://schemas.microsoft.com/office/word/2020/wordml/sdtdatahash" xmlns:w16du="http://schemas.microsoft.com/office/word/2023/wordml/word16du" xmlns:w16="http://schemas.microsoft.com/office/word/2018/wordml" xmlns:w16cex="http://schemas.microsoft.com/office/word/2018/wordml/cex" xmlns:oel="http://schemas.microsoft.com/office/2019/extlst">
                   <w:pict>
                     <v:shape w14:anchorId="0680D1E1" id="Straight Arrow Connector 5" o:spid="_x0000_s1026" type="#_x0000_t32" style="position:absolute;margin-left:60.2pt;margin-top:4.05pt;width:124.8pt;height:0;z-index:251663360;visibility:visible;mso-wrap-style:square;mso-width-percent:0;mso-height-percent:0;mso-wrap-distance-left:9pt;mso-wrap-distance-top:-6e-5mm;mso-wrap-distance-right:9pt;mso-wrap-distance-bottom:-6e-5mm;mso-position-horizontal:absolute;mso-position-horizontal-relative:text;mso-position-vertical:absolute;mso-position-vertical-relative:text;mso-width-percent:0;mso-height-percent:0;mso-width-relative:page;mso-height-relative:page" o:gfxdata="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"/>
                   </w:pict>
@@ -2726,7 +3754,7 @@
           <w:lang w:val="vi-VN"/>
         </w:rPr>
       </w:pPr>
-      <w:bookmarkStart w:id="1" w:name="_Hlk76390970"/>
+      <w:bookmarkStart w:id="0" w:name="_Hlk76390970"/>
       <w:r>
         <w:rPr>
           <w:rFonts w:ascii="Times New Roman" w:hAnsi="Times New Roman"/>
@@ -2757,7 +3785,7 @@
         </w:rPr>
         <w:t xml:space="preserve">     -26/</w:t>
       </w:r>
-      <w:bookmarkEnd w:id="1"/>
+      <w:bookmarkEnd w:id="0"/>
       <w:r>
         <w:rPr>
           <w:rFonts w:ascii="Times New Roman" w:eastAsiaTheme="minorEastAsia" w:hAnsi="Times New Roman"/>
@@ -3131,7 +4159,7 @@
           <w:szCs w:val="26"/>
         </w:rPr>
         <w:tab/>
-        <w:t>:{</w:t>
+        <w:t>:</w:t>
       </w:r>
       <w:proofErr w:type="gramEnd"/>
       <w:r>
@@ -3139,7 +4167,7 @@
           <w:rFonts w:ascii="Times New Roman" w:hAnsi="Times New Roman"/>
           <w:szCs w:val="26"/>
         </w:rPr>
-        <w:t>{ADDRESS_OLD}} ({{ADDRESS_NEW}})</w:t>
+        <w:t>{{ADDRESS_OLD}} ({{ADDRESS_NEW}})</w:t>
       </w:r>
     </w:p>
     <w:p>
@@ -3599,6 +4627,7 @@
           <w:noProof/>
           <w:szCs w:val="26"/>
         </w:rPr>
+        <w:lastRenderedPageBreak/>
         <w:t>Tài khoản số</w:t>
       </w:r>
       <w:r>
@@ -3694,7 +4723,63 @@
           <w:szCs w:val="26"/>
           <w:lang w:val="fr-FR"/>
         </w:rPr>
-        <w:t>(Giấy UQ số 08/UQ-MBF.ĐNa ngày 22/01/2026 do Giám đốc MobiFone Đồng Nai – Chi nhánh Tổng Công ty Viễn Thông MobiFone, Ông Bùi Chí Tuệ ký)</w:t>
+        <w:t xml:space="preserve">(Giấy UQ số </w:t>
+      </w:r>
+      <w:r>
+        <w:rPr>
+          <w:rFonts w:ascii="Times New Roman" w:hAnsi="Times New Roman"/>
+          <w:i/>
+          <w:szCs w:val="26"/>
+          <w:lang w:val="vi-VN"/>
+        </w:rPr>
+        <w:t>21</w:t>
+      </w:r>
+      <w:r>
+        <w:rPr>
+          <w:rFonts w:ascii="Times New Roman" w:hAnsi="Times New Roman"/>
+          <w:i/>
+          <w:szCs w:val="26"/>
+          <w:lang w:val="fr-FR"/>
+        </w:rPr>
+        <w:t xml:space="preserve">/UQ-MBF.ĐNa ngày </w:t>
+      </w:r>
+      <w:r>
+        <w:rPr>
+          <w:rFonts w:ascii="Times New Roman" w:hAnsi="Times New Roman"/>
+          <w:i/>
+          <w:szCs w:val="26"/>
+          <w:lang w:val="vi-VN"/>
+        </w:rPr>
+        <w:t>19</w:t>
+      </w:r>
+      <w:r>
+        <w:rPr>
+          <w:rFonts w:ascii="Times New Roman" w:hAnsi="Times New Roman"/>
+          <w:i/>
+          <w:szCs w:val="26"/>
+          <w:lang w:val="fr-FR"/>
+        </w:rPr>
+        <w:t>/0</w:t>
+      </w:r>
+      <w:r>
+        <w:rPr>
+          <w:rFonts w:ascii="Times New Roman" w:hAnsi="Times New Roman"/>
+          <w:i/>
+          <w:szCs w:val="26"/>
+          <w:lang w:val="vi-VN"/>
+        </w:rPr>
+        <w:t>6</w:t>
+      </w:r>
+      <w:bookmarkStart w:id="1" w:name="_GoBack"/>
+      <w:bookmarkEnd w:id="1"/>
+      <w:r>
+        <w:rPr>
+          <w:rFonts w:ascii="Times New Roman" w:hAnsi="Times New Roman"/>
+          <w:i/>
+          <w:szCs w:val="26"/>
+          <w:lang w:val="fr-FR"/>
+        </w:rPr>
+        <w:t>/2026 do Giám đốc MobiFone Đồng Nai – Chi nhánh Tổng Công ty Viễn Thông MobiFone, Ông Bùi Chí Tuệ ký)</w:t>
       </w:r>
     </w:p>
     <w:p>
@@ -3775,7 +4860,6 @@
           <w:szCs w:val="26"/>
           <w:lang w:val="fr-FR"/>
         </w:rPr>
-        <w:lastRenderedPageBreak/>
         <w:t xml:space="preserve">Điều 1. </w:t>
       </w:r>
       <w:r>
@@ -4373,6 +5457,7 @@
           <w:szCs w:val="26"/>
           <w:lang w:val="da-DK"/>
         </w:rPr>
+        <w:lastRenderedPageBreak/>
         <w:t>Bên A đồng ý cho Bên B sử dụng mặt bằng</w:t>
       </w:r>
       <w:r>
@@ -4462,7 +5547,6 @@
           <w:szCs w:val="26"/>
           <w:lang w:val="da-DK"/>
         </w:rPr>
-        <w:lastRenderedPageBreak/>
         <w:t>- Công tác khảo sát, thiết kế;</w:t>
       </w:r>
     </w:p>
@@ -4974,6 +6058,7 @@
           <w:b/>
           <w:szCs w:val="26"/>
         </w:rPr>
+        <w:lastRenderedPageBreak/>
         <w:t>Tên tài khoản: {{ACCOUNT_OWNER}}</w:t>
       </w:r>
     </w:p>
@@ -5088,7 +6173,6 @@
           <w:szCs w:val="26"/>
           <w:lang w:val="vi-VN"/>
         </w:rPr>
-        <w:lastRenderedPageBreak/>
         <w:t xml:space="preserve">Trường hợp thay đổi thông tin tài khoản nhận thanh toán, Bên </w:t>
       </w:r>
       <w:r>
@@ -5726,6 +6810,7 @@
           <w:szCs w:val="26"/>
           <w:lang w:val="da-DK"/>
         </w:rPr>
+        <w:lastRenderedPageBreak/>
         <w:t>- Bên A thanh toán các chi phí phát sinh khi chuyển mục đích sử dụng đất nhằm mục đích xin các loại giấy phép phục vụ việc xây dựng trạm BTS.</w:t>
       </w:r>
     </w:p>
@@ -5786,16 +6871,7 @@
           <w:szCs w:val="26"/>
           <w:lang w:val="da-DK"/>
         </w:rPr>
-        <w:t xml:space="preserve"> không được ảnh hưởng quyền thuê của bên B. Trách nhiệm của hai bên vẫn </w:t>
-      </w:r>
-      <w:r>
-        <w:rPr>
-          <w:rFonts w:ascii="Times New Roman" w:hAnsi="Times New Roman"/>
-          <w:szCs w:val="26"/>
-          <w:lang w:val="da-DK"/>
-        </w:rPr>
-        <w:lastRenderedPageBreak/>
-        <w:t>phải được tiến hành theo nội dung của hợp đồng này và hợp đồng này vẫn phải có hiệu lực cho đến hết thời hạn được nêu ở điều 2, tạo mọi điều kiện thuận lợi để bên B sử dụng mặt bằng/hạ tầng có sẵn đã thuê.</w:t>
+        <w:t xml:space="preserve"> không được ảnh hưởng quyền thuê của bên B. Trách nhiệm của hai bên vẫn phải được tiến hành theo nội dung của hợp đồng này và hợp đồng này vẫn phải có hiệu lực cho đến hết thời hạn được nêu ở điều 2, tạo mọi điều kiện thuận lợi để bên B sử dụng mặt bằng/hạ tầng có sẵn đã thuê.</w:t>
       </w:r>
     </w:p>
     <w:p>
@@ -6061,7 +7137,16 @@
           <w:szCs w:val="26"/>
           <w:lang w:val="da-DK"/>
         </w:rPr>
-        <w:t>- Bảo đảm an ninh, an toàn khu vực nhà trạm và các vật tư thiết bị của trạm, không cho người lạ vào phòng máy hoặc can thiệp vào các thiết bị của trạm. Nếu việc cháy, hỏng, mất mát các tài sản đó do lỗi của Bên A thì Bên A phải sửa chữa, khôi phục tài sản của bên B như ban đầu. Nếu có mất mát Bên A phải báo cơ quan chức năng và bên B để cùng tìm hướng giải quyết.</w:t>
+        <w:t xml:space="preserve">- Bảo đảm an ninh, an toàn khu vực nhà trạm và các vật tư thiết bị của trạm, không cho người lạ vào phòng máy hoặc can thiệp vào các thiết bị của trạm. Nếu việc </w:t>
+      </w:r>
+      <w:r>
+        <w:rPr>
+          <w:rFonts w:ascii="Times New Roman" w:hAnsi="Times New Roman"/>
+          <w:szCs w:val="26"/>
+          <w:lang w:val="da-DK"/>
+        </w:rPr>
+        <w:lastRenderedPageBreak/>
+        <w:t>cháy, hỏng, mất mát các tài sản đó do lỗi của Bên A thì Bên A phải sửa chữa, khôi phục tài sản của bên B như ban đầu. Nếu có mất mát Bên A phải báo cơ quan chức năng và bên B để cùng tìm hướng giải quyết.</w:t>
       </w:r>
     </w:p>
     <w:p>
@@ -6103,16 +7188,7 @@
           <w:szCs w:val="26"/>
           <w:lang w:val="da-DK"/>
         </w:rPr>
-        <w:t xml:space="preserve">- Kiểm tra giấy tờ (thẻ cán bộ CNV MobiFone, CCCD…) và tạo điều kiện thuận </w:t>
-      </w:r>
-      <w:r>
-        <w:rPr>
-          <w:rFonts w:ascii="Times New Roman" w:hAnsi="Times New Roman"/>
-          <w:szCs w:val="26"/>
-          <w:lang w:val="da-DK"/>
-        </w:rPr>
-        <w:lastRenderedPageBreak/>
-        <w:t>lợi khi các kỹ sư, công nhân viên, chuyên gia Việt Nam và nước ngoài mang máy móc thiết bị, vật tư ra vào trạm trong quá trình lắp đặt, vận hành và ứng cứu thông tin.</w:t>
+        <w:t>- Kiểm tra giấy tờ (thẻ cán bộ CNV MobiFone, CCCD…) và tạo điều kiện thuận lợi khi các kỹ sư, công nhân viên, chuyên gia Việt Nam và nước ngoài mang máy móc thiết bị, vật tư ra vào trạm trong quá trình lắp đặt, vận hành và ứng cứu thông tin.</w:t>
       </w:r>
     </w:p>
     <w:p>
@@ -6404,6 +7480,7 @@
           <w:szCs w:val="26"/>
           <w:lang w:val="da-DK"/>
         </w:rPr>
+        <w:lastRenderedPageBreak/>
         <w:t>- Thanh toán tiền thuê mặt bằng đúng thời hạn và đầy đủ.</w:t>
       </w:r>
     </w:p>
@@ -6446,16 +7523,7 @@
           <w:szCs w:val="26"/>
           <w:lang w:val="da-DK"/>
         </w:rPr>
-        <w:t xml:space="preserve">- Cán bộ, công nhân viên và đối tác của Bên B khi đến trạm làm nhiệm vụ phải xuất trình giấy tờ khi ra vào trạm (chứng minh nhân dân, thẻ cán bộ CNV MobiFone, </w:t>
-      </w:r>
-      <w:r>
-        <w:rPr>
-          <w:rFonts w:ascii="Times New Roman" w:hAnsi="Times New Roman"/>
-          <w:szCs w:val="26"/>
-          <w:lang w:val="da-DK"/>
-        </w:rPr>
-        <w:lastRenderedPageBreak/>
-        <w:t>Giấy giới thiệu …).</w:t>
+        <w:t>- Cán bộ, công nhân viên và đối tác của Bên B khi đến trạm làm nhiệm vụ phải xuất trình giấy tờ khi ra vào trạm (chứng minh nhân dân, thẻ cán bộ CNV MobiFone, Giấy giới thiệu …).</w:t>
       </w:r>
     </w:p>
     <w:p>
@@ -6937,7 +8005,16 @@
           <w:szCs w:val="26"/>
           <w:lang w:val="da-DK"/>
         </w:rPr>
-        <w:t>- Trong quá trình triển khai hợp đồng, nếu có các sự kiện bất khả kháng hoặc các sự kiện khách quan thì hai Bên phải chủ động và cùng phối hợp giải quyết.</w:t>
+        <w:t xml:space="preserve">- Trong quá trình triển khai hợp đồng, nếu có các sự kiện bất khả kháng hoặc các </w:t>
+      </w:r>
+      <w:r>
+        <w:rPr>
+          <w:rFonts w:ascii="Times New Roman" w:hAnsi="Times New Roman"/>
+          <w:szCs w:val="26"/>
+          <w:lang w:val="da-DK"/>
+        </w:rPr>
+        <w:lastRenderedPageBreak/>
+        <w:t>sự kiện khách quan thì hai Bên phải chủ động và cùng phối hợp giải quyết.</w:t>
       </w:r>
     </w:p>
     <w:p>
@@ -7000,7 +8077,6 @@
           <w:szCs w:val="26"/>
           <w:lang w:val="da-DK"/>
         </w:rPr>
-        <w:lastRenderedPageBreak/>
         <w:t xml:space="preserve">+ Bên A: </w:t>
       </w:r>
       <w:r>
@@ -7435,6 +8511,7 @@
           <w:szCs w:val="26"/>
           <w:lang w:val="da-DK"/>
         </w:rPr>
+        <w:lastRenderedPageBreak/>
         <w:t>- Hai bên cam kết thực hiện nghiêm chỉnh các điều khoản đã ghi trong hợp đồng này. Trong quá trình thực hiện, nếu có vấn đề gì phát sinh, hai bên sẽ thông báo cho nhau và cùng nhau bàn bạc giải quyết trên cơ sở hợp tình, hợp lý.</w:t>
       </w:r>
     </w:p>
@@ -7477,7 +8554,6 @@
           <w:szCs w:val="26"/>
           <w:lang w:val="da-DK"/>
         </w:rPr>
-        <w:lastRenderedPageBreak/>
         <w:t>- Mỗi Bên không được tiết lộ cho bất cứ Bên thứ ba nào bất kỳ thông tin liên quan đến Hợp đồng trừ trường hợp được chấp thuận bằng văn bản của Bên kia hoặc theo yêu cầu của Cơ quan quản lý Nhà nước có thẩm quyền.</w:t>
       </w:r>
     </w:p>
@@ -8463,7 +9539,146 @@
       </w:rPr>
     </w:lvl>
   </w:abstractNum>
-  <w:abstractNum w:abstractNumId="4" w15:restartNumberingAfterBreak="1">
+  <w:abstractNum w:abstractNumId="4" w15:restartNumberingAfterBreak="0">
+    <w:nsid w:val="22E909B6"/>
+    <w:multiLevelType w:val="multilevel"/>
+    <w:tmpl w:val="8CECBAF6"/>
+    <w:lvl w:ilvl="0">
+      <w:numFmt w:val="bullet"/>
+      <w:lvlText w:val="-"/>
+      <w:lvlJc w:val="left"/>
+      <w:pPr>
+        <w:tabs>
+          <w:tab w:val="num" w:pos="0"/>
+        </w:tabs>
+        <w:ind w:left="4046" w:hanging="360"/>
+      </w:pPr>
+      <w:rPr>
+        <w:rFonts w:ascii="Times New Roman" w:hAnsi="Times New Roman" w:cs="Times New Roman" w:hint="default"/>
+      </w:rPr>
+    </w:lvl>
+    <w:lvl w:ilvl="1">
+      <w:start w:val="1"/>
+      <w:numFmt w:val="bullet"/>
+      <w:lvlText w:val="o"/>
+      <w:lvlJc w:val="left"/>
+      <w:pPr>
+        <w:tabs>
+          <w:tab w:val="num" w:pos="0"/>
+        </w:tabs>
+        <w:ind w:left="1440" w:hanging="360"/>
+      </w:pPr>
+      <w:rPr>
+        <w:rFonts w:ascii="Courier New" w:hAnsi="Courier New" w:cs="Courier New" w:hint="default"/>
+      </w:rPr>
+    </w:lvl>
+    <w:lvl w:ilvl="2">
+      <w:start w:val="1"/>
+      <w:numFmt w:val="bullet"/>
+      <w:lvlText w:val=""/>
+      <w:lvlJc w:val="left"/>
+      <w:pPr>
+        <w:tabs>
+          <w:tab w:val="num" w:pos="0"/>
+        </w:tabs>
+        <w:ind w:left="2160" w:hanging="360"/>
+      </w:pPr>
+      <w:rPr>
+        <w:rFonts w:ascii="Wingdings" w:hAnsi="Wingdings" w:cs="Wingdings" w:hint="default"/>
+      </w:rPr>
+    </w:lvl>
+    <w:lvl w:ilvl="3">
+      <w:start w:val="1"/>
+      <w:numFmt w:val="bullet"/>
+      <w:lvlText w:val=""/>
+      <w:lvlJc w:val="left"/>
+      <w:pPr>
+        <w:tabs>
+          <w:tab w:val="num" w:pos="0"/>
+        </w:tabs>
+        <w:ind w:left="2880" w:hanging="360"/>
+      </w:pPr>
+      <w:rPr>
+        <w:rFonts w:ascii="Symbol" w:hAnsi="Symbol" w:cs="Symbol" w:hint="default"/>
+      </w:rPr>
+    </w:lvl>
+    <w:lvl w:ilvl="4">
+      <w:start w:val="1"/>
+      <w:numFmt w:val="bullet"/>
+      <w:lvlText w:val="o"/>
+      <w:lvlJc w:val="left"/>
+      <w:pPr>
+        <w:tabs>
+          <w:tab w:val="num" w:pos="0"/>
+        </w:tabs>
+        <w:ind w:left="3600" w:hanging="360"/>
+      </w:pPr>
+      <w:rPr>
+        <w:rFonts w:ascii="Courier New" w:hAnsi="Courier New" w:cs="Courier New" w:hint="default"/>
+      </w:rPr>
+    </w:lvl>
+    <w:lvl w:ilvl="5">
+      <w:start w:val="1"/>
+      <w:numFmt w:val="bullet"/>
+      <w:lvlText w:val=""/>
+      <w:lvlJc w:val="left"/>
+      <w:pPr>
+        <w:tabs>
+          <w:tab w:val="num" w:pos="0"/>
+        </w:tabs>
+        <w:ind w:left="4320" w:hanging="360"/>
+      </w:pPr>
+      <w:rPr>
+        <w:rFonts w:ascii="Wingdings" w:hAnsi="Wingdings" w:cs="Wingdings" w:hint="default"/>
+      </w:rPr>
+    </w:lvl>
+    <w:lvl w:ilvl="6">
+      <w:start w:val="1"/>
+      <w:numFmt w:val="bullet"/>
+      <w:lvlText w:val=""/>
+      <w:lvlJc w:val="left"/>
+      <w:pPr>
+        <w:tabs>
+          <w:tab w:val="num" w:pos="0"/>
+        </w:tabs>
+        <w:ind w:left="5040" w:hanging="360"/>
+      </w:pPr>
+      <w:rPr>
+        <w:rFonts w:ascii="Symbol" w:hAnsi="Symbol" w:cs="Symbol" w:hint="default"/>
+      </w:rPr>
+    </w:lvl>
+    <w:lvl w:ilvl="7">
+      <w:start w:val="1"/>
+      <w:numFmt w:val="bullet"/>
+      <w:lvlText w:val="o"/>
+      <w:lvlJc w:val="left"/>
+      <w:pPr>
+        <w:tabs>
+          <w:tab w:val="num" w:pos="0"/>
+        </w:tabs>
+        <w:ind w:left="5760" w:hanging="360"/>
+      </w:pPr>
+      <w:rPr>
+        <w:rFonts w:ascii="Courier New" w:hAnsi="Courier New" w:cs="Courier New" w:hint="default"/>
+      </w:rPr>
+    </w:lvl>
+    <w:lvl w:ilvl="8">
+      <w:start w:val="1"/>
+      <w:numFmt w:val="bullet"/>
+      <w:lvlText w:val=""/>
+      <w:lvlJc w:val="left"/>
+      <w:pPr>
+        <w:tabs>
+          <w:tab w:val="num" w:pos="0"/>
+        </w:tabs>
+        <w:ind w:left="6480" w:hanging="360"/>
+      </w:pPr>
+      <w:rPr>
+        <w:rFonts w:ascii="Wingdings" w:hAnsi="Wingdings" w:cs="Wingdings" w:hint="default"/>
+      </w:rPr>
+    </w:lvl>
+  </w:abstractNum>
+  <w:abstractNum w:abstractNumId="5" w15:restartNumberingAfterBreak="1">
     <w:nsid w:val="23047AAD"/>
     <w:multiLevelType w:val="hybridMultilevel"/>
     <w:tmpl w:val="FE2C9350"/>
@@ -8575,7 +9790,7 @@
       </w:rPr>
     </w:lvl>
   </w:abstractNum>
-  <w:abstractNum w:abstractNumId="5" w15:restartNumberingAfterBreak="0">
+  <w:abstractNum w:abstractNumId="6" w15:restartNumberingAfterBreak="0">
     <w:nsid w:val="279C4759"/>
     <w:multiLevelType w:val="hybridMultilevel"/>
     <w:tmpl w:val="3DE27F6E"/>
@@ -8689,7 +9904,7 @@
       </w:rPr>
     </w:lvl>
   </w:abstractNum>
-  <w:abstractNum w:abstractNumId="6" w15:restartNumberingAfterBreak="1">
+  <w:abstractNum w:abstractNumId="7" w15:restartNumberingAfterBreak="1">
     <w:nsid w:val="2A831F02"/>
     <w:multiLevelType w:val="hybridMultilevel"/>
     <w:tmpl w:val="A07A0446"/>
@@ -8801,7 +10016,7 @@
       </w:rPr>
     </w:lvl>
   </w:abstractNum>
-  <w:abstractNum w:abstractNumId="7" w15:restartNumberingAfterBreak="0">
+  <w:abstractNum w:abstractNumId="8" w15:restartNumberingAfterBreak="0">
     <w:nsid w:val="2AB51769"/>
     <w:multiLevelType w:val="hybridMultilevel"/>
     <w:tmpl w:val="953EEF16"/>
@@ -8917,7 +10132,147 @@
       </w:rPr>
     </w:lvl>
   </w:abstractNum>
-  <w:abstractNum w:abstractNumId="8" w15:restartNumberingAfterBreak="0">
+  <w:abstractNum w:abstractNumId="9" w15:restartNumberingAfterBreak="1">
+    <w:nsid w:val="2F9F2A44"/>
+    <w:multiLevelType w:val="hybridMultilevel"/>
+    <w:tmpl w:val="79DA2962"/>
+    <w:lvl w:ilvl="0" w:tplc="2AAEAC44">
+      <w:start w:val="1"/>
+      <w:numFmt w:val="bullet"/>
+      <w:lvlText w:val="-"/>
+      <w:lvlJc w:val="left"/>
+      <w:pPr>
+        <w:tabs>
+          <w:tab w:val="num" w:pos="4570"/>
+        </w:tabs>
+        <w:ind w:left="4570" w:hanging="600"/>
+      </w:pPr>
+      <w:rPr>
+        <w:rFonts w:ascii="Times New Roman" w:eastAsia="Times New Roman" w:hAnsi="Times New Roman" w:hint="default"/>
+      </w:rPr>
+    </w:lvl>
+    <w:lvl w:ilvl="1" w:tplc="04090003">
+      <w:start w:val="1"/>
+      <w:numFmt w:val="bullet"/>
+      <w:lvlText w:val="o"/>
+      <w:lvlJc w:val="left"/>
+      <w:pPr>
+        <w:tabs>
+          <w:tab w:val="num" w:pos="30"/>
+        </w:tabs>
+        <w:ind w:left="30" w:hanging="360"/>
+      </w:pPr>
+      <w:rPr>
+        <w:rFonts w:ascii="Courier New" w:hAnsi="Courier New" w:cs="Courier New" w:hint="default"/>
+      </w:rPr>
+    </w:lvl>
+    <w:lvl w:ilvl="2" w:tplc="04090005" w:tentative="1">
+      <w:start w:val="1"/>
+      <w:numFmt w:val="bullet"/>
+      <w:lvlText w:val=""/>
+      <w:lvlJc w:val="left"/>
+      <w:pPr>
+        <w:tabs>
+          <w:tab w:val="num" w:pos="750"/>
+        </w:tabs>
+        <w:ind w:left="750" w:hanging="360"/>
+      </w:pPr>
+      <w:rPr>
+        <w:rFonts w:ascii="Wingdings" w:hAnsi="Wingdings" w:hint="default"/>
+      </w:rPr>
+    </w:lvl>
+    <w:lvl w:ilvl="3" w:tplc="04090001" w:tentative="1">
+      <w:start w:val="1"/>
+      <w:numFmt w:val="bullet"/>
+      <w:lvlText w:val=""/>
+      <w:lvlJc w:val="left"/>
+      <w:pPr>
+        <w:tabs>
+          <w:tab w:val="num" w:pos="1470"/>
+        </w:tabs>
+        <w:ind w:left="1470" w:hanging="360"/>
+      </w:pPr>
+      <w:rPr>
+        <w:rFonts w:ascii="Symbol" w:hAnsi="Symbol" w:hint="default"/>
+      </w:rPr>
+    </w:lvl>
+    <w:lvl w:ilvl="4" w:tplc="04090003" w:tentative="1">
+      <w:start w:val="1"/>
+      <w:numFmt w:val="bullet"/>
+      <w:lvlText w:val="o"/>
+      <w:lvlJc w:val="left"/>
+      <w:pPr>
+        <w:tabs>
+          <w:tab w:val="num" w:pos="2190"/>
+        </w:tabs>
+        <w:ind w:left="2190" w:hanging="360"/>
+      </w:pPr>
+      <w:rPr>
+        <w:rFonts w:ascii="Courier New" w:hAnsi="Courier New" w:cs="Courier New" w:hint="default"/>
+      </w:rPr>
+    </w:lvl>
+    <w:lvl w:ilvl="5" w:tplc="04090005" w:tentative="1">
+      <w:start w:val="1"/>
+      <w:numFmt w:val="bullet"/>
+      <w:lvlText w:val=""/>
+      <w:lvlJc w:val="left"/>
+      <w:pPr>
+        <w:tabs>
+          <w:tab w:val="num" w:pos="2910"/>
+        </w:tabs>
+        <w:ind w:left="2910" w:hanging="360"/>
+      </w:pPr>
+      <w:rPr>
+        <w:rFonts w:ascii="Wingdings" w:hAnsi="Wingdings" w:hint="default"/>
+      </w:rPr>
+    </w:lvl>
+    <w:lvl w:ilvl="6" w:tplc="04090001" w:tentative="1">
+      <w:start w:val="1"/>
+      <w:numFmt w:val="bullet"/>
+      <w:lvlText w:val=""/>
+      <w:lvlJc w:val="left"/>
+      <w:pPr>
+        <w:tabs>
+          <w:tab w:val="num" w:pos="3630"/>
+        </w:tabs>
+        <w:ind w:left="3630" w:hanging="360"/>
+      </w:pPr>
+      <w:rPr>
+        <w:rFonts w:ascii="Symbol" w:hAnsi="Symbol" w:hint="default"/>
+      </w:rPr>
+    </w:lvl>
+    <w:lvl w:ilvl="7" w:tplc="04090003" w:tentative="1">
+      <w:start w:val="1"/>
+      <w:numFmt w:val="bullet"/>
+      <w:lvlText w:val="o"/>
+      <w:lvlJc w:val="left"/>
+      <w:pPr>
+        <w:tabs>
+          <w:tab w:val="num" w:pos="4350"/>
+        </w:tabs>
+        <w:ind w:left="4350" w:hanging="360"/>
+      </w:pPr>
+      <w:rPr>
+        <w:rFonts w:ascii="Courier New" w:hAnsi="Courier New" w:cs="Courier New" w:hint="default"/>
+      </w:rPr>
+    </w:lvl>
+    <w:lvl w:ilvl="8" w:tplc="04090005" w:tentative="1">
+      <w:start w:val="1"/>
+      <w:numFmt w:val="bullet"/>
+      <w:lvlText w:val=""/>
+      <w:lvlJc w:val="left"/>
+      <w:pPr>
+        <w:tabs>
+          <w:tab w:val="num" w:pos="5070"/>
+        </w:tabs>
+        <w:ind w:left="5070" w:hanging="360"/>
+      </w:pPr>
+      <w:rPr>
+        <w:rFonts w:ascii="Wingdings" w:hAnsi="Wingdings" w:hint="default"/>
+      </w:rPr>
+    </w:lvl>
+  </w:abstractNum>
+  <w:abstractNum w:abstractNumId="10" w15:restartNumberingAfterBreak="0">
     <w:nsid w:val="32BC1EAD"/>
     <w:multiLevelType w:val="hybridMultilevel"/>
     <w:tmpl w:val="995871E4"/>
@@ -9029,7 +10384,7 @@
       </w:rPr>
     </w:lvl>
   </w:abstractNum>
-  <w:abstractNum w:abstractNumId="9" w15:restartNumberingAfterBreak="0">
+  <w:abstractNum w:abstractNumId="11" w15:restartNumberingAfterBreak="0">
     <w:nsid w:val="33BD0477"/>
     <w:multiLevelType w:val="hybridMultilevel"/>
     <w:tmpl w:val="4EAEC146"/>
@@ -9120,7 +10475,7 @@
       </w:pPr>
     </w:lvl>
   </w:abstractNum>
-  <w:abstractNum w:abstractNumId="10" w15:restartNumberingAfterBreak="0">
+  <w:abstractNum w:abstractNumId="12" w15:restartNumberingAfterBreak="0">
     <w:nsid w:val="34D45936"/>
     <w:multiLevelType w:val="hybridMultilevel"/>
     <w:tmpl w:val="E84AF87A"/>
@@ -9232,7 +10587,7 @@
       </w:rPr>
     </w:lvl>
   </w:abstractNum>
-  <w:abstractNum w:abstractNumId="11" w15:restartNumberingAfterBreak="1">
+  <w:abstractNum w:abstractNumId="13" w15:restartNumberingAfterBreak="1">
     <w:nsid w:val="3ABC7C3F"/>
     <w:multiLevelType w:val="hybridMultilevel"/>
     <w:tmpl w:val="3E6C4138"/>
@@ -9345,7 +10700,7 @@
       </w:rPr>
     </w:lvl>
   </w:abstractNum>
-  <w:abstractNum w:abstractNumId="12" w15:restartNumberingAfterBreak="1">
+  <w:abstractNum w:abstractNumId="14" w15:restartNumberingAfterBreak="1">
     <w:nsid w:val="4497278A"/>
     <w:multiLevelType w:val="hybridMultilevel"/>
     <w:tmpl w:val="4894CB04"/>
@@ -9458,7 +10813,7 @@
       </w:rPr>
     </w:lvl>
   </w:abstractNum>
-  <w:abstractNum w:abstractNumId="13" w15:restartNumberingAfterBreak="1">
+  <w:abstractNum w:abstractNumId="15" w15:restartNumberingAfterBreak="1">
     <w:nsid w:val="46EB5FCF"/>
     <w:multiLevelType w:val="hybridMultilevel"/>
     <w:tmpl w:val="8EF49AB0"/>
@@ -9570,7 +10925,7 @@
       </w:rPr>
     </w:lvl>
   </w:abstractNum>
-  <w:abstractNum w:abstractNumId="14" w15:restartNumberingAfterBreak="0">
+  <w:abstractNum w:abstractNumId="16" w15:restartNumberingAfterBreak="0">
     <w:nsid w:val="48744155"/>
     <w:multiLevelType w:val="hybridMultilevel"/>
     <w:tmpl w:val="CCDA47EE"/>
@@ -9659,7 +11014,7 @@
       </w:pPr>
     </w:lvl>
   </w:abstractNum>
-  <w:abstractNum w:abstractNumId="15" w15:restartNumberingAfterBreak="0">
+  <w:abstractNum w:abstractNumId="17" w15:restartNumberingAfterBreak="0">
     <w:nsid w:val="4D550C7E"/>
     <w:multiLevelType w:val="hybridMultilevel"/>
     <w:tmpl w:val="F5ECE93E"/>
@@ -9771,7 +11126,7 @@
       </w:rPr>
     </w:lvl>
   </w:abstractNum>
-  <w:abstractNum w:abstractNumId="16" w15:restartNumberingAfterBreak="0">
+  <w:abstractNum w:abstractNumId="18" w15:restartNumberingAfterBreak="0">
     <w:nsid w:val="54655F72"/>
     <w:multiLevelType w:val="hybridMultilevel"/>
     <w:tmpl w:val="E8940FB2"/>
@@ -9860,7 +11215,7 @@
       </w:pPr>
     </w:lvl>
   </w:abstractNum>
-  <w:abstractNum w:abstractNumId="17" w15:restartNumberingAfterBreak="1">
+  <w:abstractNum w:abstractNumId="19" w15:restartNumberingAfterBreak="1">
     <w:nsid w:val="552E0C18"/>
     <w:multiLevelType w:val="hybridMultilevel"/>
     <w:tmpl w:val="41387210"/>
@@ -9972,7 +11327,7 @@
       </w:rPr>
     </w:lvl>
   </w:abstractNum>
-  <w:abstractNum w:abstractNumId="18" w15:restartNumberingAfterBreak="0">
+  <w:abstractNum w:abstractNumId="20" w15:restartNumberingAfterBreak="0">
     <w:nsid w:val="583C3042"/>
     <w:multiLevelType w:val="hybridMultilevel"/>
     <w:tmpl w:val="2E90BF94"/>
@@ -10084,7 +11439,7 @@
       </w:rPr>
     </w:lvl>
   </w:abstractNum>
-  <w:abstractNum w:abstractNumId="19" w15:restartNumberingAfterBreak="0">
+  <w:abstractNum w:abstractNumId="21" w15:restartNumberingAfterBreak="0">
     <w:nsid w:val="5A5A0438"/>
     <w:multiLevelType w:val="hybridMultilevel"/>
     <w:tmpl w:val="1374BBDE"/>
@@ -10173,7 +11528,7 @@
       </w:pPr>
     </w:lvl>
   </w:abstractNum>
-  <w:abstractNum w:abstractNumId="20" w15:restartNumberingAfterBreak="1">
+  <w:abstractNum w:abstractNumId="22" w15:restartNumberingAfterBreak="1">
     <w:nsid w:val="5EEF4AC5"/>
     <w:multiLevelType w:val="hybridMultilevel"/>
     <w:tmpl w:val="C3EE2296"/>
@@ -10283,7 +11638,7 @@
       </w:rPr>
     </w:lvl>
   </w:abstractNum>
-  <w:abstractNum w:abstractNumId="21" w15:restartNumberingAfterBreak="0">
+  <w:abstractNum w:abstractNumId="23" w15:restartNumberingAfterBreak="0">
     <w:nsid w:val="5F2B3DE3"/>
     <w:multiLevelType w:val="hybridMultilevel"/>
     <w:tmpl w:val="9238102A"/>
@@ -10372,7 +11727,7 @@
       </w:pPr>
     </w:lvl>
   </w:abstractNum>
-  <w:abstractNum w:abstractNumId="22" w15:restartNumberingAfterBreak="0">
+  <w:abstractNum w:abstractNumId="24" w15:restartNumberingAfterBreak="0">
     <w:nsid w:val="62DD7673"/>
     <w:multiLevelType w:val="hybridMultilevel"/>
     <w:tmpl w:val="6A54B67E"/>
@@ -10461,7 +11816,7 @@
       </w:pPr>
     </w:lvl>
   </w:abstractNum>
-  <w:abstractNum w:abstractNumId="23" w15:restartNumberingAfterBreak="0">
+  <w:abstractNum w:abstractNumId="25" w15:restartNumberingAfterBreak="0">
     <w:nsid w:val="6C986267"/>
     <w:multiLevelType w:val="hybridMultilevel"/>
     <w:tmpl w:val="EB1083BC"/>
@@ -10550,7 +11905,7 @@
       </w:pPr>
     </w:lvl>
   </w:abstractNum>
-  <w:abstractNum w:abstractNumId="24" w15:restartNumberingAfterBreak="0">
+  <w:abstractNum w:abstractNumId="26" w15:restartNumberingAfterBreak="0">
     <w:nsid w:val="757D0774"/>
     <w:multiLevelType w:val="hybridMultilevel"/>
     <w:tmpl w:val="8DAA23D6"/>
@@ -10641,7 +11996,7 @@
       </w:pPr>
     </w:lvl>
   </w:abstractNum>
-  <w:abstractNum w:abstractNumId="25" w15:restartNumberingAfterBreak="1">
+  <w:abstractNum w:abstractNumId="27" w15:restartNumberingAfterBreak="1">
     <w:nsid w:val="75A9250A"/>
     <w:multiLevelType w:val="hybridMultilevel"/>
     <w:tmpl w:val="4BEE64A0"/>
@@ -10753,7 +12108,7 @@
       </w:rPr>
     </w:lvl>
   </w:abstractNum>
-  <w:abstractNum w:abstractNumId="26" w15:restartNumberingAfterBreak="0">
+  <w:abstractNum w:abstractNumId="28" w15:restartNumberingAfterBreak="0">
     <w:nsid w:val="7CEE7CC2"/>
     <w:multiLevelType w:val="hybridMultilevel"/>
     <w:tmpl w:val="DBA2637E"/>
@@ -10840,37 +12195,37 @@
     </w:lvl>
   </w:abstractNum>
   <w:num w:numId="1">
+    <w:abstractNumId w:val="15"/>
+  </w:num>
+  <w:num w:numId="2">
     <w:abstractNumId w:val="13"/>
   </w:num>
-  <w:num w:numId="2">
-    <w:abstractNumId w:val="11"/>
-  </w:num>
   <w:num w:numId="3">
-    <w:abstractNumId w:val="17"/>
+    <w:abstractNumId w:val="19"/>
   </w:num>
   <w:num w:numId="4">
-    <w:abstractNumId w:val="20"/>
+    <w:abstractNumId w:val="22"/>
   </w:num>
   <w:num w:numId="5">
-    <w:abstractNumId w:val="12"/>
+    <w:abstractNumId w:val="14"/>
   </w:num>
   <w:num w:numId="6">
-    <w:abstractNumId w:val="25"/>
+    <w:abstractNumId w:val="27"/>
   </w:num>
   <w:num w:numId="7">
     <w:abstractNumId w:val="0"/>
   </w:num>
   <w:num w:numId="8">
-    <w:abstractNumId w:val="6"/>
+    <w:abstractNumId w:val="7"/>
   </w:num>
   <w:num w:numId="9">
-    <w:abstractNumId w:val="4"/>
+    <w:abstractNumId w:val="5"/>
   </w:num>
   <w:num w:numId="10">
-    <w:abstractNumId w:val="26"/>
+    <w:abstractNumId w:val="28"/>
   </w:num>
   <w:num w:numId="11">
-    <w:abstractNumId w:val="22"/>
+    <w:abstractNumId w:val="24"/>
   </w:num>
   <w:num w:numId="12">
     <w:abstractNumId w:val="1"/>
@@ -10879,46 +12234,52 @@
     <w:abstractNumId w:val="3"/>
   </w:num>
   <w:num w:numId="14">
-    <w:abstractNumId w:val="7"/>
+    <w:abstractNumId w:val="8"/>
   </w:num>
   <w:num w:numId="15">
-    <w:abstractNumId w:val="8"/>
+    <w:abstractNumId w:val="10"/>
   </w:num>
   <w:num w:numId="16">
-    <w:abstractNumId w:val="10"/>
+    <w:abstractNumId w:val="12"/>
   </w:num>
   <w:num w:numId="17">
-    <w:abstractNumId w:val="5"/>
+    <w:abstractNumId w:val="6"/>
   </w:num>
   <w:num w:numId="18">
+    <w:abstractNumId w:val="18"/>
+  </w:num>
+  <w:num w:numId="19">
+    <w:abstractNumId w:val="21"/>
+  </w:num>
+  <w:num w:numId="20">
+    <w:abstractNumId w:val="26"/>
+  </w:num>
+  <w:num w:numId="21">
     <w:abstractNumId w:val="16"/>
   </w:num>
-  <w:num w:numId="19">
-    <w:abstractNumId w:val="19"/>
+  <w:num w:numId="22">
+    <w:abstractNumId w:val="25"/>
   </w:num>
-  <w:num w:numId="20">
-    <w:abstractNumId w:val="24"/>
-  </w:num>
-  <w:num w:numId="21">
-    <w:abstractNumId w:val="14"/>
-  </w:num>
-  <w:num w:numId="22">
+  <w:num w:numId="23">
     <w:abstractNumId w:val="23"/>
   </w:num>
-  <w:num w:numId="23">
-    <w:abstractNumId w:val="21"/>
-  </w:num>
   <w:num w:numId="24">
-    <w:abstractNumId w:val="9"/>
+    <w:abstractNumId w:val="11"/>
   </w:num>
   <w:num w:numId="25">
-    <w:abstractNumId w:val="15"/>
+    <w:abstractNumId w:val="17"/>
   </w:num>
   <w:num w:numId="26">
-    <w:abstractNumId w:val="18"/>
+    <w:abstractNumId w:val="20"/>
   </w:num>
   <w:num w:numId="27">
     <w:abstractNumId w:val="2"/>
+  </w:num>
+  <w:num w:numId="28">
+    <w:abstractNumId w:val="9"/>
+  </w:num>
+  <w:num w:numId="29">
+    <w:abstractNumId w:val="4"/>
   </w:num>
 </w:numbering>
 </file>
@@ -11009,7 +12370,7 @@
     <w:lsdException w:name="Closing" w:semiHidden="1" w:unhideWhenUsed="1"/>
     <w:lsdException w:name="Signature" w:semiHidden="1" w:unhideWhenUsed="1"/>
     <w:lsdException w:name="Default Paragraph Font" w:semiHidden="1" w:uiPriority="1" w:unhideWhenUsed="1"/>
-    <w:lsdException w:name="Body Text" w:semiHidden="1" w:unhideWhenUsed="1"/>
+    <w:lsdException w:name="Body Text" w:semiHidden="1" w:uiPriority="0" w:unhideWhenUsed="1"/>
     <w:lsdException w:name="Body Text Indent" w:semiHidden="1" w:unhideWhenUsed="1"/>
     <w:lsdException w:name="List Continue" w:semiHidden="1" w:unhideWhenUsed="1"/>
     <w:lsdException w:name="List Continue 2" w:semiHidden="1" w:unhideWhenUsed="1"/>
@@ -11026,7 +12387,7 @@
     <w:lsdException w:name="Body Text 2" w:semiHidden="1" w:unhideWhenUsed="1"/>
     <w:lsdException w:name="Body Text 3" w:semiHidden="1" w:unhideWhenUsed="1"/>
     <w:lsdException w:name="Body Text Indent 2" w:semiHidden="1" w:unhideWhenUsed="1"/>
-    <w:lsdException w:name="Body Text Indent 3" w:semiHidden="1" w:unhideWhenUsed="1"/>
+    <w:lsdException w:name="Body Text Indent 3" w:semiHidden="1" w:uiPriority="0" w:unhideWhenUsed="1"/>
     <w:lsdException w:name="Block Text" w:semiHidden="1" w:unhideWhenUsed="1"/>
     <w:lsdException w:name="Hyperlink" w:semiHidden="1" w:unhideWhenUsed="1"/>
     <w:lsdException w:name="FollowedHyperlink" w:semiHidden="1" w:unhideWhenUsed="1"/>
@@ -11931,6 +13292,62 @@
       <w:bCs/>
     </w:rPr>
   </w:style>
+  <w:style w:type="paragraph" w:styleId="BodyText">
+    <w:name w:val="Body Text"/>
+    <w:basedOn w:val="Normal"/>
+    <w:link w:val="BodyTextChar"/>
+    <w:rsid w:val="008865A9"/>
+    <w:pPr>
+      <w:jc w:val="both"/>
+    </w:pPr>
+  </w:style>
+  <w:style w:type="character" w:customStyle="1" w:styleId="BodyTextChar">
+    <w:name w:val="Body Text Char"/>
+    <w:basedOn w:val="DefaultParagraphFont"/>
+    <w:link w:val="BodyText"/>
+    <w:rsid w:val="008865A9"/>
+    <w:rPr>
+      <w:rFonts w:ascii="VNI-Times" w:eastAsia="Times New Roman" w:hAnsi="VNI-Times" w:cs="Times New Roman"/>
+      <w:kern w:val="0"/>
+      <w:sz w:val="26"/>
+      <w:szCs w:val="20"/>
+      <w:lang w:val="en-US"/>
+      <w14:ligatures w14:val="none"/>
+    </w:rPr>
+  </w:style>
+  <w:style w:type="paragraph" w:styleId="BodyTextIndent3">
+    <w:name w:val="Body Text Indent 3"/>
+    <w:basedOn w:val="Normal"/>
+    <w:link w:val="BodyTextIndent3Char"/>
+    <w:rsid w:val="008865A9"/>
+    <w:pPr>
+      <w:tabs>
+        <w:tab w:val="left" w:pos="180"/>
+      </w:tabs>
+      <w:autoSpaceDE w:val="0"/>
+      <w:autoSpaceDN w:val="0"/>
+      <w:ind w:left="180"/>
+      <w:jc w:val="both"/>
+    </w:pPr>
+    <w:rPr>
+      <w:sz w:val="24"/>
+      <w:szCs w:val="24"/>
+    </w:rPr>
+  </w:style>
+  <w:style w:type="character" w:customStyle="1" w:styleId="BodyTextIndent3Char">
+    <w:name w:val="Body Text Indent 3 Char"/>
+    <w:basedOn w:val="DefaultParagraphFont"/>
+    <w:link w:val="BodyTextIndent3"/>
+    <w:rsid w:val="008865A9"/>
+    <w:rPr>
+      <w:rFonts w:ascii="VNI-Times" w:eastAsia="Times New Roman" w:hAnsi="VNI-Times" w:cs="Times New Roman"/>
+      <w:kern w:val="0"/>
+      <w:sz w:val="24"/>
+      <w:szCs w:val="24"/>
+      <w:lang w:val="en-US"/>
+      <w14:ligatures w14:val="none"/>
+    </w:rPr>
+  </w:style>
 </w:styles>
 </file>
 

</xml_diff>

<commit_message>
fix(export): map dynamic coordinates, heights, offset, payment cycle, and detail address old/new to BBLV template
</commit_message>
<xml_diff>
--- a/tvt3_v2/public/templates/HOP_DONG_MOI_MAT_BANG.docx
+++ b/tvt3_v2/public/templates/HOP_DONG_MOI_MAT_BANG.docx
@@ -1279,42 +1279,7 @@
                 <w:rFonts w:ascii="Times New Roman" w:hAnsi="Times New Roman"/>
                 <w:szCs w:val="26"/>
               </w:rPr>
-              <w:t>10</w:t>
-            </w:r>
-            <w:r>
-              <w:rPr>
-                <w:rFonts w:ascii="Times New Roman" w:hAnsi="Times New Roman"/>
-                <w:szCs w:val="26"/>
-              </w:rPr>
-              <w:t>7</w:t>
-            </w:r>
-            <w:r>
-              <w:rPr>
-                <w:rFonts w:ascii="Times New Roman" w:hAnsi="Times New Roman"/>
-                <w:szCs w:val="26"/>
-              </w:rPr>
-              <w:t>,</w:t>
-            </w:r>
-            <w:r>
-              <w:rPr>
-                <w:rFonts w:ascii="Times New Roman" w:hAnsi="Times New Roman"/>
-                <w:szCs w:val="26"/>
-              </w:rPr>
-              <w:t xml:space="preserve">24249 </w:t>
-            </w:r>
-            <w:r>
-              <w:rPr>
-                <w:rFonts w:ascii="Times New Roman" w:hAnsi="Times New Roman"/>
-                <w:szCs w:val="26"/>
-              </w:rPr>
-              <w:t>-</w:t>
-            </w:r>
-            <w:r>
-              <w:rPr>
-                <w:rFonts w:ascii="Times New Roman" w:hAnsi="Times New Roman"/>
-                <w:szCs w:val="26"/>
-              </w:rPr>
-              <w:t xml:space="preserve"> 11,80493</w:t>
+              <w:t>{{LONGITUDE_PLAN}} - {{LATITUDE_PLAN}}</w:t>
             </w:r>
           </w:p>
         </w:tc>
@@ -1339,15 +1304,7 @@
                 <w:noProof/>
                 <w:szCs w:val="26"/>
               </w:rPr>
-              <w:t>42</w:t>
-            </w:r>
-            <w:r>
-              <w:rPr>
-                <w:rFonts w:ascii="Times New Roman" w:hAnsi="Times New Roman"/>
-                <w:noProof/>
-                <w:szCs w:val="26"/>
-              </w:rPr>
-              <w:t>m</w:t>
+              <w:t>{{HEIGHT_PLAN}}</w:t>
             </w:r>
           </w:p>
         </w:tc>
@@ -1373,15 +1330,7 @@
                 <w:noProof/>
                 <w:szCs w:val="26"/>
               </w:rPr>
-              <w:t>268</w:t>
-            </w:r>
-            <w:r>
-              <w:rPr>
-                <w:rFonts w:ascii="Times New Roman" w:hAnsi="Times New Roman"/>
-                <w:noProof/>
-                <w:szCs w:val="26"/>
-              </w:rPr>
-              <w:t>m</w:t>
+              <w:t>{{OFFSET_DISTANCE}}</w:t>
             </w:r>
           </w:p>
         </w:tc>
@@ -1431,46 +1380,9 @@
             <w:r>
               <w:rPr>
                 <w:rFonts w:ascii="Times New Roman" w:hAnsi="Times New Roman"/>
-                <w:color w:val="000000" w:themeColor="text1"/>
-              </w:rPr>
-              <w:t>10</w:t>
-            </w:r>
-            <w:r>
-              <w:rPr>
-                <w:rFonts w:ascii="Times New Roman" w:hAnsi="Times New Roman"/>
-                <w:color w:val="000000" w:themeColor="text1"/>
-              </w:rPr>
-              <w:t xml:space="preserve">7,2446 </w:t>
-            </w:r>
-            <w:r>
-              <w:rPr>
-                <w:rFonts w:ascii="Times New Roman" w:hAnsi="Times New Roman"/>
-                <w:noProof/>
                 <w:szCs w:val="26"/>
               </w:rPr>
-              <w:t>-</w:t>
-            </w:r>
-            <w:r>
-              <w:rPr>
-                <w:rFonts w:ascii="Times New Roman" w:hAnsi="Times New Roman"/>
-                <w:noProof/>
-                <w:szCs w:val="26"/>
-              </w:rPr>
-              <w:t xml:space="preserve"> </w:t>
-            </w:r>
-            <w:r>
-              <w:rPr>
-                <w:rFonts w:ascii="Times New Roman" w:hAnsi="Times New Roman"/>
-                <w:color w:val="000000" w:themeColor="text1"/>
-              </w:rPr>
-              <w:t>11,</w:t>
-            </w:r>
-            <w:r>
-              <w:rPr>
-                <w:rFonts w:ascii="Times New Roman" w:hAnsi="Times New Roman"/>
-                <w:color w:val="000000" w:themeColor="text1"/>
-              </w:rPr>
-              <w:t>8061</w:t>
+              <w:t>{{LONGITUDE_SURVEY}} - {{LATITUDE_SURVEY}}</w:t>
             </w:r>
           </w:p>
         </w:tc>
@@ -1495,15 +1407,7 @@
                 <w:noProof/>
                 <w:szCs w:val="26"/>
               </w:rPr>
-              <w:t>36</w:t>
-            </w:r>
-            <w:r>
-              <w:rPr>
-                <w:rFonts w:ascii="Times New Roman" w:hAnsi="Times New Roman"/>
-                <w:noProof/>
-                <w:szCs w:val="26"/>
-              </w:rPr>
-              <w:t>m</w:t>
+              <w:t>{{HEIGHT_SURVEY}}</w:t>
             </w:r>
           </w:p>
         </w:tc>
@@ -2683,22 +2587,7 @@
           <w:rFonts w:ascii="Times New Roman" w:hAnsi="Times New Roman"/>
           <w:szCs w:val="26"/>
         </w:rPr>
-        <w:t>6</w:t>
-      </w:r>
-      <w:r>
-        <w:rPr>
-          <w:rFonts w:ascii="Times New Roman" w:hAnsi="Times New Roman"/>
-          <w:spacing w:val="-1"/>
-          <w:szCs w:val="26"/>
-        </w:rPr>
-        <w:t xml:space="preserve"> </w:t>
-      </w:r>
-      <w:r>
-        <w:rPr>
-          <w:rFonts w:ascii="Times New Roman" w:hAnsi="Times New Roman"/>
-          <w:szCs w:val="26"/>
-        </w:rPr>
-        <w:t>tháng/lần</w:t>
+        <w:t>{{PAYMENT_CYCLE}}/lần</w:t>
       </w:r>
       <w:r>
         <w:rPr>
@@ -6306,7 +6195,7 @@
           <w:szCs w:val="26"/>
           <w:lang w:val="vi-VN"/>
         </w:rPr>
-        <w:t>06 tháng/ lần</w:t>
+        <w:t>{{PAYMENT_CYCLE}}/lần</w:t>
       </w:r>
       <w:r>
         <w:rPr>

</xml_diff>

<commit_message>
fix(export): apply PAYMENT_CYCLE dynamic tag to new uploaded template file
</commit_message>
<xml_diff>
--- a/tvt3_v2/public/templates/HOP_DONG_MOI_MAT_BANG.docx
+++ b/tvt3_v2/public/templates/HOP_DONG_MOI_MAT_BANG.docx
@@ -179,7 +179,7 @@
                     </wp:anchor>
                   </w:drawing>
                 </mc:Choice>
-                <mc:Fallback xmlns:w16sdtfl="http://schemas.microsoft.com/office/word/2024/wordml/sdtformatlock" xmlns:w16sdtdh="http://schemas.microsoft.com/office/word/2020/wordml/sdtdatahash" xmlns:w16du="http://schemas.microsoft.com/office/word/2023/wordml/word16du" xmlns:w16="http://schemas.microsoft.com/office/word/2018/wordml" xmlns:w16cex="http://schemas.microsoft.com/office/word/2018/wordml/cex" xmlns:oel="http://schemas.microsoft.com/office/2019/extlst">
+                <mc:Fallback xmlns:oel="http://schemas.microsoft.com/office/2019/extlst" xmlns:w16cex="http://schemas.microsoft.com/office/word/2018/wordml/cex" xmlns:w16="http://schemas.microsoft.com/office/word/2018/wordml" xmlns:w16du="http://schemas.microsoft.com/office/word/2023/wordml/word16du" xmlns:w16sdtdh="http://schemas.microsoft.com/office/word/2020/wordml/sdtdatahash" xmlns:w16sdtfl="http://schemas.microsoft.com/office/word/2024/wordml/sdtformatlock">
                   <w:pict>
                     <v:line w14:anchorId="3A8FE28D" id="Straight Connector 2000649774" o:spid="_x0000_s1026" style="position:absolute;flip:x;z-index:251661312;visibility:visible;mso-wrap-style:square;mso-wrap-distance-left:9pt;mso-wrap-distance-top:0;mso-wrap-distance-right:9pt;mso-wrap-distance-bottom:0;mso-position-horizontal:absolute;mso-position-horizontal-relative:text;mso-position-vertical:absolute;mso-position-vertical-relative:text" from="51.4pt,3.8pt" to="174.3pt,3.8pt" o:gfxdata="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" strokecolor="black [3213]" strokeweight=".5pt">
                       <v:stroke joinstyle="miter"/>
@@ -271,7 +271,7 @@
                     </wp:anchor>
                   </w:drawing>
                 </mc:Choice>
-                <mc:Fallback xmlns:w16sdtfl="http://schemas.microsoft.com/office/word/2024/wordml/sdtformatlock" xmlns:w16sdtdh="http://schemas.microsoft.com/office/word/2020/wordml/sdtdatahash" xmlns:w16du="http://schemas.microsoft.com/office/word/2023/wordml/word16du" xmlns:w16="http://schemas.microsoft.com/office/word/2018/wordml" xmlns:w16cex="http://schemas.microsoft.com/office/word/2018/wordml/cex" xmlns:oel="http://schemas.microsoft.com/office/2019/extlst">
+                <mc:Fallback xmlns:oel="http://schemas.microsoft.com/office/2019/extlst" xmlns:w16cex="http://schemas.microsoft.com/office/word/2018/wordml/cex" xmlns:w16="http://schemas.microsoft.com/office/word/2018/wordml" xmlns:w16du="http://schemas.microsoft.com/office/word/2023/wordml/word16du" xmlns:w16sdtdh="http://schemas.microsoft.com/office/word/2020/wordml/sdtdatahash" xmlns:w16sdtfl="http://schemas.microsoft.com/office/word/2024/wordml/sdtformatlock">
                   <w:pict>
                     <v:line w14:anchorId="7B0B0E0A" id="Straight Connector 1463436238" o:spid="_x0000_s1026" style="position:absolute;flip:y;z-index:251660288;visibility:visible;mso-wrap-style:square;mso-width-percent:0;mso-height-percent:0;mso-wrap-distance-left:9pt;mso-wrap-distance-top:0;mso-wrap-distance-right:9pt;mso-wrap-distance-bottom:0;mso-position-horizontal:absolute;mso-position-horizontal-relative:text;mso-position-vertical:absolute;mso-position-vertical-relative:text;mso-width-percent:0;mso-height-percent:0;mso-width-relative:margin;mso-height-relative:margin" from="66.8pt,5.25pt" to="223.7pt,5.25pt" o:gfxdata="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" strokecolor="black [3213]" strokeweight=".5pt">
                       <v:stroke joinstyle="miter"/>
@@ -993,27 +993,6 @@
         </w:rPr>
         <w:t>{{ADDRESS_OLD}}</w:t>
       </w:r>
-      <w:proofErr w:type="gramStart"/>
-      <w:r>
-        <w:rPr>
-          <w:rFonts w:ascii="Times New Roman" w:hAnsi="Times New Roman"/>
-          <w:szCs w:val="28"/>
-          <w:lang w:val="da-DK"/>
-        </w:rPr>
-        <w:t/>
-      </w:r>
-      <w:r>
-        <w:rPr>
-          <w:rStyle w:val="Emphasis"/>
-          <w:rFonts w:ascii="Times New Roman" w:hAnsi="Times New Roman"/>
-          <w:i w:val="0"/>
-          <w:iCs w:val="0"/>
-          <w:szCs w:val="28"/>
-          <w:lang w:val="da-DK"/>
-        </w:rPr>
-        <w:t/>
-      </w:r>
-      <w:proofErr w:type="gramEnd"/>
       <w:r>
         <w:rPr>
           <w:rStyle w:val="Emphasis"/>
@@ -1382,7 +1361,15 @@
                 <w:rFonts w:ascii="Times New Roman" w:hAnsi="Times New Roman"/>
                 <w:szCs w:val="26"/>
               </w:rPr>
-              <w:t>{{LONGITUDE_SURVEY}} - {{LATITUDE_SURVEY}}</w:t>
+              <w:t xml:space="preserve">{{LONGITUDE_SURVEY}} - </w:t>
+            </w:r>
+            <w:r>
+              <w:rPr>
+                <w:rFonts w:ascii="Times New Roman" w:hAnsi="Times New Roman"/>
+                <w:szCs w:val="26"/>
+              </w:rPr>
+              <w:lastRenderedPageBreak/>
+              <w:t>{{LATITUDE_SURVEY}}</w:t>
             </w:r>
           </w:p>
         </w:tc>
@@ -1407,6 +1394,7 @@
                 <w:noProof/>
                 <w:szCs w:val="26"/>
               </w:rPr>
+              <w:lastRenderedPageBreak/>
               <w:t>{{HEIGHT_SURVEY}}</w:t>
             </w:r>
           </w:p>
@@ -1454,7 +1442,6 @@
           <w:szCs w:val="26"/>
           <w:lang w:val="vi-VN"/>
         </w:rPr>
-        <w:lastRenderedPageBreak/>
         <w:t xml:space="preserve">     </w:t>
       </w:r>
       <w:r>
@@ -1526,31 +1513,14 @@
           <w:szCs w:val="26"/>
           <w:lang w:val="vi-VN"/>
         </w:rPr>
-        <w:t xml:space="preserve"> {{NEW_PRICE}} đồng/tháng (bằng chữ: {{NEW_PRICE_TEXT}}</w:t>
-      </w:r>
-      <w:proofErr w:type="gramStart"/>
-      <w:r>
-        <w:rPr>
-          <w:rFonts w:ascii="Times New Roman" w:hAnsi="Times New Roman"/>
-          <w:szCs w:val="26"/>
-          <w:lang w:val="vi-VN"/>
-        </w:rPr>
-        <w:t>)</w:t>
-      </w:r>
-      <w:r>
-        <w:rPr>
-          <w:rFonts w:ascii="Times New Roman" w:hAnsi="Times New Roman"/>
-          <w:szCs w:val="26"/>
-        </w:rPr>
-        <w:t>với</w:t>
-      </w:r>
-      <w:proofErr w:type="gramEnd"/>
-      <w:r>
-        <w:rPr>
-          <w:rFonts w:ascii="Times New Roman" w:hAnsi="Times New Roman"/>
-          <w:szCs w:val="26"/>
-        </w:rPr>
-        <w:t xml:space="preserve"> đơn giá chi tiết theo các hạng mục như sau:  </w:t>
+        <w:t xml:space="preserve"> {{NEW_PRICE}} đồng/tháng (bằng chữ: {{NEW_PRICE_TEXT}})</w:t>
+      </w:r>
+      <w:r>
+        <w:rPr>
+          <w:rFonts w:ascii="Times New Roman" w:hAnsi="Times New Roman"/>
+          <w:szCs w:val="26"/>
+        </w:rPr>
+        <w:t xml:space="preserve">với đơn giá chi tiết theo các hạng mục như sau:  </w:t>
       </w:r>
     </w:p>
     <w:tbl>
@@ -2405,7 +2375,6 @@
         </w:rPr>
         <w:t xml:space="preserve"> </w:t>
       </w:r>
-      <w:proofErr w:type="gramStart"/>
       <w:r>
         <w:rPr>
           <w:rFonts w:ascii="Times New Roman" w:hAnsi="Times New Roman"/>
@@ -2426,15 +2395,7 @@
           <w:rFonts w:ascii="Times New Roman" w:hAnsi="Times New Roman"/>
           <w:szCs w:val="26"/>
         </w:rPr>
-        <w:t>31</w:t>
-      </w:r>
-      <w:proofErr w:type="gramEnd"/>
-      <w:r>
-        <w:rPr>
-          <w:rFonts w:ascii="Times New Roman" w:hAnsi="Times New Roman"/>
-          <w:szCs w:val="26"/>
-        </w:rPr>
-        <w:t>/12 của</w:t>
+        <w:t>31/12 của</w:t>
       </w:r>
       <w:r>
         <w:rPr>
@@ -2689,33 +2650,7 @@
           <w:sz w:val="26"/>
           <w:szCs w:val="26"/>
         </w:rPr>
-        <w:t xml:space="preserve">Kể từ thời điểm MobiFone hoàn thành lắp đặt, phát sóng trạm </w:t>
-      </w:r>
-      <w:proofErr w:type="gramStart"/>
-      <w:r>
-        <w:rPr>
-          <w:rFonts w:ascii="Times New Roman" w:hAnsi="Times New Roman"/>
-          <w:bCs/>
-          <w:iCs/>
-          <w:color w:val="000000" w:themeColor="text1"/>
-          <w:spacing w:val="-2"/>
-          <w:sz w:val="26"/>
-          <w:szCs w:val="26"/>
-        </w:rPr>
-        <w:t>( thể</w:t>
-      </w:r>
-      <w:proofErr w:type="gramEnd"/>
-      <w:r>
-        <w:rPr>
-          <w:rFonts w:ascii="Times New Roman" w:hAnsi="Times New Roman"/>
-          <w:bCs/>
-          <w:iCs/>
-          <w:color w:val="000000" w:themeColor="text1"/>
-          <w:spacing w:val="-2"/>
-          <w:sz w:val="26"/>
-          <w:szCs w:val="26"/>
-        </w:rPr>
-        <w:t xml:space="preserve"> hiện bằng biên bản phát sóng) nhưng không quá 60 ngày kể từ ngày hoàn thành lắp dựng xong cột anten.</w:t>
+        <w:t>Kể từ thời điểm MobiFone hoàn thành lắp đặt, phát sóng trạm ( thể hiện bằng biên bản phát sóng) nhưng không quá 60 ngày kể từ ngày hoàn thành lắp dựng xong cột anten.</w:t>
       </w:r>
     </w:p>
     <w:p>
@@ -3149,6 +3084,7 @@
                 <w:b/>
                 <w:szCs w:val="28"/>
               </w:rPr>
+              <w:lastRenderedPageBreak/>
               <w:t>Nguyễn Đức Long</w:t>
             </w:r>
           </w:p>
@@ -3348,7 +3284,7 @@
                     </wp:anchor>
                   </w:drawing>
                 </mc:Choice>
-                <mc:Fallback xmlns:w16sdtfl="http://schemas.microsoft.com/office/word/2024/wordml/sdtformatlock" xmlns:w16sdtdh="http://schemas.microsoft.com/office/word/2020/wordml/sdtdatahash" xmlns:w16du="http://schemas.microsoft.com/office/word/2023/wordml/word16du" xmlns:w16="http://schemas.microsoft.com/office/word/2018/wordml" xmlns:w16cex="http://schemas.microsoft.com/office/word/2018/wordml/cex" xmlns:oel="http://schemas.microsoft.com/office/2019/extlst">
+                <mc:Fallback xmlns:oel="http://schemas.microsoft.com/office/2019/extlst" xmlns:w16cex="http://schemas.microsoft.com/office/word/2018/wordml/cex" xmlns:w16="http://schemas.microsoft.com/office/word/2018/wordml" xmlns:w16du="http://schemas.microsoft.com/office/word/2023/wordml/word16du" xmlns:w16sdtdh="http://schemas.microsoft.com/office/word/2020/wordml/sdtdatahash" xmlns:w16sdtfl="http://schemas.microsoft.com/office/word/2024/wordml/sdtformatlock">
                   <w:pict>
                     <v:shape w14:anchorId="18EC2693" id="Straight Arrow Connector 4" o:spid="_x0000_s1026" type="#_x0000_t32" style="position:absolute;margin-left:61.15pt;margin-top:19.7pt;width:132pt;height:0;z-index:251664384;visibility:visible;mso-wrap-style:square;mso-width-percent:0;mso-height-percent:0;mso-wrap-distance-left:9pt;mso-wrap-distance-top:-6e-5mm;mso-wrap-distance-right:9pt;mso-wrap-distance-bottom:-6e-5mm;mso-position-horizontal:absolute;mso-position-horizontal-relative:text;mso-position-vertical:absolute;mso-position-vertical-relative:text;mso-width-percent:0;mso-height-percent:0;mso-width-relative:page;mso-height-relative:page" o:gfxdata="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"/>
                   </w:pict>
@@ -3453,7 +3389,7 @@
                     </wp:anchor>
                   </w:drawing>
                 </mc:Choice>
-                <mc:Fallback xmlns:w16sdtfl="http://schemas.microsoft.com/office/word/2024/wordml/sdtformatlock" xmlns:w16sdtdh="http://schemas.microsoft.com/office/word/2020/wordml/sdtdatahash" xmlns:w16du="http://schemas.microsoft.com/office/word/2023/wordml/word16du" xmlns:w16="http://schemas.microsoft.com/office/word/2018/wordml" xmlns:w16cex="http://schemas.microsoft.com/office/word/2018/wordml/cex" xmlns:oel="http://schemas.microsoft.com/office/2019/extlst">
+                <mc:Fallback xmlns:oel="http://schemas.microsoft.com/office/2019/extlst" xmlns:w16cex="http://schemas.microsoft.com/office/word/2018/wordml/cex" xmlns:w16="http://schemas.microsoft.com/office/word/2018/wordml" xmlns:w16du="http://schemas.microsoft.com/office/word/2023/wordml/word16du" xmlns:w16sdtdh="http://schemas.microsoft.com/office/word/2020/wordml/sdtdatahash" xmlns:w16sdtfl="http://schemas.microsoft.com/office/word/2024/wordml/sdtformatlock">
                   <w:pict>
                     <v:shape w14:anchorId="0680D1E1" id="Straight Arrow Connector 5" o:spid="_x0000_s1026" type="#_x0000_t32" style="position:absolute;margin-left:60.2pt;margin-top:4.05pt;width:124.8pt;height:0;z-index:251663360;visibility:visible;mso-wrap-style:square;mso-width-percent:0;mso-height-percent:0;mso-wrap-distance-left:9pt;mso-wrap-distance-top:-6e-5mm;mso-wrap-distance-right:9pt;mso-wrap-distance-bottom:-6e-5mm;mso-position-horizontal:absolute;mso-position-horizontal-relative:text;mso-position-vertical:absolute;mso-position-vertical-relative:text;mso-width-percent:0;mso-height-percent:0;mso-width-relative:page;mso-height-relative:page" o:gfxdata="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"/>
                   </w:pict>
@@ -4041,22 +3977,13 @@
         </w:rPr>
         <w:t xml:space="preserve">Địa chỉ trạm </w:t>
       </w:r>
-      <w:proofErr w:type="gramStart"/>
       <w:r>
         <w:rPr>
           <w:rFonts w:ascii="Times New Roman" w:hAnsi="Times New Roman"/>
           <w:szCs w:val="26"/>
         </w:rPr>
         <w:tab/>
-        <w:t>:</w:t>
-      </w:r>
-      <w:proofErr w:type="gramEnd"/>
-      <w:r>
-        <w:rPr>
-          <w:rFonts w:ascii="Times New Roman" w:hAnsi="Times New Roman"/>
-          <w:szCs w:val="26"/>
-        </w:rPr>
-        <w:t>{{ADDRESS_OLD}} ({{ADDRESS_NEW}})</w:t>
+        <w:t>:{{ADDRESS_OLD}} ({{ADDRESS_NEW}})</w:t>
       </w:r>
     </w:p>
     <w:p>
@@ -4365,6 +4292,7 @@
           <w:noProof/>
           <w:szCs w:val="26"/>
         </w:rPr>
+        <w:lastRenderedPageBreak/>
         <w:t>Chức vụ</w:t>
       </w:r>
       <w:r>
@@ -4516,7 +4444,6 @@
           <w:noProof/>
           <w:szCs w:val="26"/>
         </w:rPr>
-        <w:lastRenderedPageBreak/>
         <w:t>Tài khoản số</w:t>
       </w:r>
       <w:r>
@@ -4659,8 +4586,6 @@
         </w:rPr>
         <w:t>6</w:t>
       </w:r>
-      <w:bookmarkStart w:id="1" w:name="_GoBack"/>
-      <w:bookmarkEnd w:id="1"/>
       <w:r>
         <w:rPr>
           <w:rFonts w:ascii="Times New Roman" w:hAnsi="Times New Roman"/>
@@ -5285,6 +5210,7 @@
           <w:szCs w:val="26"/>
           <w:lang w:val="da-DK"/>
         </w:rPr>
+        <w:lastRenderedPageBreak/>
         <w:t xml:space="preserve">* Số điện thoại liên lạc của Bên B: </w:t>
       </w:r>
       <w:r>
@@ -5346,7 +5272,6 @@
           <w:szCs w:val="26"/>
           <w:lang w:val="da-DK"/>
         </w:rPr>
-        <w:lastRenderedPageBreak/>
         <w:t>Bên A đồng ý cho Bên B sử dụng mặt bằng</w:t>
       </w:r>
       <w:r>
@@ -5880,25 +5805,48 @@
     </w:p>
     <w:p>
       <w:pPr>
-        <w:widowControl w:val="0"/>
-        <w:spacing w:before="120"/>
-        <w:ind w:firstLine="720"/>
-        <w:jc w:val="both"/>
+        <w:pStyle w:val="BodyTextIndent3"/>
+        <w:numPr>
+          <w:ilvl w:val="0"/>
+          <w:numId w:val="29"/>
+        </w:numPr>
+        <w:tabs>
+          <w:tab w:val="clear" w:pos="180"/>
+        </w:tabs>
+        <w:suppressAutoHyphens/>
+        <w:autoSpaceDE/>
+        <w:autoSpaceDN/>
+        <w:ind w:left="0" w:firstLine="567"/>
         <w:rPr>
           <w:rFonts w:ascii="Times New Roman" w:hAnsi="Times New Roman"/>
           <w:bCs/>
-          <w:i/>
           <w:iCs/>
+          <w:color w:val="000000" w:themeColor="text1"/>
           <w:spacing w:val="-2"/>
-          <w:szCs w:val="26"/>
-        </w:rPr>
-      </w:pPr>
-      <w:r>
-        <w:rPr>
-          <w:rFonts w:ascii="Times New Roman" w:hAnsi="Times New Roman"/>
-          <w:szCs w:val="26"/>
-        </w:rPr>
-        <w:t>- Thời điểm bắt đầu tính tiền thuê: Từ ngày {{START_DATE}}</w:t>
+          <w:sz w:val="26"/>
+          <w:szCs w:val="26"/>
+          <w:lang w:val="vi-VN"/>
+        </w:rPr>
+      </w:pPr>
+      <w:r>
+        <w:rPr>
+          <w:rFonts w:ascii="Times New Roman" w:hAnsi="Times New Roman"/>
+          <w:szCs w:val="26"/>
+        </w:rPr>
+        <w:lastRenderedPageBreak/>
+        <w:t xml:space="preserve">- Thời điểm bắt đầu tính tiền thuê: </w:t>
+      </w:r>
+      <w:r>
+        <w:rPr>
+          <w:rFonts w:ascii="Times New Roman" w:hAnsi="Times New Roman"/>
+          <w:bCs/>
+          <w:iCs/>
+          <w:color w:val="000000" w:themeColor="text1"/>
+          <w:spacing w:val="-2"/>
+          <w:sz w:val="26"/>
+          <w:szCs w:val="26"/>
+        </w:rPr>
+        <w:t>Kể từ thời điểm MobiFone hoàn thành lắp đặt, phát sóng trạm ( thể hiện bằng biên bản phát sóng) nhưng không quá 60 ngày kể từ ngày hoàn thành lắp dựng xong cột anten.</w:t>
       </w:r>
     </w:p>
     <w:p>
@@ -5947,7 +5895,6 @@
           <w:b/>
           <w:szCs w:val="26"/>
         </w:rPr>
-        <w:lastRenderedPageBreak/>
         <w:t>Tên tài khoản: {{ACCOUNT_OWNER}}</w:t>
       </w:r>
     </w:p>
@@ -6099,18 +6046,21 @@
     </w:p>
     <w:p>
       <w:pPr>
-        <w:pStyle w:val="ListParagraph"/>
         <w:numPr>
           <w:ilvl w:val="0"/>
-          <w:numId w:val="7"/>
+          <w:numId w:val="28"/>
         </w:numPr>
-        <w:spacing w:before="120" w:line="320" w:lineRule="exact"/>
-        <w:jc w:val="both"/>
-        <w:rPr>
-          <w:rFonts w:ascii="Times New Roman" w:hAnsi="Times New Roman"/>
-          <w:i/>
-          <w:szCs w:val="26"/>
-          <w:lang w:val="en-SG"/>
+        <w:tabs>
+          <w:tab w:val="num" w:pos="709"/>
+        </w:tabs>
+        <w:autoSpaceDE w:val="0"/>
+        <w:autoSpaceDN w:val="0"/>
+        <w:spacing w:before="120" w:after="60"/>
+        <w:ind w:left="0" w:firstLine="567"/>
+        <w:jc w:val="both"/>
+        <w:rPr>
+          <w:rFonts w:ascii="Times New Roman" w:hAnsi="Times New Roman"/>
+          <w:szCs w:val="26"/>
         </w:rPr>
       </w:pPr>
       <w:r>
@@ -6193,111 +6143,512 @@
         <w:rPr>
           <w:rFonts w:ascii="Times New Roman" w:hAnsi="Times New Roman"/>
           <w:szCs w:val="26"/>
+        </w:rPr>
+        <w:t xml:space="preserve">Kỳ hạn thanh toán: </w:t>
+      </w:r>
+      <w:r>
+        <w:rPr>
+          <w:rFonts w:ascii="Times New Roman" w:hAnsi="Times New Roman"/>
+          <w:szCs w:val="26"/>
+        </w:rPr>
+        <w:tab/>
+      </w:r>
+    </w:p>
+    <w:p>
+      <w:pPr>
+        <w:pStyle w:val="BodyText"/>
+        <w:spacing w:line="268" w:lineRule="auto"/>
+        <w:ind w:left="567" w:right="317" w:firstLine="426"/>
+        <w:rPr>
+          <w:rFonts w:ascii="Times New Roman" w:hAnsi="Times New Roman"/>
+          <w:szCs w:val="26"/>
+        </w:rPr>
+      </w:pPr>
+      <w:r>
+        <w:rPr>
+          <w:rFonts w:ascii="Times New Roman" w:hAnsi="Times New Roman"/>
+          <w:szCs w:val="26"/>
+        </w:rPr>
+        <w:t>+</w:t>
+      </w:r>
+      <w:r>
+        <w:rPr>
+          <w:rFonts w:ascii="Times New Roman" w:hAnsi="Times New Roman"/>
+          <w:spacing w:val="-13"/>
+          <w:szCs w:val="26"/>
+        </w:rPr>
+        <w:t xml:space="preserve"> </w:t>
+      </w:r>
+      <w:r>
+        <w:rPr>
+          <w:rFonts w:ascii="Times New Roman" w:hAnsi="Times New Roman"/>
+          <w:szCs w:val="26"/>
+        </w:rPr>
+        <w:t>Lần</w:t>
+      </w:r>
+      <w:r>
+        <w:rPr>
+          <w:rFonts w:ascii="Times New Roman" w:hAnsi="Times New Roman"/>
+          <w:spacing w:val="-12"/>
+          <w:szCs w:val="26"/>
+        </w:rPr>
+        <w:t xml:space="preserve"> </w:t>
+      </w:r>
+      <w:r>
+        <w:rPr>
+          <w:rFonts w:ascii="Times New Roman" w:hAnsi="Times New Roman"/>
+          <w:szCs w:val="26"/>
+        </w:rPr>
+        <w:t>thanh</w:t>
+      </w:r>
+      <w:r>
+        <w:rPr>
+          <w:rFonts w:ascii="Times New Roman" w:hAnsi="Times New Roman"/>
+          <w:spacing w:val="-12"/>
+          <w:szCs w:val="26"/>
+        </w:rPr>
+        <w:t xml:space="preserve"> </w:t>
+      </w:r>
+      <w:r>
+        <w:rPr>
+          <w:rFonts w:ascii="Times New Roman" w:hAnsi="Times New Roman"/>
+          <w:szCs w:val="26"/>
+        </w:rPr>
+        <w:t>toán</w:t>
+      </w:r>
+      <w:r>
+        <w:rPr>
+          <w:rFonts w:ascii="Times New Roman" w:hAnsi="Times New Roman"/>
+          <w:spacing w:val="-14"/>
+          <w:szCs w:val="26"/>
+        </w:rPr>
+        <w:t xml:space="preserve"> </w:t>
+      </w:r>
+      <w:r>
+        <w:rPr>
+          <w:rFonts w:ascii="Times New Roman" w:hAnsi="Times New Roman"/>
+          <w:szCs w:val="26"/>
+        </w:rPr>
+        <w:t>đầu</w:t>
+      </w:r>
+      <w:r>
+        <w:rPr>
+          <w:rFonts w:ascii="Times New Roman" w:hAnsi="Times New Roman"/>
+          <w:spacing w:val="-14"/>
+          <w:szCs w:val="26"/>
+        </w:rPr>
+        <w:t xml:space="preserve"> </w:t>
+      </w:r>
+      <w:r>
+        <w:rPr>
+          <w:rFonts w:ascii="Times New Roman" w:hAnsi="Times New Roman"/>
+          <w:szCs w:val="26"/>
+        </w:rPr>
+        <w:t>tiên:</w:t>
+      </w:r>
+      <w:r>
+        <w:rPr>
+          <w:rFonts w:ascii="Times New Roman" w:hAnsi="Times New Roman"/>
+          <w:spacing w:val="-12"/>
+          <w:szCs w:val="26"/>
+        </w:rPr>
+        <w:t xml:space="preserve"> </w:t>
+      </w:r>
+      <w:r>
+        <w:rPr>
+          <w:rFonts w:ascii="Times New Roman" w:hAnsi="Times New Roman"/>
+          <w:szCs w:val="26"/>
+        </w:rPr>
+        <w:t>Tính</w:t>
+      </w:r>
+      <w:r>
+        <w:rPr>
+          <w:rFonts w:ascii="Times New Roman" w:hAnsi="Times New Roman"/>
+          <w:spacing w:val="-14"/>
+          <w:szCs w:val="26"/>
+        </w:rPr>
+        <w:t xml:space="preserve"> </w:t>
+      </w:r>
+      <w:r>
+        <w:rPr>
+          <w:rFonts w:ascii="Times New Roman" w:hAnsi="Times New Roman"/>
+          <w:szCs w:val="26"/>
+        </w:rPr>
+        <w:t>từ</w:t>
+      </w:r>
+      <w:r>
+        <w:rPr>
+          <w:rFonts w:ascii="Times New Roman" w:hAnsi="Times New Roman"/>
+          <w:spacing w:val="-14"/>
+          <w:szCs w:val="26"/>
+        </w:rPr>
+        <w:t xml:space="preserve"> </w:t>
+      </w:r>
+      <w:r>
+        <w:rPr>
+          <w:rFonts w:ascii="Times New Roman" w:hAnsi="Times New Roman"/>
+          <w:szCs w:val="26"/>
+        </w:rPr>
+        <w:t>thời</w:t>
+      </w:r>
+      <w:r>
+        <w:rPr>
+          <w:rFonts w:ascii="Times New Roman" w:hAnsi="Times New Roman"/>
+          <w:spacing w:val="-14"/>
+          <w:szCs w:val="26"/>
+        </w:rPr>
+        <w:t xml:space="preserve"> </w:t>
+      </w:r>
+      <w:r>
+        <w:rPr>
+          <w:rFonts w:ascii="Times New Roman" w:hAnsi="Times New Roman"/>
+          <w:szCs w:val="26"/>
+        </w:rPr>
+        <w:t>điểm</w:t>
+      </w:r>
+      <w:r>
+        <w:rPr>
+          <w:rFonts w:ascii="Times New Roman" w:hAnsi="Times New Roman"/>
+          <w:spacing w:val="-13"/>
+          <w:szCs w:val="26"/>
+        </w:rPr>
+        <w:t xml:space="preserve"> </w:t>
+      </w:r>
+      <w:r>
+        <w:rPr>
+          <w:rFonts w:ascii="Times New Roman" w:hAnsi="Times New Roman"/>
+          <w:szCs w:val="26"/>
+        </w:rPr>
+        <w:t>bắt</w:t>
+      </w:r>
+      <w:r>
+        <w:rPr>
+          <w:rFonts w:ascii="Times New Roman" w:hAnsi="Times New Roman"/>
+          <w:spacing w:val="-12"/>
+          <w:szCs w:val="26"/>
+        </w:rPr>
+        <w:t xml:space="preserve"> </w:t>
+      </w:r>
+      <w:r>
+        <w:rPr>
+          <w:rFonts w:ascii="Times New Roman" w:hAnsi="Times New Roman"/>
+          <w:szCs w:val="26"/>
+        </w:rPr>
+        <w:t>đầu</w:t>
+      </w:r>
+      <w:r>
+        <w:rPr>
+          <w:rFonts w:ascii="Times New Roman" w:hAnsi="Times New Roman"/>
+          <w:spacing w:val="-14"/>
+          <w:szCs w:val="26"/>
+        </w:rPr>
+        <w:t xml:space="preserve"> </w:t>
+      </w:r>
+      <w:r>
+        <w:rPr>
+          <w:rFonts w:ascii="Times New Roman" w:hAnsi="Times New Roman"/>
+          <w:szCs w:val="26"/>
+        </w:rPr>
+        <w:t>tính</w:t>
+      </w:r>
+      <w:r>
+        <w:rPr>
+          <w:rFonts w:ascii="Times New Roman" w:hAnsi="Times New Roman"/>
+          <w:spacing w:val="-12"/>
+          <w:szCs w:val="26"/>
+        </w:rPr>
+        <w:t xml:space="preserve"> </w:t>
+      </w:r>
+      <w:r>
+        <w:rPr>
+          <w:rFonts w:ascii="Times New Roman" w:hAnsi="Times New Roman"/>
+          <w:szCs w:val="26"/>
+        </w:rPr>
+        <w:t>tiền</w:t>
+      </w:r>
+      <w:r>
+        <w:rPr>
+          <w:rFonts w:ascii="Times New Roman" w:hAnsi="Times New Roman"/>
+          <w:spacing w:val="-14"/>
+          <w:szCs w:val="26"/>
+        </w:rPr>
+        <w:t xml:space="preserve"> </w:t>
+      </w:r>
+      <w:r>
+        <w:rPr>
+          <w:rFonts w:ascii="Times New Roman" w:hAnsi="Times New Roman"/>
+          <w:szCs w:val="26"/>
+        </w:rPr>
+        <w:t>thuê</w:t>
+      </w:r>
+      <w:r>
+        <w:rPr>
+          <w:rFonts w:ascii="Times New Roman" w:hAnsi="Times New Roman"/>
+          <w:spacing w:val="-15"/>
+          <w:szCs w:val="26"/>
+        </w:rPr>
+        <w:t xml:space="preserve"> </w:t>
+      </w:r>
+      <w:r>
+        <w:rPr>
+          <w:rFonts w:ascii="Times New Roman" w:hAnsi="Times New Roman"/>
+          <w:szCs w:val="26"/>
+        </w:rPr>
+        <w:t>đến</w:t>
+      </w:r>
+      <w:r>
+        <w:rPr>
+          <w:rFonts w:ascii="Times New Roman" w:hAnsi="Times New Roman"/>
+          <w:spacing w:val="-14"/>
+          <w:szCs w:val="26"/>
+        </w:rPr>
+        <w:t xml:space="preserve"> </w:t>
+      </w:r>
+      <w:r>
+        <w:rPr>
+          <w:rFonts w:ascii="Times New Roman" w:hAnsi="Times New Roman"/>
+          <w:szCs w:val="26"/>
+        </w:rPr>
+        <w:t xml:space="preserve">ngày </w:t>
+      </w:r>
+      <w:r>
+        <w:rPr>
+          <w:rFonts w:ascii="Times New Roman" w:hAnsi="Times New Roman"/>
+          <w:spacing w:val="-67"/>
+          <w:szCs w:val="26"/>
+        </w:rPr>
+        <w:t xml:space="preserve"> </w:t>
+      </w:r>
+      <w:r>
+        <w:rPr>
+          <w:rFonts w:ascii="Times New Roman" w:hAnsi="Times New Roman"/>
+          <w:szCs w:val="26"/>
+        </w:rPr>
+        <w:t>31/12 của</w:t>
+      </w:r>
+      <w:r>
+        <w:rPr>
+          <w:rFonts w:ascii="Times New Roman" w:hAnsi="Times New Roman"/>
+          <w:spacing w:val="-3"/>
+          <w:szCs w:val="26"/>
+        </w:rPr>
+        <w:t xml:space="preserve"> </w:t>
+      </w:r>
+      <w:r>
+        <w:rPr>
+          <w:rFonts w:ascii="Times New Roman" w:hAnsi="Times New Roman"/>
+          <w:szCs w:val="26"/>
+        </w:rPr>
+        <w:t>năm</w:t>
+      </w:r>
+      <w:r>
+        <w:rPr>
+          <w:rFonts w:ascii="Times New Roman" w:hAnsi="Times New Roman"/>
+          <w:spacing w:val="-3"/>
+          <w:szCs w:val="26"/>
+        </w:rPr>
+        <w:t xml:space="preserve"> </w:t>
+      </w:r>
+      <w:r>
+        <w:rPr>
+          <w:rFonts w:ascii="Times New Roman" w:hAnsi="Times New Roman"/>
+          <w:szCs w:val="26"/>
+        </w:rPr>
+        <w:t>đó.</w:t>
+      </w:r>
+    </w:p>
+    <w:p>
+      <w:pPr>
+        <w:pStyle w:val="BodyText"/>
+        <w:spacing w:before="119"/>
+        <w:ind w:left="567" w:firstLine="426"/>
+        <w:rPr>
+          <w:rFonts w:ascii="Times New Roman" w:hAnsi="Times New Roman"/>
+          <w:szCs w:val="26"/>
+        </w:rPr>
+      </w:pPr>
+      <w:r>
+        <w:rPr>
+          <w:rFonts w:ascii="Times New Roman" w:hAnsi="Times New Roman"/>
+          <w:szCs w:val="26"/>
+        </w:rPr>
+        <w:t>+</w:t>
+      </w:r>
+      <w:r>
+        <w:rPr>
+          <w:rFonts w:ascii="Times New Roman" w:hAnsi="Times New Roman"/>
+          <w:spacing w:val="-3"/>
+          <w:szCs w:val="26"/>
+        </w:rPr>
+        <w:t xml:space="preserve"> </w:t>
+      </w:r>
+      <w:r>
+        <w:rPr>
+          <w:rFonts w:ascii="Times New Roman" w:hAnsi="Times New Roman"/>
+          <w:szCs w:val="26"/>
+        </w:rPr>
+        <w:t>Lần thanh</w:t>
+      </w:r>
+      <w:r>
+        <w:rPr>
+          <w:rFonts w:ascii="Times New Roman" w:hAnsi="Times New Roman"/>
+          <w:spacing w:val="-5"/>
+          <w:szCs w:val="26"/>
+        </w:rPr>
+        <w:t xml:space="preserve"> </w:t>
+      </w:r>
+      <w:r>
+        <w:rPr>
+          <w:rFonts w:ascii="Times New Roman" w:hAnsi="Times New Roman"/>
+          <w:szCs w:val="26"/>
+        </w:rPr>
+        <w:t>toán</w:t>
+      </w:r>
+      <w:r>
+        <w:rPr>
+          <w:rFonts w:ascii="Times New Roman" w:hAnsi="Times New Roman"/>
+          <w:spacing w:val="-3"/>
+          <w:szCs w:val="26"/>
+        </w:rPr>
+        <w:t xml:space="preserve"> </w:t>
+      </w:r>
+      <w:r>
+        <w:rPr>
+          <w:rFonts w:ascii="Times New Roman" w:hAnsi="Times New Roman"/>
+          <w:szCs w:val="26"/>
+        </w:rPr>
+        <w:t>tiếp</w:t>
+      </w:r>
+      <w:r>
+        <w:rPr>
+          <w:rFonts w:ascii="Times New Roman" w:hAnsi="Times New Roman"/>
+          <w:spacing w:val="-2"/>
+          <w:szCs w:val="26"/>
+        </w:rPr>
+        <w:t xml:space="preserve"> </w:t>
+      </w:r>
+      <w:r>
+        <w:rPr>
+          <w:rFonts w:ascii="Times New Roman" w:hAnsi="Times New Roman"/>
+          <w:szCs w:val="26"/>
+        </w:rPr>
+        <w:t>theo:</w:t>
+      </w:r>
+      <w:r>
+        <w:rPr>
+          <w:rFonts w:ascii="Times New Roman" w:hAnsi="Times New Roman"/>
+          <w:spacing w:val="2"/>
+          <w:szCs w:val="26"/>
+        </w:rPr>
+        <w:t xml:space="preserve"> </w:t>
+      </w:r>
+      <w:r>
+        <w:rPr>
+          <w:rFonts w:ascii="Times New Roman" w:hAnsi="Times New Roman"/>
+          <w:szCs w:val="26"/>
+        </w:rPr>
+        <w:t>Thanh</w:t>
+      </w:r>
+      <w:r>
+        <w:rPr>
+          <w:rFonts w:ascii="Times New Roman" w:hAnsi="Times New Roman"/>
+          <w:spacing w:val="-4"/>
+          <w:szCs w:val="26"/>
+        </w:rPr>
+        <w:t xml:space="preserve"> </w:t>
+      </w:r>
+      <w:r>
+        <w:rPr>
+          <w:rFonts w:ascii="Times New Roman" w:hAnsi="Times New Roman"/>
+          <w:szCs w:val="26"/>
+        </w:rPr>
+        <w:t>toán</w:t>
+      </w:r>
+      <w:r>
+        <w:rPr>
+          <w:rFonts w:ascii="Times New Roman" w:hAnsi="Times New Roman"/>
+          <w:spacing w:val="-2"/>
+          <w:szCs w:val="26"/>
+        </w:rPr>
+        <w:t xml:space="preserve"> </w:t>
+      </w:r>
+      <w:r>
+        <w:rPr>
+          <w:rFonts w:ascii="Times New Roman" w:hAnsi="Times New Roman"/>
+          <w:szCs w:val="26"/>
           <w:lang w:val="vi-VN"/>
         </w:rPr>
-        <w:t>{{PAYMENT_CYCLE}}/lần</w:t>
-      </w:r>
-      <w:r>
-        <w:rPr>
-          <w:rFonts w:ascii="Times New Roman" w:hAnsi="Times New Roman"/>
-          <w:i/>
-          <w:szCs w:val="26"/>
-          <w:lang w:val="vi-VN"/>
-        </w:rPr>
-        <w:t>,</w:t>
-      </w:r>
-      <w:r>
-        <w:rPr>
-          <w:rFonts w:ascii="Times New Roman" w:hAnsi="Times New Roman"/>
-          <w:i/>
+        <w:t>06 tháng</w:t>
+      </w:r>
+      <w:r>
+        <w:rPr>
+          <w:rFonts w:ascii="Times New Roman" w:hAnsi="Times New Roman"/>
+          <w:szCs w:val="26"/>
+        </w:rPr>
+        <w:t>/lần</w:t>
+      </w:r>
+      <w:r>
+        <w:rPr>
+          <w:rFonts w:ascii="Times New Roman" w:hAnsi="Times New Roman"/>
+          <w:spacing w:val="-3"/>
+          <w:szCs w:val="26"/>
+        </w:rPr>
+        <w:t xml:space="preserve"> </w:t>
+      </w:r>
+      <w:r>
+        <w:rPr>
+          <w:rFonts w:ascii="Times New Roman" w:hAnsi="Times New Roman"/>
+          <w:szCs w:val="26"/>
+        </w:rPr>
+        <w:t>vào</w:t>
+      </w:r>
+      <w:r>
+        <w:rPr>
+          <w:rFonts w:ascii="Times New Roman" w:hAnsi="Times New Roman"/>
           <w:spacing w:val="-1"/>
           <w:szCs w:val="26"/>
-          <w:lang w:val="vi-VN"/>
         </w:rPr>
         <w:t xml:space="preserve"> </w:t>
       </w:r>
       <w:r>
         <w:rPr>
           <w:rFonts w:ascii="Times New Roman" w:hAnsi="Times New Roman"/>
-          <w:i/>
-          <w:szCs w:val="26"/>
-          <w:lang w:val="vi-VN"/>
-        </w:rPr>
-        <w:t>cụ</w:t>
-      </w:r>
-      <w:r>
-        <w:rPr>
-          <w:rFonts w:ascii="Times New Roman" w:hAnsi="Times New Roman"/>
-          <w:i/>
-          <w:spacing w:val="-3"/>
-          <w:szCs w:val="26"/>
-          <w:lang w:val="vi-VN"/>
-        </w:rPr>
-        <w:t xml:space="preserve"> </w:t>
-      </w:r>
-      <w:r>
-        <w:rPr>
-          <w:rFonts w:ascii="Times New Roman" w:hAnsi="Times New Roman"/>
-          <w:i/>
-          <w:szCs w:val="26"/>
-          <w:lang w:val="vi-VN"/>
-        </w:rPr>
-        <w:t>thể:</w:t>
-      </w:r>
-    </w:p>
-    <w:p>
-      <w:pPr>
-        <w:pStyle w:val="ListParagraph"/>
-        <w:spacing w:before="120" w:line="320" w:lineRule="exact"/>
-        <w:jc w:val="both"/>
-        <w:rPr>
-          <w:rFonts w:ascii="Times New Roman" w:hAnsi="Times New Roman"/>
-          <w:i/>
-          <w:szCs w:val="26"/>
-          <w:lang w:val="en-SG"/>
-        </w:rPr>
-      </w:pPr>
-    </w:p>
-    <w:tbl>
-      <w:tblPr>
-        <w:tblW w:w="8640" w:type="dxa"/>
-        <w:jc w:val="center"/>
-        <w:tblLook w:val="04A0" w:firstRow="1" w:lastRow="0" w:firstColumn="1" w:lastColumn="0" w:noHBand="0" w:noVBand="1"/>
-      </w:tblPr>
-      <w:tblGrid>
-        <w:gridCol w:w="8640"/>
-      </w:tblGrid>
-      <w:tr>
-        <w:trPr>
-          <w:trHeight w:val="432"/>
-          <w:jc w:val="center"/>
-        </w:trPr>
-        <w:tc>
-          <w:tcPr>
-            <w:tcW w:w="8640" w:type="dxa"/>
-          </w:tcPr>
-          <w:p>
-            <w:pPr>
-              <w:rPr>
-                <w:rFonts w:ascii="Times New Roman" w:hAnsi="Times New Roman"/>
-                <w:szCs w:val="26"/>
-              </w:rPr>
-            </w:pPr>
-            <w:r>
-              <w:rPr>
-                <w:rFonts w:ascii="Times New Roman" w:hAnsi="Times New Roman"/>
-                <w:szCs w:val="26"/>
-              </w:rPr>
-              <w:t>{{PAY_ROW}}</w:t>
-            </w:r>
-          </w:p>
-        </w:tc>
-      </w:tr>
-    </w:tbl>
+          <w:szCs w:val="26"/>
+        </w:rPr>
+        <w:t>đầu kỳ.</w:t>
+      </w:r>
+    </w:p>
+    <w:p>
+      <w:pPr>
+        <w:numPr>
+          <w:ilvl w:val="0"/>
+          <w:numId w:val="28"/>
+        </w:numPr>
+        <w:tabs>
+          <w:tab w:val="num" w:pos="709"/>
+        </w:tabs>
+        <w:autoSpaceDE w:val="0"/>
+        <w:autoSpaceDN w:val="0"/>
+        <w:spacing w:before="120" w:after="60"/>
+        <w:ind w:left="0" w:firstLine="567"/>
+        <w:jc w:val="both"/>
+        <w:rPr>
+          <w:rFonts w:ascii="Times New Roman" w:hAnsi="Times New Roman"/>
+          <w:szCs w:val="26"/>
+        </w:rPr>
+      </w:pPr>
+      <w:r>
+        <w:rPr>
+          <w:rFonts w:ascii="Times New Roman" w:hAnsi="Times New Roman"/>
+          <w:szCs w:val="26"/>
+        </w:rPr>
+        <w:t>Phương thức thanh toán: Chuyển khoản.</w:t>
+      </w:r>
+    </w:p>
     <w:p>
       <w:pPr>
         <w:widowControl w:val="0"/>
-        <w:spacing w:before="120" w:line="360" w:lineRule="atLeast"/>
+        <w:spacing w:before="120"/>
         <w:ind w:firstLine="720"/>
         <w:jc w:val="both"/>
         <w:rPr>
@@ -6309,22 +6660,8 @@
           <w:lang w:val="da-DK"/>
         </w:rPr>
       </w:pPr>
-    </w:p>
-    <w:p>
-      <w:pPr>
-        <w:widowControl w:val="0"/>
-        <w:spacing w:before="120"/>
-        <w:ind w:firstLine="720"/>
-        <w:jc w:val="both"/>
-        <w:rPr>
-          <w:rFonts w:ascii="Times New Roman" w:hAnsi="Times New Roman"/>
-          <w:bCs/>
-          <w:iCs/>
-          <w:spacing w:val="-2"/>
-          <w:szCs w:val="26"/>
-          <w:lang w:val="da-DK"/>
-        </w:rPr>
-      </w:pPr>
+      <w:bookmarkStart w:id="1" w:name="_GoBack"/>
+      <w:bookmarkEnd w:id="1"/>
       <w:r>
         <w:rPr>
           <w:rFonts w:ascii="Times New Roman" w:hAnsi="Times New Roman"/>
@@ -6678,7 +7015,16 @@
           <w:szCs w:val="26"/>
           <w:lang w:val="da-DK"/>
         </w:rPr>
-        <w:t>Bên A cung cấp đầy đủ các giấy tờ liên quan quyền sở hữu/sử dụng đất và công trình, tài sản trên đất hoặc giấy xác nhận sở hữu/quyền sở hữu và không tranh chấp của chính quyền địa phương, địa chính địa phương (giấy tờ nhà/đất, giấy phép xây dựng, hoàn công nhà…) để bên B xin phép xây dựng trạm BTS, đồng thời Bên A đồng ý, tạo điều kiện thuận lợi cho Bên B triển khai thi công xây dựng trong quá trình hoàn thiện hồ sơ cấp phép. Nếu quá trình thi công bị dừng do thiếu giấy tờ của Bên A thì Bên B sẽ không thanh toán tiền thuê mặt bằng cho đến khi Bên A cung cấp bổ sung đầy đủ hồ sơ cho Bên B.</w:t>
+        <w:t xml:space="preserve">Bên A cung cấp đầy đủ các giấy tờ liên quan quyền sở hữu/sử dụng đất và công trình, tài sản trên đất hoặc giấy xác nhận sở hữu/quyền sở hữu và không tranh chấp của </w:t>
+      </w:r>
+      <w:r>
+        <w:rPr>
+          <w:rFonts w:ascii="Times New Roman" w:hAnsi="Times New Roman"/>
+          <w:szCs w:val="26"/>
+          <w:lang w:val="da-DK"/>
+        </w:rPr>
+        <w:lastRenderedPageBreak/>
+        <w:t>chính quyền địa phương, địa chính địa phương (giấy tờ nhà/đất, giấy phép xây dựng, hoàn công nhà…) để bên B xin phép xây dựng trạm BTS, đồng thời Bên A đồng ý, tạo điều kiện thuận lợi cho Bên B triển khai thi công xây dựng trong quá trình hoàn thiện hồ sơ cấp phép. Nếu quá trình thi công bị dừng do thiếu giấy tờ của Bên A thì Bên B sẽ không thanh toán tiền thuê mặt bằng cho đến khi Bên A cung cấp bổ sung đầy đủ hồ sơ cho Bên B.</w:t>
       </w:r>
     </w:p>
     <w:p>
@@ -6699,7 +7045,6 @@
           <w:szCs w:val="26"/>
           <w:lang w:val="da-DK"/>
         </w:rPr>
-        <w:lastRenderedPageBreak/>
         <w:t>- Bên A thanh toán các chi phí phát sinh khi chuyển mục đích sử dụng đất nhằm mục đích xin các loại giấy phép phục vụ việc xây dựng trạm BTS.</w:t>
       </w:r>
     </w:p>
@@ -6742,25 +7087,7 @@
           <w:szCs w:val="26"/>
           <w:lang w:val="da-DK"/>
         </w:rPr>
-        <w:t xml:space="preserve">- Bên A phải đảm bảo mọi sự chuyển dịch quyền sở hữu nhà đất hoặc cho thuê, thế </w:t>
-      </w:r>
-      <w:proofErr w:type="gramStart"/>
-      <w:r>
-        <w:rPr>
-          <w:rFonts w:ascii="Times New Roman" w:hAnsi="Times New Roman"/>
-          <w:szCs w:val="26"/>
-          <w:lang w:val="da-DK"/>
-        </w:rPr>
-        <w:t>chấp,…</w:t>
-      </w:r>
-      <w:proofErr w:type="gramEnd"/>
-      <w:r>
-        <w:rPr>
-          <w:rFonts w:ascii="Times New Roman" w:hAnsi="Times New Roman"/>
-          <w:szCs w:val="26"/>
-          <w:lang w:val="da-DK"/>
-        </w:rPr>
-        <w:t xml:space="preserve"> không được ảnh hưởng quyền thuê của bên B. Trách nhiệm của hai bên vẫn phải được tiến hành theo nội dung của hợp đồng này và hợp đồng này vẫn phải có hiệu lực cho đến hết thời hạn được nêu ở điều 2, tạo mọi điều kiện thuận lợi để bên B sử dụng mặt bằng/hạ tầng có sẵn đã thuê.</w:t>
+        <w:t>- Bên A phải đảm bảo mọi sự chuyển dịch quyền sở hữu nhà đất hoặc cho thuê, thế chấp,… không được ảnh hưởng quyền thuê của bên B. Trách nhiệm của hai bên vẫn phải được tiến hành theo nội dung của hợp đồng này và hợp đồng này vẫn phải có hiệu lực cho đến hết thời hạn được nêu ở điều 2, tạo mọi điều kiện thuận lợi để bên B sử dụng mặt bằng/hạ tầng có sẵn đã thuê.</w:t>
       </w:r>
     </w:p>
     <w:p>
@@ -6889,25 +7216,7 @@
           <w:szCs w:val="26"/>
           <w:lang w:val="da-DK"/>
         </w:rPr>
-        <w:t xml:space="preserve">- Bên A phải thông báo bằng văn bản cho Bên B về việc chuyển quyền sở hữu nhà đất (mua bán, thừa </w:t>
-      </w:r>
-      <w:proofErr w:type="gramStart"/>
-      <w:r>
-        <w:rPr>
-          <w:rFonts w:ascii="Times New Roman" w:hAnsi="Times New Roman"/>
-          <w:szCs w:val="26"/>
-          <w:lang w:val="da-DK"/>
-        </w:rPr>
-        <w:t>kế,…</w:t>
-      </w:r>
-      <w:proofErr w:type="gramEnd"/>
-      <w:r>
-        <w:rPr>
-          <w:rFonts w:ascii="Times New Roman" w:hAnsi="Times New Roman"/>
-          <w:szCs w:val="26"/>
-          <w:lang w:val="da-DK"/>
-        </w:rPr>
-        <w:t xml:space="preserve">) cũng như việc cho thuê, thế chấp </w:t>
+        <w:t xml:space="preserve">- Bên A phải thông báo bằng văn bản cho Bên B về việc chuyển quyền sở hữu nhà đất (mua bán, thừa kế,…) cũng như việc cho thuê, thế chấp </w:t>
       </w:r>
       <w:r>
         <w:rPr>
@@ -6945,25 +7254,7 @@
           <w:szCs w:val="26"/>
           <w:lang w:val="da-DK"/>
         </w:rPr>
-        <w:t xml:space="preserve">- Bên A phối hợp, kiểm tra giám sát khu vực nhà trạm, kịp thời thông báo cho Bên B các điều kiện không đảm bảo an toàn hoạt động của nhà trạm và các thiết bị của Bên B (hệ thống thoát nước, hệ thống điện, phòng chống cháy nổ, hệ thống tiếp đất chống </w:t>
-      </w:r>
-      <w:proofErr w:type="gramStart"/>
-      <w:r>
-        <w:rPr>
-          <w:rFonts w:ascii="Times New Roman" w:hAnsi="Times New Roman"/>
-          <w:szCs w:val="26"/>
-          <w:lang w:val="da-DK"/>
-        </w:rPr>
-        <w:t>sét,…</w:t>
-      </w:r>
-      <w:proofErr w:type="gramEnd"/>
-      <w:r>
-        <w:rPr>
-          <w:rFonts w:ascii="Times New Roman" w:hAnsi="Times New Roman"/>
-          <w:szCs w:val="26"/>
-          <w:lang w:val="da-DK"/>
-        </w:rPr>
-        <w:t>). Bên A phối hợp giúp đỡ Bên B để khắc phục sửa chữa kịp thời những hư hỏng đó. Mọi việc sửa chữa đột xuất của Bên A có ảnh hưởng đến hoạt động của trạm viễn thông phải báo trước 48 giờ cho Bên B để phối hợp giải quyết.</w:t>
+        <w:t>- Bên A phối hợp, kiểm tra giám sát khu vực nhà trạm, kịp thời thông báo cho Bên B các điều kiện không đảm bảo an toàn hoạt động của nhà trạm và các thiết bị của Bên B (hệ thống thoát nước, hệ thống điện, phòng chống cháy nổ, hệ thống tiếp đất chống sét,…). Bên A phối hợp giúp đỡ Bên B để khắc phục sửa chữa kịp thời những hư hỏng đó. Mọi việc sửa chữa đột xuất của Bên A có ảnh hưởng đến hoạt động của trạm viễn thông phải báo trước 48 giờ cho Bên B để phối hợp giải quyết.</w:t>
       </w:r>
     </w:p>
     <w:p>
@@ -7005,7 +7296,16 @@
           <w:szCs w:val="26"/>
           <w:lang w:val="da-DK"/>
         </w:rPr>
-        <w:t>- Nếu các hộ dân hoặc chính quyền địa phương gây cản trở khiến Bên B không thể thi công và phát sóng thì Bên A có nghĩa vụ hoàn trả lại số tiền thuê mặt bằng đã thanh toán mà Bên B chưa sử dụng sau khi đã khấu trừ thuế đã nộp cho Nhà nước trong vòng 05 (năm) ngày kể từ ngày nhận được văn bản thông báo của Bên B. Đồng thời Bên B có trách nhiệm hoàn trả lại mặt bằng cho Bên A như tình trạng ban đầu.</w:t>
+        <w:t xml:space="preserve">- Nếu các hộ dân hoặc chính quyền địa phương gây cản trở khiến Bên B không </w:t>
+      </w:r>
+      <w:r>
+        <w:rPr>
+          <w:rFonts w:ascii="Times New Roman" w:hAnsi="Times New Roman"/>
+          <w:szCs w:val="26"/>
+          <w:lang w:val="da-DK"/>
+        </w:rPr>
+        <w:lastRenderedPageBreak/>
+        <w:t>thể thi công và phát sóng thì Bên A có nghĩa vụ hoàn trả lại số tiền thuê mặt bằng đã thanh toán mà Bên B chưa sử dụng sau khi đã khấu trừ thuế đã nộp cho Nhà nước trong vòng 05 (năm) ngày kể từ ngày nhận được văn bản thông báo của Bên B. Đồng thời Bên B có trách nhiệm hoàn trả lại mặt bằng cho Bên A như tình trạng ban đầu.</w:t>
       </w:r>
     </w:p>
     <w:p>
@@ -7026,16 +7326,7 @@
           <w:szCs w:val="26"/>
           <w:lang w:val="da-DK"/>
         </w:rPr>
-        <w:t xml:space="preserve">- Bảo đảm an ninh, an toàn khu vực nhà trạm và các vật tư thiết bị của trạm, không cho người lạ vào phòng máy hoặc can thiệp vào các thiết bị của trạm. Nếu việc </w:t>
-      </w:r>
-      <w:r>
-        <w:rPr>
-          <w:rFonts w:ascii="Times New Roman" w:hAnsi="Times New Roman"/>
-          <w:szCs w:val="26"/>
-          <w:lang w:val="da-DK"/>
-        </w:rPr>
-        <w:lastRenderedPageBreak/>
-        <w:t>cháy, hỏng, mất mát các tài sản đó do lỗi của Bên A thì Bên A phải sửa chữa, khôi phục tài sản của bên B như ban đầu. Nếu có mất mát Bên A phải báo cơ quan chức năng và bên B để cùng tìm hướng giải quyết.</w:t>
+        <w:t>- Bảo đảm an ninh, an toàn khu vực nhà trạm và các vật tư thiết bị của trạm, không cho người lạ vào phòng máy hoặc can thiệp vào các thiết bị của trạm. Nếu việc cháy, hỏng, mất mát các tài sản đó do lỗi của Bên A thì Bên A phải sửa chữa, khôi phục tài sản của bên B như ban đầu. Nếu có mất mát Bên A phải báo cơ quan chức năng và bên B để cùng tìm hướng giải quyết.</w:t>
       </w:r>
     </w:p>
     <w:p>
@@ -7327,6 +7618,7 @@
           <w:szCs w:val="26"/>
           <w:lang w:val="da-DK"/>
         </w:rPr>
+        <w:lastRenderedPageBreak/>
         <w:t>- Có trách nhiệm sử dụng mặt bằng đúng nội dung và mục đích đã cam kết, khi cần sửa chữa cải tạo phòng máy phải thông báo với Bên A.</w:t>
       </w:r>
     </w:p>
@@ -7369,7 +7661,6 @@
           <w:szCs w:val="26"/>
           <w:lang w:val="da-DK"/>
         </w:rPr>
-        <w:lastRenderedPageBreak/>
         <w:t>- Thanh toán tiền thuê mặt bằng đúng thời hạn và đầy đủ.</w:t>
       </w:r>
     </w:p>
@@ -7855,7 +8146,17 @@
           <w:szCs w:val="26"/>
           <w:lang w:val="da-DK"/>
         </w:rPr>
-        <w:t xml:space="preserve">đối với mọi bất đồng và tranh chấp phát sinh, hai bên sẽ trước hết giải quyết thông qua thương lượng trên cơ sở thiện chí và hợp tác </w:t>
+        <w:t xml:space="preserve">đối với mọi bất đồng và tranh chấp phát </w:t>
+      </w:r>
+      <w:r>
+        <w:rPr>
+          <w:rFonts w:ascii="Times New Roman" w:hAnsi="Times New Roman"/>
+          <w:noProof/>
+          <w:szCs w:val="26"/>
+          <w:lang w:val="da-DK"/>
+        </w:rPr>
+        <w:lastRenderedPageBreak/>
+        <w:t xml:space="preserve">sinh, hai bên sẽ trước hết giải quyết thông qua thương lượng trên cơ sở thiện chí và hợp tác </w:t>
       </w:r>
       <w:r>
         <w:rPr>
@@ -7894,16 +8195,7 @@
           <w:szCs w:val="26"/>
           <w:lang w:val="da-DK"/>
         </w:rPr>
-        <w:t xml:space="preserve">- Trong quá trình triển khai hợp đồng, nếu có các sự kiện bất khả kháng hoặc các </w:t>
-      </w:r>
-      <w:r>
-        <w:rPr>
-          <w:rFonts w:ascii="Times New Roman" w:hAnsi="Times New Roman"/>
-          <w:szCs w:val="26"/>
-          <w:lang w:val="da-DK"/>
-        </w:rPr>
-        <w:lastRenderedPageBreak/>
-        <w:t>sự kiện khách quan thì hai Bên phải chủ động và cùng phối hợp giải quyết.</w:t>
+        <w:t>- Trong quá trình triển khai hợp đồng, nếu có các sự kiện bất khả kháng hoặc các sự kiện khách quan thì hai Bên phải chủ động và cùng phối hợp giải quyết.</w:t>
       </w:r>
     </w:p>
     <w:p>
@@ -8100,25 +8392,7 @@
           <w:szCs w:val="26"/>
           <w:lang w:val="da-DK"/>
         </w:rPr>
-        <w:t xml:space="preserve">- Trường hợp chấm dứt hợp đồng trái pháp luật (trừ trường hợp quy định tại Điều 6), ngoài việc trả lại tiền thuê mặt bằng/CSHT cho những tháng Bên B chưa sử dụng, Bên A phải bồi thường giá trị tương đương 03 (ba) tháng tiền thuê mặt bằng/CSHT và toàn bộ những thiệt hại phát sinh từ việc chấm dứt hợp đồng (Việc phát sinh do bên thuê thống kê gửi bên cho thuê). Thiệt hại đó bao gồm nhưng không giới hạn cả phần giá trị chưa khấu hao chi phí xây dựng, lắp đặt, sửa chữa, nâng cấp, cải tạo, di dời nhà </w:t>
-      </w:r>
-      <w:proofErr w:type="gramStart"/>
-      <w:r>
-        <w:rPr>
-          <w:rFonts w:ascii="Times New Roman" w:hAnsi="Times New Roman"/>
-          <w:szCs w:val="26"/>
-          <w:lang w:val="da-DK"/>
-        </w:rPr>
-        <w:t>trạm,…</w:t>
-      </w:r>
-      <w:proofErr w:type="gramEnd"/>
-      <w:r>
-        <w:rPr>
-          <w:rFonts w:ascii="Times New Roman" w:hAnsi="Times New Roman"/>
-          <w:szCs w:val="26"/>
-          <w:lang w:val="da-DK"/>
-        </w:rPr>
-        <w:t xml:space="preserve"> và toàn bộ những thiệt hại thực tế làm ảnh hưởng đến chất lượng dịch vụ do Bên B cung cấp.</w:t>
+        <w:t>- Trường hợp chấm dứt hợp đồng trái pháp luật (trừ trường hợp quy định tại Điều 6), ngoài việc trả lại tiền thuê mặt bằng/CSHT cho những tháng Bên B chưa sử dụng, Bên A phải bồi thường giá trị tương đương 03 (ba) tháng tiền thuê mặt bằng/CSHT và toàn bộ những thiệt hại phát sinh từ việc chấm dứt hợp đồng (Việc phát sinh do bên thuê thống kê gửi bên cho thuê). Thiệt hại đó bao gồm nhưng không giới hạn cả phần giá trị chưa khấu hao chi phí xây dựng, lắp đặt, sửa chữa, nâng cấp, cải tạo, di dời nhà trạm,… và toàn bộ những thiệt hại thực tế làm ảnh hưởng đến chất lượng dịch vụ do Bên B cung cấp.</w:t>
       </w:r>
     </w:p>
     <w:p>
@@ -8299,6 +8573,7 @@
           <w:szCs w:val="26"/>
           <w:lang w:val="da-DK"/>
         </w:rPr>
+        <w:lastRenderedPageBreak/>
         <w:t>- Vị trí thuê không còn phù hợp để đảm bảo chất lượng, vùng phủ sóng phục vụ khách hàng tại khu vực đặt trạm.</w:t>
       </w:r>
     </w:p>
@@ -8400,7 +8675,6 @@
           <w:szCs w:val="26"/>
           <w:lang w:val="da-DK"/>
         </w:rPr>
-        <w:lastRenderedPageBreak/>
         <w:t>- Hai bên cam kết thực hiện nghiêm chỉnh các điều khoản đã ghi trong hợp đồng này. Trong quá trình thực hiện, nếu có vấn đề gì phát sinh, hai bên sẽ thông báo cho nhau và cùng nhau bàn bạc giải quyết trên cơ sở hợp tình, hợp lý.</w:t>
       </w:r>
     </w:p>

</xml_diff>

<commit_message>
fix(csht): enable saving of implementation_type, planned height, and planned column type in Edit Modal
</commit_message>
<xml_diff>
--- a/tvt3_v2/public/templates/HOP_DONG_MOI_MAT_BANG.docx
+++ b/tvt3_v2/public/templates/HOP_DONG_MOI_MAT_BANG.docx
@@ -179,7 +179,7 @@
                     </wp:anchor>
                   </w:drawing>
                 </mc:Choice>
-                <mc:Fallback xmlns:oel="http://schemas.microsoft.com/office/2019/extlst" xmlns:w16cex="http://schemas.microsoft.com/office/word/2018/wordml/cex" xmlns:w16="http://schemas.microsoft.com/office/word/2018/wordml" xmlns:w16du="http://schemas.microsoft.com/office/word/2023/wordml/word16du" xmlns:w16sdtdh="http://schemas.microsoft.com/office/word/2020/wordml/sdtdatahash" xmlns:w16sdtfl="http://schemas.microsoft.com/office/word/2024/wordml/sdtformatlock">
+                <mc:Fallback xmlns:w16sdtfl="http://schemas.microsoft.com/office/word/2024/wordml/sdtformatlock" xmlns:w16sdtdh="http://schemas.microsoft.com/office/word/2020/wordml/sdtdatahash" xmlns:w16du="http://schemas.microsoft.com/office/word/2023/wordml/word16du" xmlns:w16="http://schemas.microsoft.com/office/word/2018/wordml" xmlns:w16cex="http://schemas.microsoft.com/office/word/2018/wordml/cex" xmlns:oel="http://schemas.microsoft.com/office/2019/extlst">
                   <w:pict>
                     <v:line w14:anchorId="3A8FE28D" id="Straight Connector 2000649774" o:spid="_x0000_s1026" style="position:absolute;flip:x;z-index:251661312;visibility:visible;mso-wrap-style:square;mso-wrap-distance-left:9pt;mso-wrap-distance-top:0;mso-wrap-distance-right:9pt;mso-wrap-distance-bottom:0;mso-position-horizontal:absolute;mso-position-horizontal-relative:text;mso-position-vertical:absolute;mso-position-vertical-relative:text" from="51.4pt,3.8pt" to="174.3pt,3.8pt" o:gfxdata="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" strokecolor="black [3213]" strokeweight=".5pt">
                       <v:stroke joinstyle="miter"/>
@@ -271,7 +271,7 @@
                     </wp:anchor>
                   </w:drawing>
                 </mc:Choice>
-                <mc:Fallback xmlns:oel="http://schemas.microsoft.com/office/2019/extlst" xmlns:w16cex="http://schemas.microsoft.com/office/word/2018/wordml/cex" xmlns:w16="http://schemas.microsoft.com/office/word/2018/wordml" xmlns:w16du="http://schemas.microsoft.com/office/word/2023/wordml/word16du" xmlns:w16sdtdh="http://schemas.microsoft.com/office/word/2020/wordml/sdtdatahash" xmlns:w16sdtfl="http://schemas.microsoft.com/office/word/2024/wordml/sdtformatlock">
+                <mc:Fallback xmlns:w16sdtfl="http://schemas.microsoft.com/office/word/2024/wordml/sdtformatlock" xmlns:w16sdtdh="http://schemas.microsoft.com/office/word/2020/wordml/sdtdatahash" xmlns:w16du="http://schemas.microsoft.com/office/word/2023/wordml/word16du" xmlns:w16="http://schemas.microsoft.com/office/word/2018/wordml" xmlns:w16cex="http://schemas.microsoft.com/office/word/2018/wordml/cex" xmlns:oel="http://schemas.microsoft.com/office/2019/extlst">
                   <w:pict>
                     <v:line w14:anchorId="7B0B0E0A" id="Straight Connector 1463436238" o:spid="_x0000_s1026" style="position:absolute;flip:y;z-index:251660288;visibility:visible;mso-wrap-style:square;mso-width-percent:0;mso-height-percent:0;mso-wrap-distance-left:9pt;mso-wrap-distance-top:0;mso-wrap-distance-right:9pt;mso-wrap-distance-bottom:0;mso-position-horizontal:absolute;mso-position-horizontal-relative:text;mso-position-vertical:absolute;mso-position-vertical-relative:text;mso-width-percent:0;mso-height-percent:0;mso-width-relative:margin;mso-height-relative:margin" from="66.8pt,5.25pt" to="223.7pt,5.25pt" o:gfxdata="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" strokecolor="black [3213]" strokeweight=".5pt">
                       <v:stroke joinstyle="miter"/>
@@ -1316,7 +1316,7 @@
       </w:tr>
       <w:tr>
         <w:trPr>
-          <w:trHeight w:val="800"/>
+          <w:trHeight w:val="90"/>
           <w:jc w:val="center"/>
         </w:trPr>
         <w:tc>
@@ -1824,7 +1824,7 @@
       </w:tr>
       <w:tr>
         <w:trPr>
-          <w:trHeight w:val="871"/>
+          <w:trHeight w:val="439"/>
           <w:jc w:val="center"/>
         </w:trPr>
         <w:tc>
@@ -1956,7 +1956,7 @@
       </w:tr>
       <w:tr>
         <w:trPr>
-          <w:trHeight w:val="1005"/>
+          <w:trHeight w:val="349"/>
           <w:jc w:val="center"/>
         </w:trPr>
         <w:tc>
@@ -3084,7 +3084,6 @@
                 <w:b/>
                 <w:szCs w:val="28"/>
               </w:rPr>
-              <w:lastRenderedPageBreak/>
               <w:t>Nguyễn Đức Long</w:t>
             </w:r>
           </w:p>
@@ -3092,27 +3091,9 @@
       </w:tr>
     </w:tbl>
     <w:p>
-      <w:pPr>
-        <w:tabs>
-          <w:tab w:val="left" w:pos="426"/>
-          <w:tab w:val="left" w:pos="810"/>
-          <w:tab w:val="left" w:pos="3240"/>
-        </w:tabs>
-        <w:spacing w:before="120" w:line="360" w:lineRule="exact"/>
-        <w:jc w:val="both"/>
-        <w:rPr>
-          <w:rFonts w:ascii="Times New Roman" w:hAnsi="Times New Roman"/>
-          <w:sz w:val="28"/>
-          <w:szCs w:val="28"/>
-        </w:rPr>
-      </w:pPr>
-    </w:p>
-    <w:p/>
-    <w:p/>
-    <w:p/>
-    <w:p/>
-    <w:p/>
-    <w:p/>
+      <w:bookmarkStart w:id="0" w:name="_GoBack"/>
+      <w:bookmarkEnd w:id="0"/>
+    </w:p>
     <w:tbl>
       <w:tblPr>
         <w:tblpPr w:leftFromText="180" w:rightFromText="180" w:vertAnchor="text" w:horzAnchor="margin" w:tblpXSpec="center" w:tblpY="-832"/>
@@ -3284,7 +3265,7 @@
                     </wp:anchor>
                   </w:drawing>
                 </mc:Choice>
-                <mc:Fallback xmlns:oel="http://schemas.microsoft.com/office/2019/extlst" xmlns:w16cex="http://schemas.microsoft.com/office/word/2018/wordml/cex" xmlns:w16="http://schemas.microsoft.com/office/word/2018/wordml" xmlns:w16du="http://schemas.microsoft.com/office/word/2023/wordml/word16du" xmlns:w16sdtdh="http://schemas.microsoft.com/office/word/2020/wordml/sdtdatahash" xmlns:w16sdtfl="http://schemas.microsoft.com/office/word/2024/wordml/sdtformatlock">
+                <mc:Fallback xmlns:w16sdtfl="http://schemas.microsoft.com/office/word/2024/wordml/sdtformatlock" xmlns:w16sdtdh="http://schemas.microsoft.com/office/word/2020/wordml/sdtdatahash" xmlns:w16du="http://schemas.microsoft.com/office/word/2023/wordml/word16du" xmlns:w16="http://schemas.microsoft.com/office/word/2018/wordml" xmlns:w16cex="http://schemas.microsoft.com/office/word/2018/wordml/cex" xmlns:oel="http://schemas.microsoft.com/office/2019/extlst">
                   <w:pict>
                     <v:shape w14:anchorId="18EC2693" id="Straight Arrow Connector 4" o:spid="_x0000_s1026" type="#_x0000_t32" style="position:absolute;margin-left:61.15pt;margin-top:19.7pt;width:132pt;height:0;z-index:251664384;visibility:visible;mso-wrap-style:square;mso-width-percent:0;mso-height-percent:0;mso-wrap-distance-left:9pt;mso-wrap-distance-top:-6e-5mm;mso-wrap-distance-right:9pt;mso-wrap-distance-bottom:-6e-5mm;mso-position-horizontal:absolute;mso-position-horizontal-relative:text;mso-position-vertical:absolute;mso-position-vertical-relative:text;mso-width-percent:0;mso-height-percent:0;mso-width-relative:page;mso-height-relative:page" o:gfxdata="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"/>
                   </w:pict>
@@ -3389,7 +3370,7 @@
                     </wp:anchor>
                   </w:drawing>
                 </mc:Choice>
-                <mc:Fallback xmlns:oel="http://schemas.microsoft.com/office/2019/extlst" xmlns:w16cex="http://schemas.microsoft.com/office/word/2018/wordml/cex" xmlns:w16="http://schemas.microsoft.com/office/word/2018/wordml" xmlns:w16du="http://schemas.microsoft.com/office/word/2023/wordml/word16du" xmlns:w16sdtdh="http://schemas.microsoft.com/office/word/2020/wordml/sdtdatahash" xmlns:w16sdtfl="http://schemas.microsoft.com/office/word/2024/wordml/sdtformatlock">
+                <mc:Fallback xmlns:w16sdtfl="http://schemas.microsoft.com/office/word/2024/wordml/sdtformatlock" xmlns:w16sdtdh="http://schemas.microsoft.com/office/word/2020/wordml/sdtdatahash" xmlns:w16du="http://schemas.microsoft.com/office/word/2023/wordml/word16du" xmlns:w16="http://schemas.microsoft.com/office/word/2018/wordml" xmlns:w16cex="http://schemas.microsoft.com/office/word/2018/wordml/cex" xmlns:oel="http://schemas.microsoft.com/office/2019/extlst">
                   <w:pict>
                     <v:shape w14:anchorId="0680D1E1" id="Straight Arrow Connector 5" o:spid="_x0000_s1026" type="#_x0000_t32" style="position:absolute;margin-left:60.2pt;margin-top:4.05pt;width:124.8pt;height:0;z-index:251663360;visibility:visible;mso-wrap-style:square;mso-width-percent:0;mso-height-percent:0;mso-wrap-distance-left:9pt;mso-wrap-distance-top:-6e-5mm;mso-wrap-distance-right:9pt;mso-wrap-distance-bottom:-6e-5mm;mso-position-horizontal:absolute;mso-position-horizontal-relative:text;mso-position-vertical:absolute;mso-position-vertical-relative:text;mso-width-percent:0;mso-height-percent:0;mso-width-relative:page;mso-height-relative:page" o:gfxdata="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"/>
                   </w:pict>
@@ -3579,7 +3560,7 @@
           <w:lang w:val="vi-VN"/>
         </w:rPr>
       </w:pPr>
-      <w:bookmarkStart w:id="0" w:name="_Hlk76390970"/>
+      <w:bookmarkStart w:id="1" w:name="_Hlk76390970"/>
       <w:r>
         <w:rPr>
           <w:rFonts w:ascii="Times New Roman" w:hAnsi="Times New Roman"/>
@@ -3610,7 +3591,7 @@
         </w:rPr>
         <w:t xml:space="preserve">     -26/</w:t>
       </w:r>
-      <w:bookmarkEnd w:id="0"/>
+      <w:bookmarkEnd w:id="1"/>
       <w:r>
         <w:rPr>
           <w:rFonts w:ascii="Times New Roman" w:eastAsiaTheme="minorEastAsia" w:hAnsi="Times New Roman"/>
@@ -4292,7 +4273,6 @@
           <w:noProof/>
           <w:szCs w:val="26"/>
         </w:rPr>
-        <w:lastRenderedPageBreak/>
         <w:t>Chức vụ</w:t>
       </w:r>
       <w:r>
@@ -4650,7 +4630,17 @@
           <w:szCs w:val="26"/>
           <w:lang w:val="da-DK"/>
         </w:rPr>
-        <w:t>với những điều khoản như sau:</w:t>
+        <w:t xml:space="preserve">với </w:t>
+      </w:r>
+      <w:r>
+        <w:rPr>
+          <w:rFonts w:ascii="Times New Roman" w:hAnsi="Times New Roman"/>
+          <w:iCs/>
+          <w:szCs w:val="26"/>
+          <w:lang w:val="da-DK"/>
+        </w:rPr>
+        <w:lastRenderedPageBreak/>
+        <w:t>những điều khoản như sau:</w:t>
       </w:r>
     </w:p>
     <w:p>
@@ -5210,7 +5200,6 @@
           <w:szCs w:val="26"/>
           <w:lang w:val="da-DK"/>
         </w:rPr>
-        <w:lastRenderedPageBreak/>
         <w:t xml:space="preserve">* Số điện thoại liên lạc của Bên B: </w:t>
       </w:r>
       <w:r>
@@ -5338,7 +5327,17 @@
           <w:szCs w:val="26"/>
           <w:lang w:val="da-DK"/>
         </w:rPr>
-        <w:t xml:space="preserve">Công việc mà Bên B tiến hành tại mặt bằng thuê bao gồm tất cả các công tác sau: </w:t>
+        <w:t xml:space="preserve">Công việc mà Bên B tiến hành tại mặt bằng thuê bao gồm tất cả các công tác </w:t>
+      </w:r>
+      <w:r>
+        <w:rPr>
+          <w:rFonts w:ascii="Times New Roman" w:hAnsi="Times New Roman"/>
+          <w:iCs/>
+          <w:szCs w:val="26"/>
+          <w:lang w:val="da-DK"/>
+        </w:rPr>
+        <w:lastRenderedPageBreak/>
+        <w:t xml:space="preserve">sau: </w:t>
       </w:r>
     </w:p>
     <w:p>
@@ -5586,14 +5585,14 @@
           <w:sz w:val="26"/>
           <w:szCs w:val="26"/>
         </w:rPr>
-        <w:t xml:space="preserve">  1. Thời hạn thuê: Từ ngày {{START_DATE}} đến ngày </w:t>
+        <w:t xml:space="preserve">  1. Thời hạn thuê: </w:t>
       </w:r>
       <w:r>
         <w:rPr>
           <w:sz w:val="26"/>
           <w:szCs w:val="26"/>
         </w:rPr>
-        <w:t>{{END_DATE}}</w:t>
+        <w:t>10 năm</w:t>
       </w:r>
     </w:p>
     <w:p>
@@ -5833,7 +5832,6 @@
           <w:rFonts w:ascii="Times New Roman" w:hAnsi="Times New Roman"/>
           <w:szCs w:val="26"/>
         </w:rPr>
-        <w:lastRenderedPageBreak/>
         <w:t xml:space="preserve">- Thời điểm bắt đầu tính tiền thuê: </w:t>
       </w:r>
       <w:r>
@@ -5969,6 +5967,7 @@
           <w:szCs w:val="26"/>
           <w:lang w:val="vi-VN"/>
         </w:rPr>
+        <w:lastRenderedPageBreak/>
         <w:t xml:space="preserve">Bên </w:t>
       </w:r>
       <w:r>
@@ -6660,8 +6659,6 @@
           <w:lang w:val="da-DK"/>
         </w:rPr>
       </w:pPr>
-      <w:bookmarkStart w:id="1" w:name="_GoBack"/>
-      <w:bookmarkEnd w:id="1"/>
       <w:r>
         <w:rPr>
           <w:rFonts w:ascii="Times New Roman" w:hAnsi="Times New Roman"/>
@@ -7015,16 +7012,7 @@
           <w:szCs w:val="26"/>
           <w:lang w:val="da-DK"/>
         </w:rPr>
-        <w:t xml:space="preserve">Bên A cung cấp đầy đủ các giấy tờ liên quan quyền sở hữu/sử dụng đất và công trình, tài sản trên đất hoặc giấy xác nhận sở hữu/quyền sở hữu và không tranh chấp của </w:t>
-      </w:r>
-      <w:r>
-        <w:rPr>
-          <w:rFonts w:ascii="Times New Roman" w:hAnsi="Times New Roman"/>
-          <w:szCs w:val="26"/>
-          <w:lang w:val="da-DK"/>
-        </w:rPr>
-        <w:lastRenderedPageBreak/>
-        <w:t>chính quyền địa phương, địa chính địa phương (giấy tờ nhà/đất, giấy phép xây dựng, hoàn công nhà…) để bên B xin phép xây dựng trạm BTS, đồng thời Bên A đồng ý, tạo điều kiện thuận lợi cho Bên B triển khai thi công xây dựng trong quá trình hoàn thiện hồ sơ cấp phép. Nếu quá trình thi công bị dừng do thiếu giấy tờ của Bên A thì Bên B sẽ không thanh toán tiền thuê mặt bằng cho đến khi Bên A cung cấp bổ sung đầy đủ hồ sơ cho Bên B.</w:t>
+        <w:t>Bên A cung cấp đầy đủ các giấy tờ liên quan quyền sở hữu/sử dụng đất và công trình, tài sản trên đất hoặc giấy xác nhận sở hữu/quyền sở hữu và không tranh chấp của chính quyền địa phương, địa chính địa phương (giấy tờ nhà/đất, giấy phép xây dựng, hoàn công nhà…) để bên B xin phép xây dựng trạm BTS, đồng thời Bên A đồng ý, tạo điều kiện thuận lợi cho Bên B triển khai thi công xây dựng trong quá trình hoàn thiện hồ sơ cấp phép. Nếu quá trình thi công bị dừng do thiếu giấy tờ của Bên A thì Bên B sẽ không thanh toán tiền thuê mặt bằng cho đến khi Bên A cung cấp bổ sung đầy đủ hồ sơ cho Bên B.</w:t>
       </w:r>
     </w:p>
     <w:p>
@@ -7066,6 +7054,7 @@
           <w:szCs w:val="26"/>
           <w:lang w:val="da-DK"/>
         </w:rPr>
+        <w:lastRenderedPageBreak/>
         <w:t>- Giao mặt bằng, các công trình hạ tầng khác (nếu có) cho bên B theo đúng hợp đồng này (có biên bản bàn giao và phụ lục đính kèm).</w:t>
       </w:r>
     </w:p>
@@ -7296,16 +7285,7 @@
           <w:szCs w:val="26"/>
           <w:lang w:val="da-DK"/>
         </w:rPr>
-        <w:t xml:space="preserve">- Nếu các hộ dân hoặc chính quyền địa phương gây cản trở khiến Bên B không </w:t>
-      </w:r>
-      <w:r>
-        <w:rPr>
-          <w:rFonts w:ascii="Times New Roman" w:hAnsi="Times New Roman"/>
-          <w:szCs w:val="26"/>
-          <w:lang w:val="da-DK"/>
-        </w:rPr>
-        <w:lastRenderedPageBreak/>
-        <w:t>thể thi công và phát sóng thì Bên A có nghĩa vụ hoàn trả lại số tiền thuê mặt bằng đã thanh toán mà Bên B chưa sử dụng sau khi đã khấu trừ thuế đã nộp cho Nhà nước trong vòng 05 (năm) ngày kể từ ngày nhận được văn bản thông báo của Bên B. Đồng thời Bên B có trách nhiệm hoàn trả lại mặt bằng cho Bên A như tình trạng ban đầu.</w:t>
+        <w:t>- Nếu các hộ dân hoặc chính quyền địa phương gây cản trở khiến Bên B không thể thi công và phát sóng thì Bên A có nghĩa vụ hoàn trả lại số tiền thuê mặt bằng đã thanh toán mà Bên B chưa sử dụng sau khi đã khấu trừ thuế đã nộp cho Nhà nước trong vòng 05 (năm) ngày kể từ ngày nhận được văn bản thông báo của Bên B. Đồng thời Bên B có trách nhiệm hoàn trả lại mặt bằng cho Bên A như tình trạng ban đầu.</w:t>
       </w:r>
     </w:p>
     <w:p>
@@ -7347,6 +7327,7 @@
           <w:szCs w:val="26"/>
           <w:lang w:val="da-DK"/>
         </w:rPr>
+        <w:lastRenderedPageBreak/>
         <w:t>- Không được sử dụng nguồn điện cấp cho trạm BTS cho mục đích sử dụng riêng.</w:t>
       </w:r>
     </w:p>
@@ -7618,7 +7599,6 @@
           <w:szCs w:val="26"/>
           <w:lang w:val="da-DK"/>
         </w:rPr>
-        <w:lastRenderedPageBreak/>
         <w:t>- Có trách nhiệm sử dụng mặt bằng đúng nội dung và mục đích đã cam kết, khi cần sửa chữa cải tạo phòng máy phải thông báo với Bên A.</w:t>
       </w:r>
     </w:p>
@@ -7682,7 +7662,16 @@
           <w:szCs w:val="26"/>
           <w:lang w:val="da-DK"/>
         </w:rPr>
-        <w:t>- Trường hợp nếu chưa có nguồn điện lưới riêng cho trạm thì Bên B sẽ được sử dụng điện của Bên A và Bên B sẽ thanh toán chi phí sử dụng điện theo thực tế phát sinh tại nguồn điện của Bên A và tuân thủ theo quy định của ngành điện.</w:t>
+        <w:t xml:space="preserve">- Trường hợp nếu chưa có nguồn điện lưới riêng cho trạm thì Bên B sẽ được sử dụng điện của Bên A và Bên B sẽ thanh toán chi phí sử dụng điện theo thực tế phát sinh </w:t>
+      </w:r>
+      <w:r>
+        <w:rPr>
+          <w:rFonts w:ascii="Times New Roman" w:hAnsi="Times New Roman"/>
+          <w:szCs w:val="26"/>
+          <w:lang w:val="da-DK"/>
+        </w:rPr>
+        <w:lastRenderedPageBreak/>
+        <w:t>tại nguồn điện của Bên A và tuân thủ theo quy định của ngành điện.</w:t>
       </w:r>
     </w:p>
     <w:p>
@@ -8146,17 +8135,7 @@
           <w:szCs w:val="26"/>
           <w:lang w:val="da-DK"/>
         </w:rPr>
-        <w:t xml:space="preserve">đối với mọi bất đồng và tranh chấp phát </w:t>
-      </w:r>
-      <w:r>
-        <w:rPr>
-          <w:rFonts w:ascii="Times New Roman" w:hAnsi="Times New Roman"/>
-          <w:noProof/>
-          <w:szCs w:val="26"/>
-          <w:lang w:val="da-DK"/>
-        </w:rPr>
-        <w:lastRenderedPageBreak/>
-        <w:t xml:space="preserve">sinh, hai bên sẽ trước hết giải quyết thông qua thương lượng trên cơ sở thiện chí và hợp tác </w:t>
+        <w:t xml:space="preserve">đối với mọi bất đồng và tranh chấp phát sinh, hai bên sẽ trước hết giải quyết thông qua thương lượng trên cơ sở thiện chí và hợp tác </w:t>
       </w:r>
       <w:r>
         <w:rPr>
@@ -8216,7 +8195,16 @@
           <w:szCs w:val="26"/>
           <w:lang w:val="da-DK"/>
         </w:rPr>
-        <w:t>- Trong trường hợp Bên B không thể tiến hành thi công xây dựng hoặc không thể lắp đặt được các thiết bị cho trạm BTS hoặc phải tháo dỡ di chuyển trạm BTS thì hai Bên cùng tiến hành lập biên bản xác nhận và tiến hành thanh lý hợp đồng, không tiếp tục thực hiện hợp đồng thuê.</w:t>
+        <w:t xml:space="preserve">- Trong trường hợp Bên B không thể tiến hành thi công xây dựng hoặc không thể lắp đặt được các thiết bị cho trạm BTS hoặc phải tháo dỡ di chuyển trạm BTS thì </w:t>
+      </w:r>
+      <w:r>
+        <w:rPr>
+          <w:rFonts w:ascii="Times New Roman" w:hAnsi="Times New Roman"/>
+          <w:szCs w:val="26"/>
+          <w:lang w:val="da-DK"/>
+        </w:rPr>
+        <w:lastRenderedPageBreak/>
+        <w:t>hai Bên cùng tiến hành lập biên bản xác nhận và tiến hành thanh lý hợp đồng, không tiếp tục thực hiện hợp đồng thuê.</w:t>
       </w:r>
     </w:p>
     <w:p>
@@ -8573,7 +8561,6 @@
           <w:szCs w:val="26"/>
           <w:lang w:val="da-DK"/>
         </w:rPr>
-        <w:lastRenderedPageBreak/>
         <w:t>- Vị trí thuê không còn phù hợp để đảm bảo chất lượng, vùng phủ sóng phục vụ khách hàng tại khu vực đặt trạm.</w:t>
       </w:r>
     </w:p>
@@ -8696,6 +8683,7 @@
           <w:szCs w:val="26"/>
           <w:lang w:val="da-DK"/>
         </w:rPr>
+        <w:lastRenderedPageBreak/>
         <w:t>- Khi xảy ra bất đồng trong tranh chấp, hai bên cố gắng giải quyết bằng thương lượng. Trong trường hợp không thể giải quyết được thì đưa đến toà án có thẩm quyền theo qui định của pháp luật.</w:t>
       </w:r>
     </w:p>

</xml_diff>